<commit_message>
Añade el enlace al repositorio en el Anexo II
Co-Authored-By: Claude Opus 5.5 <noreply@anthropic.com>
Claude-Session: https://claude.ai/code/session_01V4goTpBqBm77qbsNTgtkTF
</commit_message>
<xml_diff>
--- a/TFG_Flujo_v2.docx
+++ b/TFG_Flujo_v2.docx
@@ -496,7 +496,7 @@
             </w:rPr>
             <w:fldChar w:fldCharType="separate"/>
           </w:r>
-          <w:hyperlink w:anchor="__RefHeading___Toc2186_3155442951">
+          <w:hyperlink w:anchor="__RefHeading___Toc2184_4092869310">
             <w:r>
               <w:rPr>
                 <w:rStyle w:val="IndexLink"/>
@@ -516,7 +516,7 @@
             </w:tabs>
             <w:rPr/>
           </w:pPr>
-          <w:hyperlink w:anchor="__RefHeading___Toc2188_3155442951">
+          <w:hyperlink w:anchor="__RefHeading___Toc2186_4092869310">
             <w:r>
               <w:rPr>
                 <w:rStyle w:val="IndexLink"/>
@@ -536,7 +536,7 @@
             </w:tabs>
             <w:rPr/>
           </w:pPr>
-          <w:hyperlink w:anchor="__RefHeading___Toc2190_3155442951">
+          <w:hyperlink w:anchor="__RefHeading___Toc2188_4092869310">
             <w:r>
               <w:rPr>
                 <w:rStyle w:val="IndexLink"/>
@@ -556,7 +556,7 @@
             </w:tabs>
             <w:rPr/>
           </w:pPr>
-          <w:hyperlink w:anchor="__RefHeading___Toc2192_3155442951">
+          <w:hyperlink w:anchor="__RefHeading___Toc2190_4092869310">
             <w:r>
               <w:rPr>
                 <w:rStyle w:val="IndexLink"/>
@@ -576,7 +576,7 @@
             </w:tabs>
             <w:rPr/>
           </w:pPr>
-          <w:hyperlink w:anchor="__RefHeading___Toc2194_3155442951">
+          <w:hyperlink w:anchor="__RefHeading___Toc2192_4092869310">
             <w:r>
               <w:rPr>
                 <w:rStyle w:val="IndexLink"/>
@@ -596,7 +596,7 @@
             </w:tabs>
             <w:rPr/>
           </w:pPr>
-          <w:hyperlink w:anchor="__RefHeading___Toc2196_3155442951">
+          <w:hyperlink w:anchor="__RefHeading___Toc2194_4092869310">
             <w:r>
               <w:rPr>
                 <w:rStyle w:val="IndexLink"/>
@@ -616,7 +616,7 @@
             </w:tabs>
             <w:rPr/>
           </w:pPr>
-          <w:hyperlink w:anchor="__RefHeading___Toc2198_3155442951">
+          <w:hyperlink w:anchor="__RefHeading___Toc2196_4092869310">
             <w:r>
               <w:rPr>
                 <w:rStyle w:val="IndexLink"/>
@@ -636,7 +636,7 @@
             </w:tabs>
             <w:rPr/>
           </w:pPr>
-          <w:hyperlink w:anchor="__RefHeading___Toc2200_3155442951">
+          <w:hyperlink w:anchor="__RefHeading___Toc2198_4092869310">
             <w:r>
               <w:rPr>
                 <w:rStyle w:val="IndexLink"/>
@@ -656,7 +656,7 @@
             </w:tabs>
             <w:rPr/>
           </w:pPr>
-          <w:hyperlink w:anchor="__RefHeading___Toc2202_3155442951">
+          <w:hyperlink w:anchor="__RefHeading___Toc2200_4092869310">
             <w:r>
               <w:rPr>
                 <w:rStyle w:val="IndexLink"/>
@@ -676,7 +676,7 @@
             </w:tabs>
             <w:rPr/>
           </w:pPr>
-          <w:hyperlink w:anchor="__RefHeading___Toc2204_3155442951">
+          <w:hyperlink w:anchor="__RefHeading___Toc2202_4092869310">
             <w:r>
               <w:rPr>
                 <w:rStyle w:val="IndexLink"/>
@@ -696,7 +696,7 @@
             </w:tabs>
             <w:rPr/>
           </w:pPr>
-          <w:hyperlink w:anchor="__RefHeading___Toc2206_3155442951">
+          <w:hyperlink w:anchor="__RefHeading___Toc2204_4092869310">
             <w:r>
               <w:rPr>
                 <w:rStyle w:val="IndexLink"/>
@@ -716,7 +716,7 @@
             </w:tabs>
             <w:rPr/>
           </w:pPr>
-          <w:hyperlink w:anchor="__RefHeading___Toc2208_3155442951">
+          <w:hyperlink w:anchor="__RefHeading___Toc2206_4092869310">
             <w:r>
               <w:rPr>
                 <w:rStyle w:val="IndexLink"/>
@@ -736,7 +736,7 @@
             </w:tabs>
             <w:rPr/>
           </w:pPr>
-          <w:hyperlink w:anchor="__RefHeading___Toc2210_3155442951">
+          <w:hyperlink w:anchor="__RefHeading___Toc2208_4092869310">
             <w:r>
               <w:rPr>
                 <w:rStyle w:val="IndexLink"/>
@@ -756,7 +756,7 @@
             </w:tabs>
             <w:rPr/>
           </w:pPr>
-          <w:hyperlink w:anchor="__RefHeading___Toc2212_3155442951">
+          <w:hyperlink w:anchor="__RefHeading___Toc2210_4092869310">
             <w:r>
               <w:rPr>
                 <w:rStyle w:val="IndexLink"/>
@@ -776,7 +776,7 @@
             </w:tabs>
             <w:rPr/>
           </w:pPr>
-          <w:hyperlink w:anchor="__RefHeading___Toc2214_3155442951">
+          <w:hyperlink w:anchor="__RefHeading___Toc2212_4092869310">
             <w:r>
               <w:rPr>
                 <w:rStyle w:val="IndexLink"/>
@@ -796,7 +796,7 @@
             </w:tabs>
             <w:rPr/>
           </w:pPr>
-          <w:hyperlink w:anchor="__RefHeading___Toc2216_3155442951">
+          <w:hyperlink w:anchor="__RefHeading___Toc2214_4092869310">
             <w:r>
               <w:rPr>
                 <w:rStyle w:val="IndexLink"/>
@@ -816,7 +816,7 @@
             </w:tabs>
             <w:rPr/>
           </w:pPr>
-          <w:hyperlink w:anchor="__RefHeading___Toc2218_3155442951">
+          <w:hyperlink w:anchor="__RefHeading___Toc2216_4092869310">
             <w:r>
               <w:rPr>
                 <w:rStyle w:val="IndexLink"/>
@@ -836,7 +836,7 @@
             </w:tabs>
             <w:rPr/>
           </w:pPr>
-          <w:hyperlink w:anchor="__RefHeading___Toc2220_3155442951">
+          <w:hyperlink w:anchor="__RefHeading___Toc2218_4092869310">
             <w:r>
               <w:rPr>
                 <w:rStyle w:val="IndexLink"/>
@@ -856,7 +856,7 @@
             </w:tabs>
             <w:rPr/>
           </w:pPr>
-          <w:hyperlink w:anchor="__RefHeading___Toc2222_3155442951">
+          <w:hyperlink w:anchor="__RefHeading___Toc2220_4092869310">
             <w:r>
               <w:rPr>
                 <w:rStyle w:val="IndexLink"/>
@@ -876,7 +876,7 @@
             </w:tabs>
             <w:rPr/>
           </w:pPr>
-          <w:hyperlink w:anchor="__RefHeading___Toc2224_3155442951">
+          <w:hyperlink w:anchor="__RefHeading___Toc2222_4092869310">
             <w:r>
               <w:rPr>
                 <w:rStyle w:val="IndexLink"/>
@@ -896,7 +896,7 @@
             </w:tabs>
             <w:rPr/>
           </w:pPr>
-          <w:hyperlink w:anchor="__RefHeading___Toc2226_3155442951">
+          <w:hyperlink w:anchor="__RefHeading___Toc2224_4092869310">
             <w:r>
               <w:rPr>
                 <w:rStyle w:val="IndexLink"/>
@@ -916,7 +916,7 @@
             </w:tabs>
             <w:rPr/>
           </w:pPr>
-          <w:hyperlink w:anchor="__RefHeading___Toc2228_3155442951">
+          <w:hyperlink w:anchor="__RefHeading___Toc2226_4092869310">
             <w:r>
               <w:rPr>
                 <w:rStyle w:val="IndexLink"/>
@@ -936,7 +936,7 @@
             </w:tabs>
             <w:rPr/>
           </w:pPr>
-          <w:hyperlink w:anchor="__RefHeading___Toc2230_3155442951">
+          <w:hyperlink w:anchor="__RefHeading___Toc2228_4092869310">
             <w:r>
               <w:rPr>
                 <w:rStyle w:val="IndexLink"/>
@@ -956,7 +956,7 @@
             </w:tabs>
             <w:rPr/>
           </w:pPr>
-          <w:hyperlink w:anchor="__RefHeading___Toc2232_3155442951">
+          <w:hyperlink w:anchor="__RefHeading___Toc2230_4092869310">
             <w:r>
               <w:rPr>
                 <w:rStyle w:val="IndexLink"/>
@@ -976,7 +976,7 @@
             </w:tabs>
             <w:rPr/>
           </w:pPr>
-          <w:hyperlink w:anchor="__RefHeading___Toc2234_3155442951">
+          <w:hyperlink w:anchor="__RefHeading___Toc2232_4092869310">
             <w:r>
               <w:rPr>
                 <w:rStyle w:val="IndexLink"/>
@@ -996,7 +996,7 @@
             </w:tabs>
             <w:rPr/>
           </w:pPr>
-          <w:hyperlink w:anchor="__RefHeading___Toc2236_3155442951">
+          <w:hyperlink w:anchor="__RefHeading___Toc2234_4092869310">
             <w:r>
               <w:rPr>
                 <w:rStyle w:val="IndexLink"/>
@@ -1016,7 +1016,7 @@
             </w:tabs>
             <w:rPr/>
           </w:pPr>
-          <w:hyperlink w:anchor="__RefHeading___Toc2238_3155442951">
+          <w:hyperlink w:anchor="__RefHeading___Toc2236_4092869310">
             <w:r>
               <w:rPr>
                 <w:rStyle w:val="IndexLink"/>
@@ -1036,7 +1036,7 @@
             </w:tabs>
             <w:rPr/>
           </w:pPr>
-          <w:hyperlink w:anchor="__RefHeading___Toc2240_3155442951">
+          <w:hyperlink w:anchor="__RefHeading___Toc2238_4092869310">
             <w:r>
               <w:rPr>
                 <w:rStyle w:val="IndexLink"/>
@@ -1056,7 +1056,7 @@
             </w:tabs>
             <w:rPr/>
           </w:pPr>
-          <w:hyperlink w:anchor="__RefHeading___Toc2242_3155442951">
+          <w:hyperlink w:anchor="__RefHeading___Toc2240_4092869310">
             <w:r>
               <w:rPr>
                 <w:rStyle w:val="IndexLink"/>
@@ -1076,7 +1076,7 @@
             </w:tabs>
             <w:rPr/>
           </w:pPr>
-          <w:hyperlink w:anchor="__RefHeading___Toc2244_3155442951">
+          <w:hyperlink w:anchor="__RefHeading___Toc2242_4092869310">
             <w:r>
               <w:rPr>
                 <w:rStyle w:val="IndexLink"/>
@@ -1096,7 +1096,7 @@
             </w:tabs>
             <w:rPr/>
           </w:pPr>
-          <w:hyperlink w:anchor="__RefHeading___Toc2246_3155442951">
+          <w:hyperlink w:anchor="__RefHeading___Toc2244_4092869310">
             <w:r>
               <w:rPr>
                 <w:rStyle w:val="IndexLink"/>
@@ -1116,7 +1116,7 @@
             </w:tabs>
             <w:rPr/>
           </w:pPr>
-          <w:hyperlink w:anchor="__RefHeading___Toc2248_3155442951">
+          <w:hyperlink w:anchor="__RefHeading___Toc2246_4092869310">
             <w:r>
               <w:rPr>
                 <w:rStyle w:val="IndexLink"/>
@@ -1136,7 +1136,7 @@
             </w:tabs>
             <w:rPr/>
           </w:pPr>
-          <w:hyperlink w:anchor="__RefHeading___Toc2250_3155442951">
+          <w:hyperlink w:anchor="__RefHeading___Toc2248_4092869310">
             <w:r>
               <w:rPr>
                 <w:rStyle w:val="IndexLink"/>
@@ -1156,7 +1156,7 @@
             </w:tabs>
             <w:rPr/>
           </w:pPr>
-          <w:hyperlink w:anchor="__RefHeading___Toc2252_3155442951">
+          <w:hyperlink w:anchor="__RefHeading___Toc2250_4092869310">
             <w:r>
               <w:rPr>
                 <w:rStyle w:val="IndexLink"/>
@@ -1176,7 +1176,7 @@
             </w:tabs>
             <w:rPr/>
           </w:pPr>
-          <w:hyperlink w:anchor="__RefHeading___Toc2254_3155442951">
+          <w:hyperlink w:anchor="__RefHeading___Toc2252_4092869310">
             <w:r>
               <w:rPr>
                 <w:rStyle w:val="IndexLink"/>
@@ -1196,7 +1196,7 @@
             </w:tabs>
             <w:rPr/>
           </w:pPr>
-          <w:hyperlink w:anchor="__RefHeading___Toc2256_3155442951">
+          <w:hyperlink w:anchor="__RefHeading___Toc2254_4092869310">
             <w:r>
               <w:rPr>
                 <w:rStyle w:val="IndexLink"/>
@@ -1216,7 +1216,7 @@
             </w:tabs>
             <w:rPr/>
           </w:pPr>
-          <w:hyperlink w:anchor="__RefHeading___Toc2258_3155442951">
+          <w:hyperlink w:anchor="__RefHeading___Toc2256_4092869310">
             <w:r>
               <w:rPr>
                 <w:rStyle w:val="IndexLink"/>
@@ -1236,7 +1236,7 @@
             </w:tabs>
             <w:rPr/>
           </w:pPr>
-          <w:hyperlink w:anchor="__RefHeading___Toc2260_3155442951">
+          <w:hyperlink w:anchor="__RefHeading___Toc2258_4092869310">
             <w:r>
               <w:rPr>
                 <w:rStyle w:val="IndexLink"/>
@@ -1256,7 +1256,7 @@
             </w:tabs>
             <w:rPr/>
           </w:pPr>
-          <w:hyperlink w:anchor="__RefHeading___Toc2262_3155442951">
+          <w:hyperlink w:anchor="__RefHeading___Toc2260_4092869310">
             <w:r>
               <w:rPr>
                 <w:rStyle w:val="IndexLink"/>
@@ -1276,7 +1276,7 @@
             </w:tabs>
             <w:rPr/>
           </w:pPr>
-          <w:hyperlink w:anchor="__RefHeading___Toc2264_3155442951">
+          <w:hyperlink w:anchor="__RefHeading___Toc2262_4092869310">
             <w:r>
               <w:rPr>
                 <w:rStyle w:val="IndexLink"/>
@@ -1296,7 +1296,7 @@
             </w:tabs>
             <w:rPr/>
           </w:pPr>
-          <w:hyperlink w:anchor="__RefHeading___Toc2266_3155442951">
+          <w:hyperlink w:anchor="__RefHeading___Toc2264_4092869310">
             <w:r>
               <w:rPr>
                 <w:rStyle w:val="IndexLink"/>
@@ -1316,7 +1316,7 @@
             </w:tabs>
             <w:rPr/>
           </w:pPr>
-          <w:hyperlink w:anchor="__RefHeading___Toc2268_3155442951">
+          <w:hyperlink w:anchor="__RefHeading___Toc2266_4092869310">
             <w:r>
               <w:rPr>
                 <w:rStyle w:val="IndexLink"/>
@@ -1336,7 +1336,7 @@
             </w:tabs>
             <w:rPr/>
           </w:pPr>
-          <w:hyperlink w:anchor="__RefHeading___Toc2270_3155442951">
+          <w:hyperlink w:anchor="__RefHeading___Toc2268_4092869310">
             <w:r>
               <w:rPr>
                 <w:rStyle w:val="IndexLink"/>
@@ -1356,7 +1356,7 @@
             </w:tabs>
             <w:rPr/>
           </w:pPr>
-          <w:hyperlink w:anchor="__RefHeading___Toc2272_3155442951">
+          <w:hyperlink w:anchor="__RefHeading___Toc2270_4092869310">
             <w:r>
               <w:rPr>
                 <w:rStyle w:val="IndexLink"/>
@@ -1376,7 +1376,7 @@
             </w:tabs>
             <w:rPr/>
           </w:pPr>
-          <w:hyperlink w:anchor="__RefHeading___Toc2274_3155442951">
+          <w:hyperlink w:anchor="__RefHeading___Toc2272_4092869310">
             <w:r>
               <w:rPr>
                 <w:rStyle w:val="IndexLink"/>
@@ -1396,7 +1396,7 @@
             </w:tabs>
             <w:rPr/>
           </w:pPr>
-          <w:hyperlink w:anchor="__RefHeading___Toc2276_3155442951">
+          <w:hyperlink w:anchor="__RefHeading___Toc2274_4092869310">
             <w:r>
               <w:rPr>
                 <w:rStyle w:val="IndexLink"/>
@@ -1416,7 +1416,7 @@
             </w:tabs>
             <w:rPr/>
           </w:pPr>
-          <w:hyperlink w:anchor="__RefHeading___Toc2278_3155442951">
+          <w:hyperlink w:anchor="__RefHeading___Toc2276_4092869310">
             <w:r>
               <w:rPr>
                 <w:rStyle w:val="IndexLink"/>
@@ -1436,7 +1436,7 @@
             </w:tabs>
             <w:rPr/>
           </w:pPr>
-          <w:hyperlink w:anchor="__RefHeading___Toc2280_3155442951">
+          <w:hyperlink w:anchor="__RefHeading___Toc2278_4092869310">
             <w:r>
               <w:rPr>
                 <w:rStyle w:val="IndexLink"/>
@@ -1456,7 +1456,7 @@
             </w:tabs>
             <w:rPr/>
           </w:pPr>
-          <w:hyperlink w:anchor="__RefHeading___Toc2282_3155442951">
+          <w:hyperlink w:anchor="__RefHeading___Toc2280_4092869310">
             <w:r>
               <w:rPr>
                 <w:rStyle w:val="IndexLink"/>
@@ -1476,7 +1476,7 @@
             </w:tabs>
             <w:rPr/>
           </w:pPr>
-          <w:hyperlink w:anchor="__RefHeading___Toc2284_3155442951">
+          <w:hyperlink w:anchor="__RefHeading___Toc2282_4092869310">
             <w:r>
               <w:rPr>
                 <w:rStyle w:val="IndexLink"/>
@@ -1512,7 +1512,7 @@
         <w:pStyle w:val="Heading1"/>
         <w:rPr/>
       </w:pPr>
-      <w:bookmarkStart w:id="0" w:name="__RefHeading___Toc2186_3155442951"/>
+      <w:bookmarkStart w:id="0" w:name="__RefHeading___Toc2184_4092869310"/>
       <w:bookmarkEnd w:id="0"/>
       <w:r>
         <w:rPr/>
@@ -1524,7 +1524,7 @@
         <w:pStyle w:val="Heading2"/>
         <w:rPr/>
       </w:pPr>
-      <w:bookmarkStart w:id="1" w:name="__RefHeading___Toc2188_3155442951"/>
+      <w:bookmarkStart w:id="1" w:name="__RefHeading___Toc2186_4092869310"/>
       <w:bookmarkEnd w:id="1"/>
       <w:r>
         <w:rPr/>
@@ -1598,7 +1598,7 @@
         <w:pStyle w:val="Heading2"/>
         <w:rPr/>
       </w:pPr>
-      <w:bookmarkStart w:id="2" w:name="__RefHeading___Toc2190_3155442951"/>
+      <w:bookmarkStart w:id="2" w:name="__RefHeading___Toc2188_4092869310"/>
       <w:bookmarkEnd w:id="2"/>
       <w:r>
         <w:rPr/>
@@ -1748,7 +1748,7 @@
         <w:pStyle w:val="Heading2"/>
         <w:rPr/>
       </w:pPr>
-      <w:bookmarkStart w:id="3" w:name="__RefHeading___Toc2192_3155442951"/>
+      <w:bookmarkStart w:id="3" w:name="__RefHeading___Toc2190_4092869310"/>
       <w:bookmarkEnd w:id="3"/>
       <w:r>
         <w:rPr/>
@@ -1804,7 +1804,7 @@
         <w:pStyle w:val="Heading2"/>
         <w:rPr/>
       </w:pPr>
-      <w:bookmarkStart w:id="4" w:name="__RefHeading___Toc2194_3155442951"/>
+      <w:bookmarkStart w:id="4" w:name="__RefHeading___Toc2192_4092869310"/>
       <w:bookmarkEnd w:id="4"/>
       <w:r>
         <w:rPr/>
@@ -1871,7 +1871,7 @@
         <w:pStyle w:val="Heading2"/>
         <w:rPr/>
       </w:pPr>
-      <w:bookmarkStart w:id="5" w:name="__RefHeading___Toc2196_3155442951"/>
+      <w:bookmarkStart w:id="5" w:name="__RefHeading___Toc2194_4092869310"/>
       <w:bookmarkEnd w:id="5"/>
       <w:r>
         <w:rPr/>
@@ -1897,7 +1897,7 @@
         <w:pStyle w:val="Heading1"/>
         <w:rPr/>
       </w:pPr>
-      <w:bookmarkStart w:id="6" w:name="__RefHeading___Toc2198_3155442951"/>
+      <w:bookmarkStart w:id="6" w:name="__RefHeading___Toc2196_4092869310"/>
       <w:bookmarkEnd w:id="6"/>
       <w:r>
         <w:rPr/>
@@ -1909,7 +1909,7 @@
         <w:pStyle w:val="Heading2"/>
         <w:rPr/>
       </w:pPr>
-      <w:bookmarkStart w:id="7" w:name="__RefHeading___Toc2200_3155442951"/>
+      <w:bookmarkStart w:id="7" w:name="__RefHeading___Toc2198_4092869310"/>
       <w:bookmarkEnd w:id="7"/>
       <w:r>
         <w:rPr/>
@@ -1943,7 +1943,7 @@
         <w:pStyle w:val="Heading2"/>
         <w:rPr/>
       </w:pPr>
-      <w:bookmarkStart w:id="8" w:name="__RefHeading___Toc2202_3155442951"/>
+      <w:bookmarkStart w:id="8" w:name="__RefHeading___Toc2200_4092869310"/>
       <w:bookmarkEnd w:id="8"/>
       <w:r>
         <w:rPr/>
@@ -1966,7 +1966,7 @@
         <w:pStyle w:val="Heading2"/>
         <w:rPr/>
       </w:pPr>
-      <w:bookmarkStart w:id="9" w:name="__RefHeading___Toc2204_3155442951"/>
+      <w:bookmarkStart w:id="9" w:name="__RefHeading___Toc2202_4092869310"/>
       <w:bookmarkEnd w:id="9"/>
       <w:r>
         <w:rPr/>
@@ -2000,7 +2000,7 @@
         <w:pStyle w:val="Heading2"/>
         <w:rPr/>
       </w:pPr>
-      <w:bookmarkStart w:id="10" w:name="__RefHeading___Toc2206_3155442951"/>
+      <w:bookmarkStart w:id="10" w:name="__RefHeading___Toc2204_4092869310"/>
       <w:bookmarkEnd w:id="10"/>
       <w:r>
         <w:rPr/>
@@ -2842,7 +2842,7 @@
         <w:pStyle w:val="Heading2"/>
         <w:rPr/>
       </w:pPr>
-      <w:bookmarkStart w:id="11" w:name="__RefHeading___Toc2208_3155442951"/>
+      <w:bookmarkStart w:id="11" w:name="__RefHeading___Toc2206_4092869310"/>
       <w:bookmarkEnd w:id="11"/>
       <w:r>
         <w:rPr/>
@@ -3754,7 +3754,7 @@
         <w:pStyle w:val="Heading1"/>
         <w:rPr/>
       </w:pPr>
-      <w:bookmarkStart w:id="12" w:name="__RefHeading___Toc2210_3155442951"/>
+      <w:bookmarkStart w:id="12" w:name="__RefHeading___Toc2208_4092869310"/>
       <w:bookmarkEnd w:id="12"/>
       <w:r>
         <w:rPr/>
@@ -3766,7 +3766,7 @@
         <w:pStyle w:val="Heading2"/>
         <w:rPr/>
       </w:pPr>
-      <w:bookmarkStart w:id="13" w:name="__RefHeading___Toc2212_3155442951"/>
+      <w:bookmarkStart w:id="13" w:name="__RefHeading___Toc2210_4092869310"/>
       <w:bookmarkEnd w:id="13"/>
       <w:r>
         <w:rPr/>
@@ -3811,7 +3811,7 @@
         <w:pStyle w:val="Heading2"/>
         <w:rPr/>
       </w:pPr>
-      <w:bookmarkStart w:id="14" w:name="__RefHeading___Toc2214_3155442951"/>
+      <w:bookmarkStart w:id="14" w:name="__RefHeading___Toc2212_4092869310"/>
       <w:bookmarkEnd w:id="14"/>
       <w:r>
         <w:rPr/>
@@ -3911,7 +3911,7 @@
         <w:pStyle w:val="Heading2"/>
         <w:rPr/>
       </w:pPr>
-      <w:bookmarkStart w:id="15" w:name="__RefHeading___Toc2216_3155442951"/>
+      <w:bookmarkStart w:id="15" w:name="__RefHeading___Toc2214_4092869310"/>
       <w:bookmarkEnd w:id="15"/>
       <w:r>
         <w:rPr/>
@@ -4731,7 +4731,7 @@
         <w:pStyle w:val="Heading2"/>
         <w:rPr/>
       </w:pPr>
-      <w:bookmarkStart w:id="16" w:name="__RefHeading___Toc2218_3155442951"/>
+      <w:bookmarkStart w:id="16" w:name="__RefHeading___Toc2216_4092869310"/>
       <w:bookmarkEnd w:id="16"/>
       <w:r>
         <w:rPr/>
@@ -5510,7 +5510,7 @@
         <w:pStyle w:val="Heading1"/>
         <w:rPr/>
       </w:pPr>
-      <w:bookmarkStart w:id="17" w:name="__RefHeading___Toc2220_3155442951"/>
+      <w:bookmarkStart w:id="17" w:name="__RefHeading___Toc2218_4092869310"/>
       <w:bookmarkEnd w:id="17"/>
       <w:r>
         <w:rPr/>
@@ -5522,7 +5522,7 @@
         <w:pStyle w:val="Heading2"/>
         <w:rPr/>
       </w:pPr>
-      <w:bookmarkStart w:id="18" w:name="__RefHeading___Toc2222_3155442951"/>
+      <w:bookmarkStart w:id="18" w:name="__RefHeading___Toc2220_4092869310"/>
       <w:bookmarkEnd w:id="18"/>
       <w:r>
         <w:rPr/>
@@ -5567,7 +5567,7 @@
         <w:pStyle w:val="Heading2"/>
         <w:rPr/>
       </w:pPr>
-      <w:bookmarkStart w:id="19" w:name="__RefHeading___Toc2224_3155442951"/>
+      <w:bookmarkStart w:id="19" w:name="__RefHeading___Toc2222_4092869310"/>
       <w:bookmarkEnd w:id="19"/>
       <w:r>
         <w:rPr/>
@@ -6737,7 +6737,7 @@
         <w:pStyle w:val="Heading2"/>
         <w:rPr/>
       </w:pPr>
-      <w:bookmarkStart w:id="20" w:name="__RefHeading___Toc2226_3155442951"/>
+      <w:bookmarkStart w:id="20" w:name="__RefHeading___Toc2224_4092869310"/>
       <w:bookmarkEnd w:id="20"/>
       <w:r>
         <w:rPr/>
@@ -7586,7 +7586,7 @@
         <w:pStyle w:val="Heading1"/>
         <w:rPr/>
       </w:pPr>
-      <w:bookmarkStart w:id="21" w:name="__RefHeading___Toc2228_3155442951"/>
+      <w:bookmarkStart w:id="21" w:name="__RefHeading___Toc2226_4092869310"/>
       <w:bookmarkEnd w:id="21"/>
       <w:r>
         <w:rPr/>
@@ -7598,7 +7598,7 @@
         <w:pStyle w:val="Heading2"/>
         <w:rPr/>
       </w:pPr>
-      <w:bookmarkStart w:id="22" w:name="__RefHeading___Toc2230_3155442951"/>
+      <w:bookmarkStart w:id="22" w:name="__RefHeading___Toc2228_4092869310"/>
       <w:bookmarkEnd w:id="22"/>
       <w:r>
         <w:rPr/>
@@ -7632,7 +7632,7 @@
         <w:pStyle w:val="Heading2"/>
         <w:rPr/>
       </w:pPr>
-      <w:bookmarkStart w:id="23" w:name="__RefHeading___Toc2232_3155442951"/>
+      <w:bookmarkStart w:id="23" w:name="__RefHeading___Toc2230_4092869310"/>
       <w:bookmarkEnd w:id="23"/>
       <w:r>
         <w:rPr/>
@@ -8347,7 +8347,7 @@
         <w:pStyle w:val="Heading2"/>
         <w:rPr/>
       </w:pPr>
-      <w:bookmarkStart w:id="24" w:name="__RefHeading___Toc2234_3155442951"/>
+      <w:bookmarkStart w:id="24" w:name="__RefHeading___Toc2232_4092869310"/>
       <w:bookmarkEnd w:id="24"/>
       <w:r>
         <w:rPr/>
@@ -8373,7 +8373,7 @@
         <w:pStyle w:val="Heading1"/>
         <w:rPr/>
       </w:pPr>
-      <w:bookmarkStart w:id="25" w:name="__RefHeading___Toc2236_3155442951"/>
+      <w:bookmarkStart w:id="25" w:name="__RefHeading___Toc2234_4092869310"/>
       <w:bookmarkEnd w:id="25"/>
       <w:r>
         <w:rPr/>
@@ -8397,7 +8397,7 @@
         <w:pStyle w:val="Heading2"/>
         <w:rPr/>
       </w:pPr>
-      <w:bookmarkStart w:id="26" w:name="__RefHeading___Toc2238_3155442951"/>
+      <w:bookmarkStart w:id="26" w:name="__RefHeading___Toc2236_4092869310"/>
       <w:bookmarkEnd w:id="26"/>
       <w:r>
         <w:rPr/>
@@ -9495,7 +9495,7 @@
         <w:pStyle w:val="Heading2"/>
         <w:rPr/>
       </w:pPr>
-      <w:bookmarkStart w:id="27" w:name="__RefHeading___Toc2240_3155442951"/>
+      <w:bookmarkStart w:id="27" w:name="__RefHeading___Toc2238_4092869310"/>
       <w:bookmarkEnd w:id="27"/>
       <w:r>
         <w:rPr/>
@@ -10667,7 +10667,7 @@
         <w:pStyle w:val="Heading2"/>
         <w:rPr/>
       </w:pPr>
-      <w:bookmarkStart w:id="28" w:name="__RefHeading___Toc2242_3155442951"/>
+      <w:bookmarkStart w:id="28" w:name="__RefHeading___Toc2240_4092869310"/>
       <w:bookmarkEnd w:id="28"/>
       <w:r>
         <w:rPr/>
@@ -12029,7 +12029,7 @@
         <w:pStyle w:val="Heading2"/>
         <w:rPr/>
       </w:pPr>
-      <w:bookmarkStart w:id="29" w:name="__RefHeading___Toc2244_3155442951"/>
+      <w:bookmarkStart w:id="29" w:name="__RefHeading___Toc2242_4092869310"/>
       <w:bookmarkEnd w:id="29"/>
       <w:r>
         <w:rPr/>
@@ -12074,7 +12074,7 @@
         <w:pStyle w:val="Heading2"/>
         <w:rPr/>
       </w:pPr>
-      <w:bookmarkStart w:id="30" w:name="__RefHeading___Toc2246_3155442951"/>
+      <w:bookmarkStart w:id="30" w:name="__RefHeading___Toc2244_4092869310"/>
       <w:bookmarkEnd w:id="30"/>
       <w:r>
         <w:rPr/>
@@ -14515,7 +14515,7 @@
         <w:pStyle w:val="Heading2"/>
         <w:rPr/>
       </w:pPr>
-      <w:bookmarkStart w:id="31" w:name="__RefHeading___Toc2248_3155442951"/>
+      <w:bookmarkStart w:id="31" w:name="__RefHeading___Toc2246_4092869310"/>
       <w:bookmarkEnd w:id="31"/>
       <w:r>
         <w:rPr/>
@@ -16672,7 +16672,7 @@
         <w:pStyle w:val="Heading2"/>
         <w:rPr/>
       </w:pPr>
-      <w:bookmarkStart w:id="32" w:name="__RefHeading___Toc2250_3155442951"/>
+      <w:bookmarkStart w:id="32" w:name="__RefHeading___Toc2248_4092869310"/>
       <w:bookmarkEnd w:id="32"/>
       <w:r>
         <w:rPr/>
@@ -18968,7 +18968,7 @@
         <w:pStyle w:val="Heading1"/>
         <w:rPr/>
       </w:pPr>
-      <w:bookmarkStart w:id="33" w:name="__RefHeading___Toc2252_3155442951"/>
+      <w:bookmarkStart w:id="33" w:name="__RefHeading___Toc2250_4092869310"/>
       <w:bookmarkEnd w:id="33"/>
       <w:r>
         <w:rPr/>
@@ -18980,7 +18980,7 @@
         <w:pStyle w:val="Heading2"/>
         <w:rPr/>
       </w:pPr>
-      <w:bookmarkStart w:id="34" w:name="__RefHeading___Toc2254_3155442951"/>
+      <w:bookmarkStart w:id="34" w:name="__RefHeading___Toc2252_4092869310"/>
       <w:bookmarkEnd w:id="34"/>
       <w:r>
         <w:rPr/>
@@ -19412,7 +19412,7 @@
         <w:pStyle w:val="Heading2"/>
         <w:rPr/>
       </w:pPr>
-      <w:bookmarkStart w:id="35" w:name="__RefHeading___Toc2256_3155442951"/>
+      <w:bookmarkStart w:id="35" w:name="__RefHeading___Toc2254_4092869310"/>
       <w:bookmarkEnd w:id="35"/>
       <w:r>
         <w:rPr/>
@@ -20623,7 +20623,7 @@
         <w:pStyle w:val="Heading2"/>
         <w:rPr/>
       </w:pPr>
-      <w:bookmarkStart w:id="36" w:name="__RefHeading___Toc2258_3155442951"/>
+      <w:bookmarkStart w:id="36" w:name="__RefHeading___Toc2256_4092869310"/>
       <w:bookmarkEnd w:id="36"/>
       <w:r>
         <w:rPr/>
@@ -20668,7 +20668,7 @@
         <w:pStyle w:val="Heading2"/>
         <w:rPr/>
       </w:pPr>
-      <w:bookmarkStart w:id="37" w:name="__RefHeading___Toc2260_3155442951"/>
+      <w:bookmarkStart w:id="37" w:name="__RefHeading___Toc2258_4092869310"/>
       <w:bookmarkEnd w:id="37"/>
       <w:r>
         <w:rPr/>
@@ -21835,7 +21835,7 @@
         <w:pStyle w:val="Heading1"/>
         <w:rPr/>
       </w:pPr>
-      <w:bookmarkStart w:id="38" w:name="__RefHeading___Toc2262_3155442951"/>
+      <w:bookmarkStart w:id="38" w:name="__RefHeading___Toc2260_4092869310"/>
       <w:bookmarkEnd w:id="38"/>
       <w:r>
         <w:rPr/>
@@ -21847,7 +21847,7 @@
         <w:pStyle w:val="Heading2"/>
         <w:rPr/>
       </w:pPr>
-      <w:bookmarkStart w:id="39" w:name="__RefHeading___Toc2264_3155442951"/>
+      <w:bookmarkStart w:id="39" w:name="__RefHeading___Toc2262_4092869310"/>
       <w:bookmarkEnd w:id="39"/>
       <w:r>
         <w:rPr/>
@@ -23159,7 +23159,7 @@
         <w:pStyle w:val="Heading2"/>
         <w:rPr/>
       </w:pPr>
-      <w:bookmarkStart w:id="40" w:name="__RefHeading___Toc2266_3155442951"/>
+      <w:bookmarkStart w:id="40" w:name="__RefHeading___Toc2264_4092869310"/>
       <w:bookmarkEnd w:id="40"/>
       <w:r>
         <w:rPr/>
@@ -23284,7 +23284,7 @@
         <w:pStyle w:val="Heading2"/>
         <w:rPr/>
       </w:pPr>
-      <w:bookmarkStart w:id="41" w:name="__RefHeading___Toc2268_3155442951"/>
+      <w:bookmarkStart w:id="41" w:name="__RefHeading___Toc2266_4092869310"/>
       <w:bookmarkEnd w:id="41"/>
       <w:r>
         <w:rPr/>
@@ -24429,7 +24429,7 @@
         <w:pStyle w:val="Heading1"/>
         <w:rPr/>
       </w:pPr>
-      <w:bookmarkStart w:id="42" w:name="__RefHeading___Toc2270_3155442951"/>
+      <w:bookmarkStart w:id="42" w:name="__RefHeading___Toc2268_4092869310"/>
       <w:bookmarkEnd w:id="42"/>
       <w:r>
         <w:rPr/>
@@ -24441,7 +24441,7 @@
         <w:pStyle w:val="Heading2"/>
         <w:rPr/>
       </w:pPr>
-      <w:bookmarkStart w:id="43" w:name="__RefHeading___Toc2272_3155442951"/>
+      <w:bookmarkStart w:id="43" w:name="__RefHeading___Toc2270_4092869310"/>
       <w:bookmarkEnd w:id="43"/>
       <w:r>
         <w:rPr/>
@@ -24541,7 +24541,7 @@
         <w:pStyle w:val="Heading2"/>
         <w:rPr/>
       </w:pPr>
-      <w:bookmarkStart w:id="44" w:name="__RefHeading___Toc2274_3155442951"/>
+      <w:bookmarkStart w:id="44" w:name="__RefHeading___Toc2272_4092869310"/>
       <w:bookmarkEnd w:id="44"/>
       <w:r>
         <w:rPr/>
@@ -24564,7 +24564,7 @@
         <w:pStyle w:val="Heading2"/>
         <w:rPr/>
       </w:pPr>
-      <w:bookmarkStart w:id="45" w:name="__RefHeading___Toc2276_3155442951"/>
+      <w:bookmarkStart w:id="45" w:name="__RefHeading___Toc2274_4092869310"/>
       <w:bookmarkEnd w:id="45"/>
       <w:r>
         <w:rPr/>
@@ -24601,7 +24601,7 @@
         <w:pStyle w:val="Heading1"/>
         <w:rPr/>
       </w:pPr>
-      <w:bookmarkStart w:id="46" w:name="__RefHeading___Toc2278_3155442951"/>
+      <w:bookmarkStart w:id="46" w:name="__RefHeading___Toc2276_4092869310"/>
       <w:bookmarkEnd w:id="46"/>
       <w:r>
         <w:rPr/>
@@ -25432,7 +25432,7 @@
         <w:pStyle w:val="Heading1"/>
         <w:rPr/>
       </w:pPr>
-      <w:bookmarkStart w:id="47" w:name="__RefHeading___Toc2280_3155442951"/>
+      <w:bookmarkStart w:id="47" w:name="__RefHeading___Toc2278_4092869310"/>
       <w:bookmarkEnd w:id="47"/>
       <w:r>
         <w:rPr/>
@@ -25785,7 +25785,7 @@
         <w:pStyle w:val="Heading1"/>
         <w:rPr/>
       </w:pPr>
-      <w:bookmarkStart w:id="48" w:name="__RefHeading___Toc2282_3155442951"/>
+      <w:bookmarkStart w:id="48" w:name="__RefHeading___Toc2280_4092869310"/>
       <w:bookmarkEnd w:id="48"/>
       <w:r>
         <w:rPr/>
@@ -25811,17 +25811,7 @@
       </w:pPr>
       <w:r>
         <w:rPr/>
-        <w:t xml:space="preserve">El código, los datos de mercado con la fuente de cada cifra y los gráficos de este trabajo están disponibles en el repositorio </w:t>
-      </w:r>
-      <w:r>
-        <w:rPr>
-          <w:highlight w:val="yellow"/>
-        </w:rPr>
-        <w:t>https://github.com/USUARIO/flujo-tfg</w:t>
-      </w:r>
-      <w:r>
-        <w:rPr/>
-        <w:t>. Para reproducir los resultados basta con ejecutar, en este orden, modelo.py, graficos.py y exportar_excel.py, y cualquier hipótesis puede cambiarse en hipotesis.py para recalcular todo el plan.</w:t>
+        <w:t>El código, los datos de mercado con la fuente de cada cifra y los gráficos de este trabajo están disponibles en el repositorio https://github.com/Andres-Leach/flujo-tfg. Para reproducir los resultados basta con ejecutar, en este orden, modelo.py, graficos.py y exportar_excel.py, y cualquier hipótesis puede cambiarse en hipotesis.py para recalcular todo el plan.</w:t>
       </w:r>
     </w:p>
     <w:p>
@@ -25843,7 +25833,7 @@
         <w:pStyle w:val="Heading1"/>
         <w:rPr/>
       </w:pPr>
-      <w:bookmarkStart w:id="49" w:name="__RefHeading___Toc2284_3155442951"/>
+      <w:bookmarkStart w:id="49" w:name="__RefHeading___Toc2282_4092869310"/>
       <w:bookmarkEnd w:id="49"/>
       <w:r>
         <w:rPr/>

</xml_diff>

<commit_message>
Anexo III: método, guion y plantilla de resultados de las entrevistas
Co-Authored-By: Claude Opus 5.5 <noreply@anthropic.com>
Claude-Session: https://claude.ai/code/session_01V4goTpBqBm77qbsNTgtkTF
</commit_message>
<xml_diff>
--- a/TFG_Flujo_v2.docx
+++ b/TFG_Flujo_v2.docx
@@ -496,7 +496,7 @@
             </w:rPr>
             <w:fldChar w:fldCharType="separate"/>
           </w:r>
-          <w:hyperlink w:anchor="__RefHeading___Toc2184_4092869310">
+          <w:hyperlink w:anchor="__RefHeading___Toc2554_2080339060">
             <w:r>
               <w:rPr>
                 <w:rStyle w:val="IndexLink"/>
@@ -516,7 +516,7 @@
             </w:tabs>
             <w:rPr/>
           </w:pPr>
-          <w:hyperlink w:anchor="__RefHeading___Toc2186_4092869310">
+          <w:hyperlink w:anchor="__RefHeading___Toc2556_2080339060">
             <w:r>
               <w:rPr>
                 <w:rStyle w:val="IndexLink"/>
@@ -536,7 +536,7 @@
             </w:tabs>
             <w:rPr/>
           </w:pPr>
-          <w:hyperlink w:anchor="__RefHeading___Toc2188_4092869310">
+          <w:hyperlink w:anchor="__RefHeading___Toc2558_2080339060">
             <w:r>
               <w:rPr>
                 <w:rStyle w:val="IndexLink"/>
@@ -556,7 +556,7 @@
             </w:tabs>
             <w:rPr/>
           </w:pPr>
-          <w:hyperlink w:anchor="__RefHeading___Toc2190_4092869310">
+          <w:hyperlink w:anchor="__RefHeading___Toc2560_2080339060">
             <w:r>
               <w:rPr>
                 <w:rStyle w:val="IndexLink"/>
@@ -576,7 +576,7 @@
             </w:tabs>
             <w:rPr/>
           </w:pPr>
-          <w:hyperlink w:anchor="__RefHeading___Toc2192_4092869310">
+          <w:hyperlink w:anchor="__RefHeading___Toc2562_2080339060">
             <w:r>
               <w:rPr>
                 <w:rStyle w:val="IndexLink"/>
@@ -596,7 +596,7 @@
             </w:tabs>
             <w:rPr/>
           </w:pPr>
-          <w:hyperlink w:anchor="__RefHeading___Toc2194_4092869310">
+          <w:hyperlink w:anchor="__RefHeading___Toc2564_2080339060">
             <w:r>
               <w:rPr>
                 <w:rStyle w:val="IndexLink"/>
@@ -616,7 +616,7 @@
             </w:tabs>
             <w:rPr/>
           </w:pPr>
-          <w:hyperlink w:anchor="__RefHeading___Toc2196_4092869310">
+          <w:hyperlink w:anchor="__RefHeading___Toc2566_2080339060">
             <w:r>
               <w:rPr>
                 <w:rStyle w:val="IndexLink"/>
@@ -636,7 +636,7 @@
             </w:tabs>
             <w:rPr/>
           </w:pPr>
-          <w:hyperlink w:anchor="__RefHeading___Toc2198_4092869310">
+          <w:hyperlink w:anchor="__RefHeading___Toc2568_2080339060">
             <w:r>
               <w:rPr>
                 <w:rStyle w:val="IndexLink"/>
@@ -656,7 +656,7 @@
             </w:tabs>
             <w:rPr/>
           </w:pPr>
-          <w:hyperlink w:anchor="__RefHeading___Toc2200_4092869310">
+          <w:hyperlink w:anchor="__RefHeading___Toc2570_2080339060">
             <w:r>
               <w:rPr>
                 <w:rStyle w:val="IndexLink"/>
@@ -676,7 +676,7 @@
             </w:tabs>
             <w:rPr/>
           </w:pPr>
-          <w:hyperlink w:anchor="__RefHeading___Toc2202_4092869310">
+          <w:hyperlink w:anchor="__RefHeading___Toc2572_2080339060">
             <w:r>
               <w:rPr>
                 <w:rStyle w:val="IndexLink"/>
@@ -696,7 +696,7 @@
             </w:tabs>
             <w:rPr/>
           </w:pPr>
-          <w:hyperlink w:anchor="__RefHeading___Toc2204_4092869310">
+          <w:hyperlink w:anchor="__RefHeading___Toc2574_2080339060">
             <w:r>
               <w:rPr>
                 <w:rStyle w:val="IndexLink"/>
@@ -716,7 +716,7 @@
             </w:tabs>
             <w:rPr/>
           </w:pPr>
-          <w:hyperlink w:anchor="__RefHeading___Toc2206_4092869310">
+          <w:hyperlink w:anchor="__RefHeading___Toc2576_2080339060">
             <w:r>
               <w:rPr>
                 <w:rStyle w:val="IndexLink"/>
@@ -736,7 +736,7 @@
             </w:tabs>
             <w:rPr/>
           </w:pPr>
-          <w:hyperlink w:anchor="__RefHeading___Toc2208_4092869310">
+          <w:hyperlink w:anchor="__RefHeading___Toc2578_2080339060">
             <w:r>
               <w:rPr>
                 <w:rStyle w:val="IndexLink"/>
@@ -756,7 +756,7 @@
             </w:tabs>
             <w:rPr/>
           </w:pPr>
-          <w:hyperlink w:anchor="__RefHeading___Toc2210_4092869310">
+          <w:hyperlink w:anchor="__RefHeading___Toc2580_2080339060">
             <w:r>
               <w:rPr>
                 <w:rStyle w:val="IndexLink"/>
@@ -776,7 +776,7 @@
             </w:tabs>
             <w:rPr/>
           </w:pPr>
-          <w:hyperlink w:anchor="__RefHeading___Toc2212_4092869310">
+          <w:hyperlink w:anchor="__RefHeading___Toc2582_2080339060">
             <w:r>
               <w:rPr>
                 <w:rStyle w:val="IndexLink"/>
@@ -796,7 +796,7 @@
             </w:tabs>
             <w:rPr/>
           </w:pPr>
-          <w:hyperlink w:anchor="__RefHeading___Toc2214_4092869310">
+          <w:hyperlink w:anchor="__RefHeading___Toc2584_2080339060">
             <w:r>
               <w:rPr>
                 <w:rStyle w:val="IndexLink"/>
@@ -816,7 +816,7 @@
             </w:tabs>
             <w:rPr/>
           </w:pPr>
-          <w:hyperlink w:anchor="__RefHeading___Toc2216_4092869310">
+          <w:hyperlink w:anchor="__RefHeading___Toc2586_2080339060">
             <w:r>
               <w:rPr>
                 <w:rStyle w:val="IndexLink"/>
@@ -836,7 +836,7 @@
             </w:tabs>
             <w:rPr/>
           </w:pPr>
-          <w:hyperlink w:anchor="__RefHeading___Toc2218_4092869310">
+          <w:hyperlink w:anchor="__RefHeading___Toc2588_2080339060">
             <w:r>
               <w:rPr>
                 <w:rStyle w:val="IndexLink"/>
@@ -856,7 +856,7 @@
             </w:tabs>
             <w:rPr/>
           </w:pPr>
-          <w:hyperlink w:anchor="__RefHeading___Toc2220_4092869310">
+          <w:hyperlink w:anchor="__RefHeading___Toc2590_2080339060">
             <w:r>
               <w:rPr>
                 <w:rStyle w:val="IndexLink"/>
@@ -876,7 +876,7 @@
             </w:tabs>
             <w:rPr/>
           </w:pPr>
-          <w:hyperlink w:anchor="__RefHeading___Toc2222_4092869310">
+          <w:hyperlink w:anchor="__RefHeading___Toc2592_2080339060">
             <w:r>
               <w:rPr>
                 <w:rStyle w:val="IndexLink"/>
@@ -896,7 +896,7 @@
             </w:tabs>
             <w:rPr/>
           </w:pPr>
-          <w:hyperlink w:anchor="__RefHeading___Toc2224_4092869310">
+          <w:hyperlink w:anchor="__RefHeading___Toc2594_2080339060">
             <w:r>
               <w:rPr>
                 <w:rStyle w:val="IndexLink"/>
@@ -916,7 +916,7 @@
             </w:tabs>
             <w:rPr/>
           </w:pPr>
-          <w:hyperlink w:anchor="__RefHeading___Toc2226_4092869310">
+          <w:hyperlink w:anchor="__RefHeading___Toc2596_2080339060">
             <w:r>
               <w:rPr>
                 <w:rStyle w:val="IndexLink"/>
@@ -936,7 +936,7 @@
             </w:tabs>
             <w:rPr/>
           </w:pPr>
-          <w:hyperlink w:anchor="__RefHeading___Toc2228_4092869310">
+          <w:hyperlink w:anchor="__RefHeading___Toc2598_2080339060">
             <w:r>
               <w:rPr>
                 <w:rStyle w:val="IndexLink"/>
@@ -956,7 +956,7 @@
             </w:tabs>
             <w:rPr/>
           </w:pPr>
-          <w:hyperlink w:anchor="__RefHeading___Toc2230_4092869310">
+          <w:hyperlink w:anchor="__RefHeading___Toc2600_2080339060">
             <w:r>
               <w:rPr>
                 <w:rStyle w:val="IndexLink"/>
@@ -976,7 +976,7 @@
             </w:tabs>
             <w:rPr/>
           </w:pPr>
-          <w:hyperlink w:anchor="__RefHeading___Toc2232_4092869310">
+          <w:hyperlink w:anchor="__RefHeading___Toc2602_2080339060">
             <w:r>
               <w:rPr>
                 <w:rStyle w:val="IndexLink"/>
@@ -996,7 +996,7 @@
             </w:tabs>
             <w:rPr/>
           </w:pPr>
-          <w:hyperlink w:anchor="__RefHeading___Toc2234_4092869310">
+          <w:hyperlink w:anchor="__RefHeading___Toc2604_2080339060">
             <w:r>
               <w:rPr>
                 <w:rStyle w:val="IndexLink"/>
@@ -1016,7 +1016,7 @@
             </w:tabs>
             <w:rPr/>
           </w:pPr>
-          <w:hyperlink w:anchor="__RefHeading___Toc2236_4092869310">
+          <w:hyperlink w:anchor="__RefHeading___Toc2606_2080339060">
             <w:r>
               <w:rPr>
                 <w:rStyle w:val="IndexLink"/>
@@ -1036,7 +1036,7 @@
             </w:tabs>
             <w:rPr/>
           </w:pPr>
-          <w:hyperlink w:anchor="__RefHeading___Toc2238_4092869310">
+          <w:hyperlink w:anchor="__RefHeading___Toc2608_2080339060">
             <w:r>
               <w:rPr>
                 <w:rStyle w:val="IndexLink"/>
@@ -1056,7 +1056,7 @@
             </w:tabs>
             <w:rPr/>
           </w:pPr>
-          <w:hyperlink w:anchor="__RefHeading___Toc2240_4092869310">
+          <w:hyperlink w:anchor="__RefHeading___Toc2610_2080339060">
             <w:r>
               <w:rPr>
                 <w:rStyle w:val="IndexLink"/>
@@ -1076,7 +1076,7 @@
             </w:tabs>
             <w:rPr/>
           </w:pPr>
-          <w:hyperlink w:anchor="__RefHeading___Toc2242_4092869310">
+          <w:hyperlink w:anchor="__RefHeading___Toc2612_2080339060">
             <w:r>
               <w:rPr>
                 <w:rStyle w:val="IndexLink"/>
@@ -1096,7 +1096,7 @@
             </w:tabs>
             <w:rPr/>
           </w:pPr>
-          <w:hyperlink w:anchor="__RefHeading___Toc2244_4092869310">
+          <w:hyperlink w:anchor="__RefHeading___Toc2614_2080339060">
             <w:r>
               <w:rPr>
                 <w:rStyle w:val="IndexLink"/>
@@ -1116,7 +1116,7 @@
             </w:tabs>
             <w:rPr/>
           </w:pPr>
-          <w:hyperlink w:anchor="__RefHeading___Toc2246_4092869310">
+          <w:hyperlink w:anchor="__RefHeading___Toc2616_2080339060">
             <w:r>
               <w:rPr>
                 <w:rStyle w:val="IndexLink"/>
@@ -1136,7 +1136,7 @@
             </w:tabs>
             <w:rPr/>
           </w:pPr>
-          <w:hyperlink w:anchor="__RefHeading___Toc2248_4092869310">
+          <w:hyperlink w:anchor="__RefHeading___Toc2618_2080339060">
             <w:r>
               <w:rPr>
                 <w:rStyle w:val="IndexLink"/>
@@ -1156,7 +1156,7 @@
             </w:tabs>
             <w:rPr/>
           </w:pPr>
-          <w:hyperlink w:anchor="__RefHeading___Toc2250_4092869310">
+          <w:hyperlink w:anchor="__RefHeading___Toc2620_2080339060">
             <w:r>
               <w:rPr>
                 <w:rStyle w:val="IndexLink"/>
@@ -1176,7 +1176,7 @@
             </w:tabs>
             <w:rPr/>
           </w:pPr>
-          <w:hyperlink w:anchor="__RefHeading___Toc2252_4092869310">
+          <w:hyperlink w:anchor="__RefHeading___Toc2622_2080339060">
             <w:r>
               <w:rPr>
                 <w:rStyle w:val="IndexLink"/>
@@ -1196,7 +1196,7 @@
             </w:tabs>
             <w:rPr/>
           </w:pPr>
-          <w:hyperlink w:anchor="__RefHeading___Toc2254_4092869310">
+          <w:hyperlink w:anchor="__RefHeading___Toc2624_2080339060">
             <w:r>
               <w:rPr>
                 <w:rStyle w:val="IndexLink"/>
@@ -1216,7 +1216,7 @@
             </w:tabs>
             <w:rPr/>
           </w:pPr>
-          <w:hyperlink w:anchor="__RefHeading___Toc2256_4092869310">
+          <w:hyperlink w:anchor="__RefHeading___Toc2626_2080339060">
             <w:r>
               <w:rPr>
                 <w:rStyle w:val="IndexLink"/>
@@ -1236,7 +1236,7 @@
             </w:tabs>
             <w:rPr/>
           </w:pPr>
-          <w:hyperlink w:anchor="__RefHeading___Toc2258_4092869310">
+          <w:hyperlink w:anchor="__RefHeading___Toc2628_2080339060">
             <w:r>
               <w:rPr>
                 <w:rStyle w:val="IndexLink"/>
@@ -1256,7 +1256,7 @@
             </w:tabs>
             <w:rPr/>
           </w:pPr>
-          <w:hyperlink w:anchor="__RefHeading___Toc2260_4092869310">
+          <w:hyperlink w:anchor="__RefHeading___Toc2630_2080339060">
             <w:r>
               <w:rPr>
                 <w:rStyle w:val="IndexLink"/>
@@ -1276,7 +1276,7 @@
             </w:tabs>
             <w:rPr/>
           </w:pPr>
-          <w:hyperlink w:anchor="__RefHeading___Toc2262_4092869310">
+          <w:hyperlink w:anchor="__RefHeading___Toc2632_2080339060">
             <w:r>
               <w:rPr>
                 <w:rStyle w:val="IndexLink"/>
@@ -1296,7 +1296,7 @@
             </w:tabs>
             <w:rPr/>
           </w:pPr>
-          <w:hyperlink w:anchor="__RefHeading___Toc2264_4092869310">
+          <w:hyperlink w:anchor="__RefHeading___Toc2634_2080339060">
             <w:r>
               <w:rPr>
                 <w:rStyle w:val="IndexLink"/>
@@ -1316,7 +1316,7 @@
             </w:tabs>
             <w:rPr/>
           </w:pPr>
-          <w:hyperlink w:anchor="__RefHeading___Toc2266_4092869310">
+          <w:hyperlink w:anchor="__RefHeading___Toc2636_2080339060">
             <w:r>
               <w:rPr>
                 <w:rStyle w:val="IndexLink"/>
@@ -1336,7 +1336,7 @@
             </w:tabs>
             <w:rPr/>
           </w:pPr>
-          <w:hyperlink w:anchor="__RefHeading___Toc2268_4092869310">
+          <w:hyperlink w:anchor="__RefHeading___Toc2638_2080339060">
             <w:r>
               <w:rPr>
                 <w:rStyle w:val="IndexLink"/>
@@ -1356,7 +1356,7 @@
             </w:tabs>
             <w:rPr/>
           </w:pPr>
-          <w:hyperlink w:anchor="__RefHeading___Toc2270_4092869310">
+          <w:hyperlink w:anchor="__RefHeading___Toc2640_2080339060">
             <w:r>
               <w:rPr>
                 <w:rStyle w:val="IndexLink"/>
@@ -1376,7 +1376,7 @@
             </w:tabs>
             <w:rPr/>
           </w:pPr>
-          <w:hyperlink w:anchor="__RefHeading___Toc2272_4092869310">
+          <w:hyperlink w:anchor="__RefHeading___Toc2642_2080339060">
             <w:r>
               <w:rPr>
                 <w:rStyle w:val="IndexLink"/>
@@ -1396,7 +1396,7 @@
             </w:tabs>
             <w:rPr/>
           </w:pPr>
-          <w:hyperlink w:anchor="__RefHeading___Toc2274_4092869310">
+          <w:hyperlink w:anchor="__RefHeading___Toc2644_2080339060">
             <w:r>
               <w:rPr>
                 <w:rStyle w:val="IndexLink"/>
@@ -1416,7 +1416,7 @@
             </w:tabs>
             <w:rPr/>
           </w:pPr>
-          <w:hyperlink w:anchor="__RefHeading___Toc2276_4092869310">
+          <w:hyperlink w:anchor="__RefHeading___Toc2646_2080339060">
             <w:r>
               <w:rPr>
                 <w:rStyle w:val="IndexLink"/>
@@ -1436,7 +1436,7 @@
             </w:tabs>
             <w:rPr/>
           </w:pPr>
-          <w:hyperlink w:anchor="__RefHeading___Toc2278_4092869310">
+          <w:hyperlink w:anchor="__RefHeading___Toc2648_2080339060">
             <w:r>
               <w:rPr>
                 <w:rStyle w:val="IndexLink"/>
@@ -1456,7 +1456,7 @@
             </w:tabs>
             <w:rPr/>
           </w:pPr>
-          <w:hyperlink w:anchor="__RefHeading___Toc2280_4092869310">
+          <w:hyperlink w:anchor="__RefHeading___Toc2650_2080339060">
             <w:r>
               <w:rPr>
                 <w:rStyle w:val="IndexLink"/>
@@ -1476,12 +1476,12 @@
             </w:tabs>
             <w:rPr/>
           </w:pPr>
-          <w:hyperlink w:anchor="__RefHeading___Toc2282_4092869310">
+          <w:hyperlink w:anchor="__RefHeading___Toc2652_2080339060">
             <w:r>
               <w:rPr>
                 <w:rStyle w:val="IndexLink"/>
               </w:rPr>
-              <w:t>Anexo III. Guion de las entrevistas exploratorias</w:t>
+              <w:t>Anexo III. Entrevistas exploratorias</w:t>
               <w:tab/>
               <w:t>38</w:t>
             </w:r>
@@ -1512,7 +1512,7 @@
         <w:pStyle w:val="Heading1"/>
         <w:rPr/>
       </w:pPr>
-      <w:bookmarkStart w:id="0" w:name="__RefHeading___Toc2184_4092869310"/>
+      <w:bookmarkStart w:id="0" w:name="__RefHeading___Toc2554_2080339060"/>
       <w:bookmarkEnd w:id="0"/>
       <w:r>
         <w:rPr/>
@@ -1524,7 +1524,7 @@
         <w:pStyle w:val="Heading2"/>
         <w:rPr/>
       </w:pPr>
-      <w:bookmarkStart w:id="1" w:name="__RefHeading___Toc2186_4092869310"/>
+      <w:bookmarkStart w:id="1" w:name="__RefHeading___Toc2556_2080339060"/>
       <w:bookmarkEnd w:id="1"/>
       <w:r>
         <w:rPr/>
@@ -1598,7 +1598,7 @@
         <w:pStyle w:val="Heading2"/>
         <w:rPr/>
       </w:pPr>
-      <w:bookmarkStart w:id="2" w:name="__RefHeading___Toc2188_4092869310"/>
+      <w:bookmarkStart w:id="2" w:name="__RefHeading___Toc2558_2080339060"/>
       <w:bookmarkEnd w:id="2"/>
       <w:r>
         <w:rPr/>
@@ -1748,7 +1748,7 @@
         <w:pStyle w:val="Heading2"/>
         <w:rPr/>
       </w:pPr>
-      <w:bookmarkStart w:id="3" w:name="__RefHeading___Toc2190_4092869310"/>
+      <w:bookmarkStart w:id="3" w:name="__RefHeading___Toc2560_2080339060"/>
       <w:bookmarkEnd w:id="3"/>
       <w:r>
         <w:rPr/>
@@ -1804,7 +1804,7 @@
         <w:pStyle w:val="Heading2"/>
         <w:rPr/>
       </w:pPr>
-      <w:bookmarkStart w:id="4" w:name="__RefHeading___Toc2192_4092869310"/>
+      <w:bookmarkStart w:id="4" w:name="__RefHeading___Toc2562_2080339060"/>
       <w:bookmarkEnd w:id="4"/>
       <w:r>
         <w:rPr/>
@@ -1871,7 +1871,7 @@
         <w:pStyle w:val="Heading2"/>
         <w:rPr/>
       </w:pPr>
-      <w:bookmarkStart w:id="5" w:name="__RefHeading___Toc2194_4092869310"/>
+      <w:bookmarkStart w:id="5" w:name="__RefHeading___Toc2564_2080339060"/>
       <w:bookmarkEnd w:id="5"/>
       <w:r>
         <w:rPr/>
@@ -1897,7 +1897,7 @@
         <w:pStyle w:val="Heading1"/>
         <w:rPr/>
       </w:pPr>
-      <w:bookmarkStart w:id="6" w:name="__RefHeading___Toc2196_4092869310"/>
+      <w:bookmarkStart w:id="6" w:name="__RefHeading___Toc2566_2080339060"/>
       <w:bookmarkEnd w:id="6"/>
       <w:r>
         <w:rPr/>
@@ -1909,7 +1909,7 @@
         <w:pStyle w:val="Heading2"/>
         <w:rPr/>
       </w:pPr>
-      <w:bookmarkStart w:id="7" w:name="__RefHeading___Toc2198_4092869310"/>
+      <w:bookmarkStart w:id="7" w:name="__RefHeading___Toc2568_2080339060"/>
       <w:bookmarkEnd w:id="7"/>
       <w:r>
         <w:rPr/>
@@ -1943,7 +1943,7 @@
         <w:pStyle w:val="Heading2"/>
         <w:rPr/>
       </w:pPr>
-      <w:bookmarkStart w:id="8" w:name="__RefHeading___Toc2200_4092869310"/>
+      <w:bookmarkStart w:id="8" w:name="__RefHeading___Toc2570_2080339060"/>
       <w:bookmarkEnd w:id="8"/>
       <w:r>
         <w:rPr/>
@@ -1966,7 +1966,7 @@
         <w:pStyle w:val="Heading2"/>
         <w:rPr/>
       </w:pPr>
-      <w:bookmarkStart w:id="9" w:name="__RefHeading___Toc2202_4092869310"/>
+      <w:bookmarkStart w:id="9" w:name="__RefHeading___Toc2572_2080339060"/>
       <w:bookmarkEnd w:id="9"/>
       <w:r>
         <w:rPr/>
@@ -2000,7 +2000,7 @@
         <w:pStyle w:val="Heading2"/>
         <w:rPr/>
       </w:pPr>
-      <w:bookmarkStart w:id="10" w:name="__RefHeading___Toc2204_4092869310"/>
+      <w:bookmarkStart w:id="10" w:name="__RefHeading___Toc2574_2080339060"/>
       <w:bookmarkEnd w:id="10"/>
       <w:r>
         <w:rPr/>
@@ -2842,7 +2842,7 @@
         <w:pStyle w:val="Heading2"/>
         <w:rPr/>
       </w:pPr>
-      <w:bookmarkStart w:id="11" w:name="__RefHeading___Toc2206_4092869310"/>
+      <w:bookmarkStart w:id="11" w:name="__RefHeading___Toc2576_2080339060"/>
       <w:bookmarkEnd w:id="11"/>
       <w:r>
         <w:rPr/>
@@ -3754,7 +3754,7 @@
         <w:pStyle w:val="Heading1"/>
         <w:rPr/>
       </w:pPr>
-      <w:bookmarkStart w:id="12" w:name="__RefHeading___Toc2208_4092869310"/>
+      <w:bookmarkStart w:id="12" w:name="__RefHeading___Toc2578_2080339060"/>
       <w:bookmarkEnd w:id="12"/>
       <w:r>
         <w:rPr/>
@@ -3766,7 +3766,7 @@
         <w:pStyle w:val="Heading2"/>
         <w:rPr/>
       </w:pPr>
-      <w:bookmarkStart w:id="13" w:name="__RefHeading___Toc2210_4092869310"/>
+      <w:bookmarkStart w:id="13" w:name="__RefHeading___Toc2580_2080339060"/>
       <w:bookmarkEnd w:id="13"/>
       <w:r>
         <w:rPr/>
@@ -3811,7 +3811,7 @@
         <w:pStyle w:val="Heading2"/>
         <w:rPr/>
       </w:pPr>
-      <w:bookmarkStart w:id="14" w:name="__RefHeading___Toc2212_4092869310"/>
+      <w:bookmarkStart w:id="14" w:name="__RefHeading___Toc2582_2080339060"/>
       <w:bookmarkEnd w:id="14"/>
       <w:r>
         <w:rPr/>
@@ -3911,7 +3911,7 @@
         <w:pStyle w:val="Heading2"/>
         <w:rPr/>
       </w:pPr>
-      <w:bookmarkStart w:id="15" w:name="__RefHeading___Toc2214_4092869310"/>
+      <w:bookmarkStart w:id="15" w:name="__RefHeading___Toc2584_2080339060"/>
       <w:bookmarkEnd w:id="15"/>
       <w:r>
         <w:rPr/>
@@ -4731,7 +4731,7 @@
         <w:pStyle w:val="Heading2"/>
         <w:rPr/>
       </w:pPr>
-      <w:bookmarkStart w:id="16" w:name="__RefHeading___Toc2216_4092869310"/>
+      <w:bookmarkStart w:id="16" w:name="__RefHeading___Toc2586_2080339060"/>
       <w:bookmarkEnd w:id="16"/>
       <w:r>
         <w:rPr/>
@@ -5510,7 +5510,7 @@
         <w:pStyle w:val="Heading1"/>
         <w:rPr/>
       </w:pPr>
-      <w:bookmarkStart w:id="17" w:name="__RefHeading___Toc2218_4092869310"/>
+      <w:bookmarkStart w:id="17" w:name="__RefHeading___Toc2588_2080339060"/>
       <w:bookmarkEnd w:id="17"/>
       <w:r>
         <w:rPr/>
@@ -5522,7 +5522,7 @@
         <w:pStyle w:val="Heading2"/>
         <w:rPr/>
       </w:pPr>
-      <w:bookmarkStart w:id="18" w:name="__RefHeading___Toc2220_4092869310"/>
+      <w:bookmarkStart w:id="18" w:name="__RefHeading___Toc2590_2080339060"/>
       <w:bookmarkEnd w:id="18"/>
       <w:r>
         <w:rPr/>
@@ -5567,7 +5567,7 @@
         <w:pStyle w:val="Heading2"/>
         <w:rPr/>
       </w:pPr>
-      <w:bookmarkStart w:id="19" w:name="__RefHeading___Toc2222_4092869310"/>
+      <w:bookmarkStart w:id="19" w:name="__RefHeading___Toc2592_2080339060"/>
       <w:bookmarkEnd w:id="19"/>
       <w:r>
         <w:rPr/>
@@ -6737,7 +6737,7 @@
         <w:pStyle w:val="Heading2"/>
         <w:rPr/>
       </w:pPr>
-      <w:bookmarkStart w:id="20" w:name="__RefHeading___Toc2224_4092869310"/>
+      <w:bookmarkStart w:id="20" w:name="__RefHeading___Toc2594_2080339060"/>
       <w:bookmarkEnd w:id="20"/>
       <w:r>
         <w:rPr/>
@@ -7586,7 +7586,7 @@
         <w:pStyle w:val="Heading1"/>
         <w:rPr/>
       </w:pPr>
-      <w:bookmarkStart w:id="21" w:name="__RefHeading___Toc2226_4092869310"/>
+      <w:bookmarkStart w:id="21" w:name="__RefHeading___Toc2596_2080339060"/>
       <w:bookmarkEnd w:id="21"/>
       <w:r>
         <w:rPr/>
@@ -7598,7 +7598,7 @@
         <w:pStyle w:val="Heading2"/>
         <w:rPr/>
       </w:pPr>
-      <w:bookmarkStart w:id="22" w:name="__RefHeading___Toc2228_4092869310"/>
+      <w:bookmarkStart w:id="22" w:name="__RefHeading___Toc2598_2080339060"/>
       <w:bookmarkEnd w:id="22"/>
       <w:r>
         <w:rPr/>
@@ -7632,7 +7632,7 @@
         <w:pStyle w:val="Heading2"/>
         <w:rPr/>
       </w:pPr>
-      <w:bookmarkStart w:id="23" w:name="__RefHeading___Toc2230_4092869310"/>
+      <w:bookmarkStart w:id="23" w:name="__RefHeading___Toc2600_2080339060"/>
       <w:bookmarkEnd w:id="23"/>
       <w:r>
         <w:rPr/>
@@ -8347,7 +8347,7 @@
         <w:pStyle w:val="Heading2"/>
         <w:rPr/>
       </w:pPr>
-      <w:bookmarkStart w:id="24" w:name="__RefHeading___Toc2232_4092869310"/>
+      <w:bookmarkStart w:id="24" w:name="__RefHeading___Toc2602_2080339060"/>
       <w:bookmarkEnd w:id="24"/>
       <w:r>
         <w:rPr/>
@@ -8373,7 +8373,7 @@
         <w:pStyle w:val="Heading1"/>
         <w:rPr/>
       </w:pPr>
-      <w:bookmarkStart w:id="25" w:name="__RefHeading___Toc2234_4092869310"/>
+      <w:bookmarkStart w:id="25" w:name="__RefHeading___Toc2604_2080339060"/>
       <w:bookmarkEnd w:id="25"/>
       <w:r>
         <w:rPr/>
@@ -8397,7 +8397,7 @@
         <w:pStyle w:val="Heading2"/>
         <w:rPr/>
       </w:pPr>
-      <w:bookmarkStart w:id="26" w:name="__RefHeading___Toc2236_4092869310"/>
+      <w:bookmarkStart w:id="26" w:name="__RefHeading___Toc2606_2080339060"/>
       <w:bookmarkEnd w:id="26"/>
       <w:r>
         <w:rPr/>
@@ -9495,7 +9495,7 @@
         <w:pStyle w:val="Heading2"/>
         <w:rPr/>
       </w:pPr>
-      <w:bookmarkStart w:id="27" w:name="__RefHeading___Toc2238_4092869310"/>
+      <w:bookmarkStart w:id="27" w:name="__RefHeading___Toc2608_2080339060"/>
       <w:bookmarkEnd w:id="27"/>
       <w:r>
         <w:rPr/>
@@ -10667,7 +10667,7 @@
         <w:pStyle w:val="Heading2"/>
         <w:rPr/>
       </w:pPr>
-      <w:bookmarkStart w:id="28" w:name="__RefHeading___Toc2240_4092869310"/>
+      <w:bookmarkStart w:id="28" w:name="__RefHeading___Toc2610_2080339060"/>
       <w:bookmarkEnd w:id="28"/>
       <w:r>
         <w:rPr/>
@@ -12029,7 +12029,7 @@
         <w:pStyle w:val="Heading2"/>
         <w:rPr/>
       </w:pPr>
-      <w:bookmarkStart w:id="29" w:name="__RefHeading___Toc2242_4092869310"/>
+      <w:bookmarkStart w:id="29" w:name="__RefHeading___Toc2612_2080339060"/>
       <w:bookmarkEnd w:id="29"/>
       <w:r>
         <w:rPr/>
@@ -12074,7 +12074,7 @@
         <w:pStyle w:val="Heading2"/>
         <w:rPr/>
       </w:pPr>
-      <w:bookmarkStart w:id="30" w:name="__RefHeading___Toc2244_4092869310"/>
+      <w:bookmarkStart w:id="30" w:name="__RefHeading___Toc2614_2080339060"/>
       <w:bookmarkEnd w:id="30"/>
       <w:r>
         <w:rPr/>
@@ -14515,7 +14515,7 @@
         <w:pStyle w:val="Heading2"/>
         <w:rPr/>
       </w:pPr>
-      <w:bookmarkStart w:id="31" w:name="__RefHeading___Toc2246_4092869310"/>
+      <w:bookmarkStart w:id="31" w:name="__RefHeading___Toc2616_2080339060"/>
       <w:bookmarkEnd w:id="31"/>
       <w:r>
         <w:rPr/>
@@ -16672,7 +16672,7 @@
         <w:pStyle w:val="Heading2"/>
         <w:rPr/>
       </w:pPr>
-      <w:bookmarkStart w:id="32" w:name="__RefHeading___Toc2248_4092869310"/>
+      <w:bookmarkStart w:id="32" w:name="__RefHeading___Toc2618_2080339060"/>
       <w:bookmarkEnd w:id="32"/>
       <w:r>
         <w:rPr/>
@@ -18968,7 +18968,7 @@
         <w:pStyle w:val="Heading1"/>
         <w:rPr/>
       </w:pPr>
-      <w:bookmarkStart w:id="33" w:name="__RefHeading___Toc2250_4092869310"/>
+      <w:bookmarkStart w:id="33" w:name="__RefHeading___Toc2620_2080339060"/>
       <w:bookmarkEnd w:id="33"/>
       <w:r>
         <w:rPr/>
@@ -18980,7 +18980,7 @@
         <w:pStyle w:val="Heading2"/>
         <w:rPr/>
       </w:pPr>
-      <w:bookmarkStart w:id="34" w:name="__RefHeading___Toc2252_4092869310"/>
+      <w:bookmarkStart w:id="34" w:name="__RefHeading___Toc2622_2080339060"/>
       <w:bookmarkEnd w:id="34"/>
       <w:r>
         <w:rPr/>
@@ -19412,7 +19412,7 @@
         <w:pStyle w:val="Heading2"/>
         <w:rPr/>
       </w:pPr>
-      <w:bookmarkStart w:id="35" w:name="__RefHeading___Toc2254_4092869310"/>
+      <w:bookmarkStart w:id="35" w:name="__RefHeading___Toc2624_2080339060"/>
       <w:bookmarkEnd w:id="35"/>
       <w:r>
         <w:rPr/>
@@ -20623,7 +20623,7 @@
         <w:pStyle w:val="Heading2"/>
         <w:rPr/>
       </w:pPr>
-      <w:bookmarkStart w:id="36" w:name="__RefHeading___Toc2256_4092869310"/>
+      <w:bookmarkStart w:id="36" w:name="__RefHeading___Toc2626_2080339060"/>
       <w:bookmarkEnd w:id="36"/>
       <w:r>
         <w:rPr/>
@@ -20668,7 +20668,7 @@
         <w:pStyle w:val="Heading2"/>
         <w:rPr/>
       </w:pPr>
-      <w:bookmarkStart w:id="37" w:name="__RefHeading___Toc2258_4092869310"/>
+      <w:bookmarkStart w:id="37" w:name="__RefHeading___Toc2628_2080339060"/>
       <w:bookmarkEnd w:id="37"/>
       <w:r>
         <w:rPr/>
@@ -21835,7 +21835,7 @@
         <w:pStyle w:val="Heading1"/>
         <w:rPr/>
       </w:pPr>
-      <w:bookmarkStart w:id="38" w:name="__RefHeading___Toc2260_4092869310"/>
+      <w:bookmarkStart w:id="38" w:name="__RefHeading___Toc2630_2080339060"/>
       <w:bookmarkEnd w:id="38"/>
       <w:r>
         <w:rPr/>
@@ -21847,7 +21847,7 @@
         <w:pStyle w:val="Heading2"/>
         <w:rPr/>
       </w:pPr>
-      <w:bookmarkStart w:id="39" w:name="__RefHeading___Toc2262_4092869310"/>
+      <w:bookmarkStart w:id="39" w:name="__RefHeading___Toc2632_2080339060"/>
       <w:bookmarkEnd w:id="39"/>
       <w:r>
         <w:rPr/>
@@ -23159,7 +23159,7 @@
         <w:pStyle w:val="Heading2"/>
         <w:rPr/>
       </w:pPr>
-      <w:bookmarkStart w:id="40" w:name="__RefHeading___Toc2264_4092869310"/>
+      <w:bookmarkStart w:id="40" w:name="__RefHeading___Toc2634_2080339060"/>
       <w:bookmarkEnd w:id="40"/>
       <w:r>
         <w:rPr/>
@@ -23284,7 +23284,7 @@
         <w:pStyle w:val="Heading2"/>
         <w:rPr/>
       </w:pPr>
-      <w:bookmarkStart w:id="41" w:name="__RefHeading___Toc2266_4092869310"/>
+      <w:bookmarkStart w:id="41" w:name="__RefHeading___Toc2636_2080339060"/>
       <w:bookmarkEnd w:id="41"/>
       <w:r>
         <w:rPr/>
@@ -24429,7 +24429,7 @@
         <w:pStyle w:val="Heading1"/>
         <w:rPr/>
       </w:pPr>
-      <w:bookmarkStart w:id="42" w:name="__RefHeading___Toc2268_4092869310"/>
+      <w:bookmarkStart w:id="42" w:name="__RefHeading___Toc2638_2080339060"/>
       <w:bookmarkEnd w:id="42"/>
       <w:r>
         <w:rPr/>
@@ -24441,7 +24441,7 @@
         <w:pStyle w:val="Heading2"/>
         <w:rPr/>
       </w:pPr>
-      <w:bookmarkStart w:id="43" w:name="__RefHeading___Toc2270_4092869310"/>
+      <w:bookmarkStart w:id="43" w:name="__RefHeading___Toc2640_2080339060"/>
       <w:bookmarkEnd w:id="43"/>
       <w:r>
         <w:rPr/>
@@ -24541,7 +24541,7 @@
         <w:pStyle w:val="Heading2"/>
         <w:rPr/>
       </w:pPr>
-      <w:bookmarkStart w:id="44" w:name="__RefHeading___Toc2272_4092869310"/>
+      <w:bookmarkStart w:id="44" w:name="__RefHeading___Toc2642_2080339060"/>
       <w:bookmarkEnd w:id="44"/>
       <w:r>
         <w:rPr/>
@@ -24564,7 +24564,7 @@
         <w:pStyle w:val="Heading2"/>
         <w:rPr/>
       </w:pPr>
-      <w:bookmarkStart w:id="45" w:name="__RefHeading___Toc2274_4092869310"/>
+      <w:bookmarkStart w:id="45" w:name="__RefHeading___Toc2644_2080339060"/>
       <w:bookmarkEnd w:id="45"/>
       <w:r>
         <w:rPr/>
@@ -24601,7 +24601,7 @@
         <w:pStyle w:val="Heading1"/>
         <w:rPr/>
       </w:pPr>
-      <w:bookmarkStart w:id="46" w:name="__RefHeading___Toc2276_4092869310"/>
+      <w:bookmarkStart w:id="46" w:name="__RefHeading___Toc2646_2080339060"/>
       <w:bookmarkEnd w:id="46"/>
       <w:r>
         <w:rPr/>
@@ -25432,7 +25432,7 @@
         <w:pStyle w:val="Heading1"/>
         <w:rPr/>
       </w:pPr>
-      <w:bookmarkStart w:id="47" w:name="__RefHeading___Toc2278_4092869310"/>
+      <w:bookmarkStart w:id="47" w:name="__RefHeading___Toc2648_2080339060"/>
       <w:bookmarkEnd w:id="47"/>
       <w:r>
         <w:rPr/>
@@ -25785,7 +25785,7 @@
         <w:pStyle w:val="Heading1"/>
         <w:rPr/>
       </w:pPr>
-      <w:bookmarkStart w:id="48" w:name="__RefHeading___Toc2280_4092869310"/>
+      <w:bookmarkStart w:id="48" w:name="__RefHeading___Toc2650_2080339060"/>
       <w:bookmarkEnd w:id="48"/>
       <w:r>
         <w:rPr/>
@@ -25833,11 +25833,11 @@
         <w:pStyle w:val="Heading1"/>
         <w:rPr/>
       </w:pPr>
-      <w:bookmarkStart w:id="49" w:name="__RefHeading___Toc2282_4092869310"/>
+      <w:bookmarkStart w:id="49" w:name="__RefHeading___Toc2652_2080339060"/>
       <w:bookmarkEnd w:id="49"/>
       <w:r>
         <w:rPr/>
-        <w:t>Anexo III. Guion de las entrevistas exploratorias</w:t>
+        <w:t>Anexo III. Entrevistas exploratorias</w:t>
       </w:r>
     </w:p>
     <w:p>
@@ -25848,9 +25848,83 @@
       </w:pPr>
       <w:r>
         <w:rPr>
+          <w:b/>
+          <w:bCs/>
+        </w:rPr>
+        <w:t>Método.</w:t>
+      </w:r>
+      <w:r>
+        <w:rPr/>
+        <w:t xml:space="preserve"> Se realizaron quince entrevistas semiestructuradas a autónomos y </w:t>
+      </w:r>
+      <w:r>
+        <w:rPr>
+          <w:i/>
+          <w:iCs/>
+        </w:rPr>
+        <w:t>freelancers</w:t>
+      </w:r>
+      <w:r>
+        <w:rPr/>
+        <w:t xml:space="preserve"> de entre 20 y 35 años, contactados a través de redes personales y comunidades profesionales. Las entrevistas se hicieron entre </w:t>
+      </w:r>
+      <w:r>
+        <w:rPr>
           <w:highlight w:val="yellow"/>
         </w:rPr>
-        <w:t>PENDIENTE DE COMPLETAR POR EL AUTOR: fechas en que se hicieron las entrevistas, medio (presencial, videollamada) y tabla anónima con el perfil de los quince entrevistados (edad, actividad, años como autónomo). A continuación figura una propuesta de guion que debe ajustarse a las preguntas que se plantearon realmente.</w:t>
+        <w:t>mes y año</w:t>
+      </w:r>
+      <w:r>
+        <w:rPr/>
+        <w:t xml:space="preserve"> y </w:t>
+      </w:r>
+      <w:r>
+        <w:rPr>
+          <w:highlight w:val="yellow"/>
+        </w:rPr>
+        <w:t>mes y año</w:t>
+      </w:r>
+      <w:r>
+        <w:rPr/>
+        <w:t xml:space="preserve">, por </w:t>
+      </w:r>
+      <w:r>
+        <w:rPr>
+          <w:highlight w:val="yellow"/>
+        </w:rPr>
+        <w:t>videollamada / en persona</w:t>
+      </w:r>
+      <w:r>
+        <w:rPr/>
+        <w:t xml:space="preserve">, con una duración aproximada de </w:t>
+      </w:r>
+      <w:r>
+        <w:rPr>
+          <w:highlight w:val="yellow"/>
+        </w:rPr>
+        <w:t>XX</w:t>
+      </w:r>
+      <w:r>
+        <w:rPr/>
+        <w:t xml:space="preserve"> minutos. Se garantizó el anonimato de los participantes, que se identifican con un número.</w:t>
+      </w:r>
+    </w:p>
+    <w:p>
+      <w:pPr>
+        <w:pStyle w:val="Normal"/>
+        <w:jc w:val="both"/>
+        <w:rPr/>
+      </w:pPr>
+      <w:r>
+        <w:rPr>
+          <w:b/>
+          <w:bCs/>
+        </w:rPr>
+        <w:t>Guion.</w:t>
+      </w:r>
+      <w:r>
+        <w:rPr/>
+        <w:t xml:space="preserve"> Las preguntas siguieron este orden, aunque se adaptaron a cada conversación:</w:t>
       </w:r>
     </w:p>
     <w:p>
@@ -25965,13 +26039,3927 @@
           <w:ilvl w:val="0"/>
           <w:numId w:val="1"/>
         </w:numPr>
+        <w:jc w:val="both"/>
+        <w:rPr/>
+      </w:pPr>
+      <w:r>
+        <w:rPr/>
+        <w:t>¿Pagarías por un servicio que te ayudara a entender y organizar tu dinero? ¿Cuánto te parecería razonable?</w:t>
+      </w:r>
+    </w:p>
+    <w:p>
+      <w:pPr>
+        <w:pStyle w:val="Normal"/>
+        <w:keepNext w:val="true"/>
+        <w:spacing w:lineRule="auto" w:line="240" w:before="120" w:after="60"/>
+        <w:jc w:val="left"/>
+        <w:rPr/>
+      </w:pPr>
+      <w:r>
+        <w:rPr>
+          <w:b/>
+          <w:bCs/>
+          <w:sz w:val="22"/>
+          <w:szCs w:val="22"/>
+        </w:rPr>
+        <w:t xml:space="preserve">Tabla III.1: </w:t>
+      </w:r>
+      <w:r>
+        <w:rPr>
+          <w:sz w:val="22"/>
+          <w:szCs w:val="22"/>
+        </w:rPr>
+        <w:t>Perfil de los entrevistados y respuestas principales</w:t>
+      </w:r>
+    </w:p>
+    <w:tbl>
+      <w:tblPr>
+        <w:tblW w:w="9070" w:type="dxa"/>
+        <w:jc w:val="left"/>
+        <w:tblInd w:w="0" w:type="dxa"/>
+        <w:tblLayout w:type="fixed"/>
+        <w:tblCellMar>
+          <w:top w:w="40" w:type="dxa"/>
+          <w:left w:w="80" w:type="dxa"/>
+          <w:bottom w:w="40" w:type="dxa"/>
+          <w:right w:w="80" w:type="dxa"/>
+        </w:tblCellMar>
+      </w:tblPr>
+      <w:tblGrid>
+        <w:gridCol w:w="600"/>
+        <w:gridCol w:w="800"/>
+        <w:gridCol w:w="2269"/>
+        <w:gridCol w:w="1301"/>
+        <w:gridCol w:w="1499"/>
+        <w:gridCol w:w="1301"/>
+        <w:gridCol w:w="1299"/>
+      </w:tblGrid>
+      <w:tr>
+        <w:trPr>
+          <w:tblHeader w:val="true"/>
+        </w:trPr>
+        <w:tc>
+          <w:tcPr>
+            <w:tcW w:w="600" w:type="dxa"/>
+            <w:tcBorders>
+              <w:top w:val="single" w:sz="4" w:space="0" w:color="8C8C8C"/>
+              <w:left w:val="single" w:sz="4" w:space="0" w:color="8C8C8C"/>
+              <w:bottom w:val="single" w:sz="4" w:space="0" w:color="8C8C8C"/>
+              <w:right w:val="single" w:sz="4" w:space="0" w:color="8C8C8C"/>
+            </w:tcBorders>
+            <w:shd w:color="auto" w:fill="DCE6F2" w:val="clear"/>
+            <w:vAlign w:val="center"/>
+          </w:tcPr>
+          <w:p>
+            <w:pPr>
+              <w:pStyle w:val="Normal"/>
+              <w:keepNext w:val="true"/>
+              <w:keepLines/>
+              <w:spacing w:lineRule="auto" w:line="240" w:before="0" w:after="0"/>
+              <w:jc w:val="left"/>
+              <w:rPr/>
+            </w:pPr>
+            <w:r>
+              <w:rPr>
+                <w:rFonts w:eastAsia="Times New Roman" w:cs="Times New Roman"/>
+                <w:b/>
+                <w:bCs/>
+                <w:sz w:val="20"/>
+                <w:szCs w:val="20"/>
+              </w:rPr>
+              <w:t>Nº</w:t>
+            </w:r>
+          </w:p>
+        </w:tc>
+        <w:tc>
+          <w:tcPr>
+            <w:tcW w:w="800" w:type="dxa"/>
+            <w:tcBorders>
+              <w:top w:val="single" w:sz="4" w:space="0" w:color="8C8C8C"/>
+              <w:left w:val="single" w:sz="4" w:space="0" w:color="8C8C8C"/>
+              <w:bottom w:val="single" w:sz="4" w:space="0" w:color="8C8C8C"/>
+              <w:right w:val="single" w:sz="4" w:space="0" w:color="8C8C8C"/>
+            </w:tcBorders>
+            <w:shd w:color="auto" w:fill="DCE6F2" w:val="clear"/>
+            <w:vAlign w:val="center"/>
+          </w:tcPr>
+          <w:p>
+            <w:pPr>
+              <w:pStyle w:val="Normal"/>
+              <w:keepNext w:val="true"/>
+              <w:keepLines/>
+              <w:spacing w:lineRule="auto" w:line="240" w:before="0" w:after="0"/>
+              <w:jc w:val="left"/>
+              <w:rPr/>
+            </w:pPr>
+            <w:r>
+              <w:rPr>
+                <w:rFonts w:eastAsia="Times New Roman" w:cs="Times New Roman"/>
+                <w:b/>
+                <w:bCs/>
+                <w:sz w:val="20"/>
+                <w:szCs w:val="20"/>
+              </w:rPr>
+              <w:t>Edad</w:t>
+            </w:r>
+          </w:p>
+        </w:tc>
+        <w:tc>
+          <w:tcPr>
+            <w:tcW w:w="2269" w:type="dxa"/>
+            <w:tcBorders>
+              <w:top w:val="single" w:sz="4" w:space="0" w:color="8C8C8C"/>
+              <w:left w:val="single" w:sz="4" w:space="0" w:color="8C8C8C"/>
+              <w:bottom w:val="single" w:sz="4" w:space="0" w:color="8C8C8C"/>
+              <w:right w:val="single" w:sz="4" w:space="0" w:color="8C8C8C"/>
+            </w:tcBorders>
+            <w:shd w:color="auto" w:fill="DCE6F2" w:val="clear"/>
+            <w:vAlign w:val="center"/>
+          </w:tcPr>
+          <w:p>
+            <w:pPr>
+              <w:pStyle w:val="Normal"/>
+              <w:keepNext w:val="true"/>
+              <w:keepLines/>
+              <w:spacing w:lineRule="auto" w:line="240" w:before="0" w:after="0"/>
+              <w:jc w:val="left"/>
+              <w:rPr/>
+            </w:pPr>
+            <w:r>
+              <w:rPr>
+                <w:rFonts w:eastAsia="Times New Roman" w:cs="Times New Roman"/>
+                <w:b/>
+                <w:bCs/>
+                <w:sz w:val="20"/>
+                <w:szCs w:val="20"/>
+              </w:rPr>
+              <w:t>Actividad</w:t>
+            </w:r>
+          </w:p>
+        </w:tc>
+        <w:tc>
+          <w:tcPr>
+            <w:tcW w:w="1301" w:type="dxa"/>
+            <w:tcBorders>
+              <w:top w:val="single" w:sz="4" w:space="0" w:color="8C8C8C"/>
+              <w:left w:val="single" w:sz="4" w:space="0" w:color="8C8C8C"/>
+              <w:bottom w:val="single" w:sz="4" w:space="0" w:color="8C8C8C"/>
+              <w:right w:val="single" w:sz="4" w:space="0" w:color="8C8C8C"/>
+            </w:tcBorders>
+            <w:shd w:color="auto" w:fill="DCE6F2" w:val="clear"/>
+            <w:vAlign w:val="center"/>
+          </w:tcPr>
+          <w:p>
+            <w:pPr>
+              <w:pStyle w:val="Normal"/>
+              <w:keepNext w:val="true"/>
+              <w:keepLines/>
+              <w:spacing w:lineRule="auto" w:line="240" w:before="0" w:after="0"/>
+              <w:jc w:val="left"/>
+              <w:rPr/>
+            </w:pPr>
+            <w:r>
+              <w:rPr>
+                <w:rFonts w:eastAsia="Times New Roman" w:cs="Times New Roman"/>
+                <w:b/>
+                <w:bCs/>
+                <w:sz w:val="20"/>
+                <w:szCs w:val="20"/>
+              </w:rPr>
+              <w:t>Años como autónomo</w:t>
+            </w:r>
+          </w:p>
+        </w:tc>
+        <w:tc>
+          <w:tcPr>
+            <w:tcW w:w="1499" w:type="dxa"/>
+            <w:tcBorders>
+              <w:top w:val="single" w:sz="4" w:space="0" w:color="8C8C8C"/>
+              <w:left w:val="single" w:sz="4" w:space="0" w:color="8C8C8C"/>
+              <w:bottom w:val="single" w:sz="4" w:space="0" w:color="8C8C8C"/>
+              <w:right w:val="single" w:sz="4" w:space="0" w:color="8C8C8C"/>
+            </w:tcBorders>
+            <w:shd w:color="auto" w:fill="DCE6F2" w:val="clear"/>
+            <w:vAlign w:val="center"/>
+          </w:tcPr>
+          <w:p>
+            <w:pPr>
+              <w:pStyle w:val="Normal"/>
+              <w:keepNext w:val="true"/>
+              <w:keepLines/>
+              <w:spacing w:lineRule="auto" w:line="240" w:before="0" w:after="0"/>
+              <w:jc w:val="left"/>
+              <w:rPr/>
+            </w:pPr>
+            <w:r>
+              <w:rPr>
+                <w:rFonts w:eastAsia="Times New Roman" w:cs="Times New Roman"/>
+                <w:b/>
+                <w:bCs/>
+                <w:sz w:val="20"/>
+                <w:szCs w:val="20"/>
+              </w:rPr>
+              <w:t>¿Sabe cuánto gana neto?</w:t>
+            </w:r>
+          </w:p>
+        </w:tc>
+        <w:tc>
+          <w:tcPr>
+            <w:tcW w:w="1301" w:type="dxa"/>
+            <w:tcBorders>
+              <w:top w:val="single" w:sz="4" w:space="0" w:color="8C8C8C"/>
+              <w:left w:val="single" w:sz="4" w:space="0" w:color="8C8C8C"/>
+              <w:bottom w:val="single" w:sz="4" w:space="0" w:color="8C8C8C"/>
+              <w:right w:val="single" w:sz="4" w:space="0" w:color="8C8C8C"/>
+            </w:tcBorders>
+            <w:shd w:color="auto" w:fill="DCE6F2" w:val="clear"/>
+            <w:vAlign w:val="center"/>
+          </w:tcPr>
+          <w:p>
+            <w:pPr>
+              <w:pStyle w:val="Normal"/>
+              <w:keepNext w:val="true"/>
+              <w:keepLines/>
+              <w:spacing w:lineRule="auto" w:line="240" w:before="0" w:after="0"/>
+              <w:jc w:val="left"/>
+              <w:rPr/>
+            </w:pPr>
+            <w:r>
+              <w:rPr>
+                <w:rFonts w:eastAsia="Times New Roman" w:cs="Times New Roman"/>
+                <w:b/>
+                <w:bCs/>
+                <w:sz w:val="20"/>
+                <w:szCs w:val="20"/>
+              </w:rPr>
+              <w:t>¿Separa cuentas?</w:t>
+            </w:r>
+          </w:p>
+        </w:tc>
+        <w:tc>
+          <w:tcPr>
+            <w:tcW w:w="1299" w:type="dxa"/>
+            <w:tcBorders>
+              <w:top w:val="single" w:sz="4" w:space="0" w:color="8C8C8C"/>
+              <w:left w:val="single" w:sz="4" w:space="0" w:color="8C8C8C"/>
+              <w:bottom w:val="single" w:sz="4" w:space="0" w:color="8C8C8C"/>
+              <w:right w:val="single" w:sz="4" w:space="0" w:color="8C8C8C"/>
+            </w:tcBorders>
+            <w:shd w:color="auto" w:fill="DCE6F2" w:val="clear"/>
+            <w:vAlign w:val="center"/>
+          </w:tcPr>
+          <w:p>
+            <w:pPr>
+              <w:pStyle w:val="Normal"/>
+              <w:keepNext w:val="true"/>
+              <w:keepLines/>
+              <w:spacing w:lineRule="auto" w:line="240" w:before="0" w:after="0"/>
+              <w:jc w:val="left"/>
+              <w:rPr/>
+            </w:pPr>
+            <w:r>
+              <w:rPr>
+                <w:rFonts w:eastAsia="Times New Roman" w:cs="Times New Roman"/>
+                <w:b/>
+                <w:bCs/>
+                <w:sz w:val="20"/>
+                <w:szCs w:val="20"/>
+              </w:rPr>
+              <w:t>¿Gestoría?</w:t>
+            </w:r>
+          </w:p>
+        </w:tc>
+      </w:tr>
+      <w:tr>
+        <w:trPr>
+          <w:cantSplit w:val="true"/>
+        </w:trPr>
+        <w:tc>
+          <w:tcPr>
+            <w:tcW w:w="600" w:type="dxa"/>
+            <w:tcBorders>
+              <w:top w:val="single" w:sz="4" w:space="0" w:color="8C8C8C"/>
+              <w:left w:val="single" w:sz="4" w:space="0" w:color="8C8C8C"/>
+              <w:bottom w:val="single" w:sz="4" w:space="0" w:color="8C8C8C"/>
+              <w:right w:val="single" w:sz="4" w:space="0" w:color="8C8C8C"/>
+            </w:tcBorders>
+            <w:vAlign w:val="center"/>
+          </w:tcPr>
+          <w:p>
+            <w:pPr>
+              <w:pStyle w:val="Normal"/>
+              <w:keepNext w:val="true"/>
+              <w:keepLines/>
+              <w:spacing w:lineRule="auto" w:line="240" w:before="0" w:after="0"/>
+              <w:jc w:val="left"/>
+              <w:rPr/>
+            </w:pPr>
+            <w:r>
+              <w:rPr>
+                <w:rFonts w:eastAsia="Times New Roman" w:cs="Times New Roman"/>
+                <w:b w:val="false"/>
+                <w:bCs w:val="false"/>
+                <w:sz w:val="20"/>
+                <w:szCs w:val="20"/>
+              </w:rPr>
+              <w:t>1</w:t>
+            </w:r>
+          </w:p>
+        </w:tc>
+        <w:tc>
+          <w:tcPr>
+            <w:tcW w:w="800" w:type="dxa"/>
+            <w:tcBorders>
+              <w:top w:val="single" w:sz="4" w:space="0" w:color="8C8C8C"/>
+              <w:left w:val="single" w:sz="4" w:space="0" w:color="8C8C8C"/>
+              <w:bottom w:val="single" w:sz="4" w:space="0" w:color="8C8C8C"/>
+              <w:right w:val="single" w:sz="4" w:space="0" w:color="8C8C8C"/>
+            </w:tcBorders>
+            <w:vAlign w:val="center"/>
+          </w:tcPr>
+          <w:p>
+            <w:pPr>
+              <w:pStyle w:val="Normal"/>
+              <w:keepNext w:val="true"/>
+              <w:keepLines/>
+              <w:spacing w:lineRule="auto" w:line="240" w:before="0" w:after="0"/>
+              <w:jc w:val="left"/>
+              <w:rPr/>
+            </w:pPr>
+            <w:r>
+              <w:rPr>
+                <w:rFonts w:eastAsia="Times New Roman" w:cs="Times New Roman"/>
+                <w:b w:val="false"/>
+                <w:bCs w:val="false"/>
+                <w:sz w:val="20"/>
+                <w:szCs w:val="20"/>
+                <w:highlight w:val="yellow"/>
+              </w:rPr>
+              <w:t xml:space="preserve"> </w:t>
+            </w:r>
+          </w:p>
+        </w:tc>
+        <w:tc>
+          <w:tcPr>
+            <w:tcW w:w="2269" w:type="dxa"/>
+            <w:tcBorders>
+              <w:top w:val="single" w:sz="4" w:space="0" w:color="8C8C8C"/>
+              <w:left w:val="single" w:sz="4" w:space="0" w:color="8C8C8C"/>
+              <w:bottom w:val="single" w:sz="4" w:space="0" w:color="8C8C8C"/>
+              <w:right w:val="single" w:sz="4" w:space="0" w:color="8C8C8C"/>
+            </w:tcBorders>
+            <w:vAlign w:val="center"/>
+          </w:tcPr>
+          <w:p>
+            <w:pPr>
+              <w:pStyle w:val="Normal"/>
+              <w:keepNext w:val="true"/>
+              <w:keepLines/>
+              <w:spacing w:lineRule="auto" w:line="240" w:before="0" w:after="0"/>
+              <w:jc w:val="left"/>
+              <w:rPr/>
+            </w:pPr>
+            <w:r>
+              <w:rPr>
+                <w:rFonts w:eastAsia="Times New Roman" w:cs="Times New Roman"/>
+                <w:b w:val="false"/>
+                <w:bCs w:val="false"/>
+                <w:sz w:val="20"/>
+                <w:szCs w:val="20"/>
+                <w:highlight w:val="yellow"/>
+              </w:rPr>
+              <w:t xml:space="preserve"> </w:t>
+            </w:r>
+          </w:p>
+        </w:tc>
+        <w:tc>
+          <w:tcPr>
+            <w:tcW w:w="1301" w:type="dxa"/>
+            <w:tcBorders>
+              <w:top w:val="single" w:sz="4" w:space="0" w:color="8C8C8C"/>
+              <w:left w:val="single" w:sz="4" w:space="0" w:color="8C8C8C"/>
+              <w:bottom w:val="single" w:sz="4" w:space="0" w:color="8C8C8C"/>
+              <w:right w:val="single" w:sz="4" w:space="0" w:color="8C8C8C"/>
+            </w:tcBorders>
+            <w:vAlign w:val="center"/>
+          </w:tcPr>
+          <w:p>
+            <w:pPr>
+              <w:pStyle w:val="Normal"/>
+              <w:keepNext w:val="true"/>
+              <w:keepLines/>
+              <w:spacing w:lineRule="auto" w:line="240" w:before="0" w:after="0"/>
+              <w:jc w:val="left"/>
+              <w:rPr/>
+            </w:pPr>
+            <w:r>
+              <w:rPr>
+                <w:rFonts w:eastAsia="Times New Roman" w:cs="Times New Roman"/>
+                <w:b w:val="false"/>
+                <w:bCs w:val="false"/>
+                <w:sz w:val="20"/>
+                <w:szCs w:val="20"/>
+                <w:highlight w:val="yellow"/>
+              </w:rPr>
+              <w:t xml:space="preserve"> </w:t>
+            </w:r>
+          </w:p>
+        </w:tc>
+        <w:tc>
+          <w:tcPr>
+            <w:tcW w:w="1499" w:type="dxa"/>
+            <w:tcBorders>
+              <w:top w:val="single" w:sz="4" w:space="0" w:color="8C8C8C"/>
+              <w:left w:val="single" w:sz="4" w:space="0" w:color="8C8C8C"/>
+              <w:bottom w:val="single" w:sz="4" w:space="0" w:color="8C8C8C"/>
+              <w:right w:val="single" w:sz="4" w:space="0" w:color="8C8C8C"/>
+            </w:tcBorders>
+            <w:vAlign w:val="center"/>
+          </w:tcPr>
+          <w:p>
+            <w:pPr>
+              <w:pStyle w:val="Normal"/>
+              <w:keepNext w:val="true"/>
+              <w:keepLines/>
+              <w:spacing w:lineRule="auto" w:line="240" w:before="0" w:after="0"/>
+              <w:jc w:val="left"/>
+              <w:rPr/>
+            </w:pPr>
+            <w:r>
+              <w:rPr>
+                <w:rFonts w:eastAsia="Times New Roman" w:cs="Times New Roman"/>
+                <w:b w:val="false"/>
+                <w:bCs w:val="false"/>
+                <w:sz w:val="20"/>
+                <w:szCs w:val="20"/>
+                <w:highlight w:val="yellow"/>
+              </w:rPr>
+              <w:t xml:space="preserve"> </w:t>
+            </w:r>
+          </w:p>
+        </w:tc>
+        <w:tc>
+          <w:tcPr>
+            <w:tcW w:w="1301" w:type="dxa"/>
+            <w:tcBorders>
+              <w:top w:val="single" w:sz="4" w:space="0" w:color="8C8C8C"/>
+              <w:left w:val="single" w:sz="4" w:space="0" w:color="8C8C8C"/>
+              <w:bottom w:val="single" w:sz="4" w:space="0" w:color="8C8C8C"/>
+              <w:right w:val="single" w:sz="4" w:space="0" w:color="8C8C8C"/>
+            </w:tcBorders>
+            <w:vAlign w:val="center"/>
+          </w:tcPr>
+          <w:p>
+            <w:pPr>
+              <w:pStyle w:val="Normal"/>
+              <w:keepNext w:val="true"/>
+              <w:keepLines/>
+              <w:spacing w:lineRule="auto" w:line="240" w:before="0" w:after="0"/>
+              <w:jc w:val="left"/>
+              <w:rPr/>
+            </w:pPr>
+            <w:r>
+              <w:rPr>
+                <w:rFonts w:eastAsia="Times New Roman" w:cs="Times New Roman"/>
+                <w:b w:val="false"/>
+                <w:bCs w:val="false"/>
+                <w:sz w:val="20"/>
+                <w:szCs w:val="20"/>
+                <w:highlight w:val="yellow"/>
+              </w:rPr>
+              <w:t xml:space="preserve"> </w:t>
+            </w:r>
+          </w:p>
+        </w:tc>
+        <w:tc>
+          <w:tcPr>
+            <w:tcW w:w="1299" w:type="dxa"/>
+            <w:tcBorders>
+              <w:top w:val="single" w:sz="4" w:space="0" w:color="8C8C8C"/>
+              <w:left w:val="single" w:sz="4" w:space="0" w:color="8C8C8C"/>
+              <w:bottom w:val="single" w:sz="4" w:space="0" w:color="8C8C8C"/>
+              <w:right w:val="single" w:sz="4" w:space="0" w:color="8C8C8C"/>
+            </w:tcBorders>
+            <w:vAlign w:val="center"/>
+          </w:tcPr>
+          <w:p>
+            <w:pPr>
+              <w:pStyle w:val="Normal"/>
+              <w:keepNext w:val="true"/>
+              <w:keepLines/>
+              <w:spacing w:lineRule="auto" w:line="240" w:before="0" w:after="0"/>
+              <w:jc w:val="left"/>
+              <w:rPr/>
+            </w:pPr>
+            <w:r>
+              <w:rPr>
+                <w:rFonts w:eastAsia="Times New Roman" w:cs="Times New Roman"/>
+                <w:b w:val="false"/>
+                <w:bCs w:val="false"/>
+                <w:sz w:val="20"/>
+                <w:szCs w:val="20"/>
+                <w:highlight w:val="yellow"/>
+              </w:rPr>
+              <w:t xml:space="preserve"> </w:t>
+            </w:r>
+          </w:p>
+        </w:tc>
+      </w:tr>
+      <w:tr>
+        <w:trPr>
+          <w:cantSplit w:val="true"/>
+        </w:trPr>
+        <w:tc>
+          <w:tcPr>
+            <w:tcW w:w="600" w:type="dxa"/>
+            <w:tcBorders>
+              <w:top w:val="single" w:sz="4" w:space="0" w:color="8C8C8C"/>
+              <w:left w:val="single" w:sz="4" w:space="0" w:color="8C8C8C"/>
+              <w:bottom w:val="single" w:sz="4" w:space="0" w:color="8C8C8C"/>
+              <w:right w:val="single" w:sz="4" w:space="0" w:color="8C8C8C"/>
+            </w:tcBorders>
+            <w:vAlign w:val="center"/>
+          </w:tcPr>
+          <w:p>
+            <w:pPr>
+              <w:pStyle w:val="Normal"/>
+              <w:keepNext w:val="true"/>
+              <w:keepLines/>
+              <w:spacing w:lineRule="auto" w:line="240" w:before="0" w:after="0"/>
+              <w:jc w:val="left"/>
+              <w:rPr/>
+            </w:pPr>
+            <w:r>
+              <w:rPr>
+                <w:rFonts w:eastAsia="Times New Roman" w:cs="Times New Roman"/>
+                <w:b w:val="false"/>
+                <w:bCs w:val="false"/>
+                <w:sz w:val="20"/>
+                <w:szCs w:val="20"/>
+              </w:rPr>
+              <w:t>2</w:t>
+            </w:r>
+          </w:p>
+        </w:tc>
+        <w:tc>
+          <w:tcPr>
+            <w:tcW w:w="800" w:type="dxa"/>
+            <w:tcBorders>
+              <w:top w:val="single" w:sz="4" w:space="0" w:color="8C8C8C"/>
+              <w:left w:val="single" w:sz="4" w:space="0" w:color="8C8C8C"/>
+              <w:bottom w:val="single" w:sz="4" w:space="0" w:color="8C8C8C"/>
+              <w:right w:val="single" w:sz="4" w:space="0" w:color="8C8C8C"/>
+            </w:tcBorders>
+            <w:vAlign w:val="center"/>
+          </w:tcPr>
+          <w:p>
+            <w:pPr>
+              <w:pStyle w:val="Normal"/>
+              <w:keepNext w:val="true"/>
+              <w:keepLines/>
+              <w:spacing w:lineRule="auto" w:line="240" w:before="0" w:after="0"/>
+              <w:jc w:val="left"/>
+              <w:rPr/>
+            </w:pPr>
+            <w:r>
+              <w:rPr>
+                <w:rFonts w:eastAsia="Times New Roman" w:cs="Times New Roman"/>
+                <w:b w:val="false"/>
+                <w:bCs w:val="false"/>
+                <w:sz w:val="20"/>
+                <w:szCs w:val="20"/>
+                <w:highlight w:val="yellow"/>
+              </w:rPr>
+              <w:t xml:space="preserve"> </w:t>
+            </w:r>
+          </w:p>
+        </w:tc>
+        <w:tc>
+          <w:tcPr>
+            <w:tcW w:w="2269" w:type="dxa"/>
+            <w:tcBorders>
+              <w:top w:val="single" w:sz="4" w:space="0" w:color="8C8C8C"/>
+              <w:left w:val="single" w:sz="4" w:space="0" w:color="8C8C8C"/>
+              <w:bottom w:val="single" w:sz="4" w:space="0" w:color="8C8C8C"/>
+              <w:right w:val="single" w:sz="4" w:space="0" w:color="8C8C8C"/>
+            </w:tcBorders>
+            <w:vAlign w:val="center"/>
+          </w:tcPr>
+          <w:p>
+            <w:pPr>
+              <w:pStyle w:val="Normal"/>
+              <w:keepNext w:val="true"/>
+              <w:keepLines/>
+              <w:spacing w:lineRule="auto" w:line="240" w:before="0" w:after="0"/>
+              <w:jc w:val="left"/>
+              <w:rPr/>
+            </w:pPr>
+            <w:r>
+              <w:rPr>
+                <w:rFonts w:eastAsia="Times New Roman" w:cs="Times New Roman"/>
+                <w:b w:val="false"/>
+                <w:bCs w:val="false"/>
+                <w:sz w:val="20"/>
+                <w:szCs w:val="20"/>
+                <w:highlight w:val="yellow"/>
+              </w:rPr>
+              <w:t xml:space="preserve"> </w:t>
+            </w:r>
+          </w:p>
+        </w:tc>
+        <w:tc>
+          <w:tcPr>
+            <w:tcW w:w="1301" w:type="dxa"/>
+            <w:tcBorders>
+              <w:top w:val="single" w:sz="4" w:space="0" w:color="8C8C8C"/>
+              <w:left w:val="single" w:sz="4" w:space="0" w:color="8C8C8C"/>
+              <w:bottom w:val="single" w:sz="4" w:space="0" w:color="8C8C8C"/>
+              <w:right w:val="single" w:sz="4" w:space="0" w:color="8C8C8C"/>
+            </w:tcBorders>
+            <w:vAlign w:val="center"/>
+          </w:tcPr>
+          <w:p>
+            <w:pPr>
+              <w:pStyle w:val="Normal"/>
+              <w:keepNext w:val="true"/>
+              <w:keepLines/>
+              <w:spacing w:lineRule="auto" w:line="240" w:before="0" w:after="0"/>
+              <w:jc w:val="left"/>
+              <w:rPr/>
+            </w:pPr>
+            <w:r>
+              <w:rPr>
+                <w:rFonts w:eastAsia="Times New Roman" w:cs="Times New Roman"/>
+                <w:b w:val="false"/>
+                <w:bCs w:val="false"/>
+                <w:sz w:val="20"/>
+                <w:szCs w:val="20"/>
+                <w:highlight w:val="yellow"/>
+              </w:rPr>
+              <w:t xml:space="preserve"> </w:t>
+            </w:r>
+          </w:p>
+        </w:tc>
+        <w:tc>
+          <w:tcPr>
+            <w:tcW w:w="1499" w:type="dxa"/>
+            <w:tcBorders>
+              <w:top w:val="single" w:sz="4" w:space="0" w:color="8C8C8C"/>
+              <w:left w:val="single" w:sz="4" w:space="0" w:color="8C8C8C"/>
+              <w:bottom w:val="single" w:sz="4" w:space="0" w:color="8C8C8C"/>
+              <w:right w:val="single" w:sz="4" w:space="0" w:color="8C8C8C"/>
+            </w:tcBorders>
+            <w:vAlign w:val="center"/>
+          </w:tcPr>
+          <w:p>
+            <w:pPr>
+              <w:pStyle w:val="Normal"/>
+              <w:keepNext w:val="true"/>
+              <w:keepLines/>
+              <w:spacing w:lineRule="auto" w:line="240" w:before="0" w:after="0"/>
+              <w:jc w:val="left"/>
+              <w:rPr/>
+            </w:pPr>
+            <w:r>
+              <w:rPr>
+                <w:rFonts w:eastAsia="Times New Roman" w:cs="Times New Roman"/>
+                <w:b w:val="false"/>
+                <w:bCs w:val="false"/>
+                <w:sz w:val="20"/>
+                <w:szCs w:val="20"/>
+                <w:highlight w:val="yellow"/>
+              </w:rPr>
+              <w:t xml:space="preserve"> </w:t>
+            </w:r>
+          </w:p>
+        </w:tc>
+        <w:tc>
+          <w:tcPr>
+            <w:tcW w:w="1301" w:type="dxa"/>
+            <w:tcBorders>
+              <w:top w:val="single" w:sz="4" w:space="0" w:color="8C8C8C"/>
+              <w:left w:val="single" w:sz="4" w:space="0" w:color="8C8C8C"/>
+              <w:bottom w:val="single" w:sz="4" w:space="0" w:color="8C8C8C"/>
+              <w:right w:val="single" w:sz="4" w:space="0" w:color="8C8C8C"/>
+            </w:tcBorders>
+            <w:vAlign w:val="center"/>
+          </w:tcPr>
+          <w:p>
+            <w:pPr>
+              <w:pStyle w:val="Normal"/>
+              <w:keepNext w:val="true"/>
+              <w:keepLines/>
+              <w:spacing w:lineRule="auto" w:line="240" w:before="0" w:after="0"/>
+              <w:jc w:val="left"/>
+              <w:rPr/>
+            </w:pPr>
+            <w:r>
+              <w:rPr>
+                <w:rFonts w:eastAsia="Times New Roman" w:cs="Times New Roman"/>
+                <w:b w:val="false"/>
+                <w:bCs w:val="false"/>
+                <w:sz w:val="20"/>
+                <w:szCs w:val="20"/>
+                <w:highlight w:val="yellow"/>
+              </w:rPr>
+              <w:t xml:space="preserve"> </w:t>
+            </w:r>
+          </w:p>
+        </w:tc>
+        <w:tc>
+          <w:tcPr>
+            <w:tcW w:w="1299" w:type="dxa"/>
+            <w:tcBorders>
+              <w:top w:val="single" w:sz="4" w:space="0" w:color="8C8C8C"/>
+              <w:left w:val="single" w:sz="4" w:space="0" w:color="8C8C8C"/>
+              <w:bottom w:val="single" w:sz="4" w:space="0" w:color="8C8C8C"/>
+              <w:right w:val="single" w:sz="4" w:space="0" w:color="8C8C8C"/>
+            </w:tcBorders>
+            <w:vAlign w:val="center"/>
+          </w:tcPr>
+          <w:p>
+            <w:pPr>
+              <w:pStyle w:val="Normal"/>
+              <w:keepNext w:val="true"/>
+              <w:keepLines/>
+              <w:spacing w:lineRule="auto" w:line="240" w:before="0" w:after="0"/>
+              <w:jc w:val="left"/>
+              <w:rPr/>
+            </w:pPr>
+            <w:r>
+              <w:rPr>
+                <w:rFonts w:eastAsia="Times New Roman" w:cs="Times New Roman"/>
+                <w:b w:val="false"/>
+                <w:bCs w:val="false"/>
+                <w:sz w:val="20"/>
+                <w:szCs w:val="20"/>
+                <w:highlight w:val="yellow"/>
+              </w:rPr>
+              <w:t xml:space="preserve"> </w:t>
+            </w:r>
+          </w:p>
+        </w:tc>
+      </w:tr>
+      <w:tr>
+        <w:trPr>
+          <w:cantSplit w:val="true"/>
+        </w:trPr>
+        <w:tc>
+          <w:tcPr>
+            <w:tcW w:w="600" w:type="dxa"/>
+            <w:tcBorders>
+              <w:top w:val="single" w:sz="4" w:space="0" w:color="8C8C8C"/>
+              <w:left w:val="single" w:sz="4" w:space="0" w:color="8C8C8C"/>
+              <w:bottom w:val="single" w:sz="4" w:space="0" w:color="8C8C8C"/>
+              <w:right w:val="single" w:sz="4" w:space="0" w:color="8C8C8C"/>
+            </w:tcBorders>
+            <w:vAlign w:val="center"/>
+          </w:tcPr>
+          <w:p>
+            <w:pPr>
+              <w:pStyle w:val="Normal"/>
+              <w:keepNext w:val="true"/>
+              <w:keepLines/>
+              <w:spacing w:lineRule="auto" w:line="240" w:before="0" w:after="0"/>
+              <w:jc w:val="left"/>
+              <w:rPr/>
+            </w:pPr>
+            <w:r>
+              <w:rPr>
+                <w:rFonts w:eastAsia="Times New Roman" w:cs="Times New Roman"/>
+                <w:b w:val="false"/>
+                <w:bCs w:val="false"/>
+                <w:sz w:val="20"/>
+                <w:szCs w:val="20"/>
+              </w:rPr>
+              <w:t>3</w:t>
+            </w:r>
+          </w:p>
+        </w:tc>
+        <w:tc>
+          <w:tcPr>
+            <w:tcW w:w="800" w:type="dxa"/>
+            <w:tcBorders>
+              <w:top w:val="single" w:sz="4" w:space="0" w:color="8C8C8C"/>
+              <w:left w:val="single" w:sz="4" w:space="0" w:color="8C8C8C"/>
+              <w:bottom w:val="single" w:sz="4" w:space="0" w:color="8C8C8C"/>
+              <w:right w:val="single" w:sz="4" w:space="0" w:color="8C8C8C"/>
+            </w:tcBorders>
+            <w:vAlign w:val="center"/>
+          </w:tcPr>
+          <w:p>
+            <w:pPr>
+              <w:pStyle w:val="Normal"/>
+              <w:keepNext w:val="true"/>
+              <w:keepLines/>
+              <w:spacing w:lineRule="auto" w:line="240" w:before="0" w:after="0"/>
+              <w:jc w:val="left"/>
+              <w:rPr/>
+            </w:pPr>
+            <w:r>
+              <w:rPr>
+                <w:rFonts w:eastAsia="Times New Roman" w:cs="Times New Roman"/>
+                <w:b w:val="false"/>
+                <w:bCs w:val="false"/>
+                <w:sz w:val="20"/>
+                <w:szCs w:val="20"/>
+                <w:highlight w:val="yellow"/>
+              </w:rPr>
+              <w:t xml:space="preserve"> </w:t>
+            </w:r>
+          </w:p>
+        </w:tc>
+        <w:tc>
+          <w:tcPr>
+            <w:tcW w:w="2269" w:type="dxa"/>
+            <w:tcBorders>
+              <w:top w:val="single" w:sz="4" w:space="0" w:color="8C8C8C"/>
+              <w:left w:val="single" w:sz="4" w:space="0" w:color="8C8C8C"/>
+              <w:bottom w:val="single" w:sz="4" w:space="0" w:color="8C8C8C"/>
+              <w:right w:val="single" w:sz="4" w:space="0" w:color="8C8C8C"/>
+            </w:tcBorders>
+            <w:vAlign w:val="center"/>
+          </w:tcPr>
+          <w:p>
+            <w:pPr>
+              <w:pStyle w:val="Normal"/>
+              <w:keepNext w:val="true"/>
+              <w:keepLines/>
+              <w:spacing w:lineRule="auto" w:line="240" w:before="0" w:after="0"/>
+              <w:jc w:val="left"/>
+              <w:rPr/>
+            </w:pPr>
+            <w:r>
+              <w:rPr>
+                <w:rFonts w:eastAsia="Times New Roman" w:cs="Times New Roman"/>
+                <w:b w:val="false"/>
+                <w:bCs w:val="false"/>
+                <w:sz w:val="20"/>
+                <w:szCs w:val="20"/>
+                <w:highlight w:val="yellow"/>
+              </w:rPr>
+              <w:t xml:space="preserve"> </w:t>
+            </w:r>
+          </w:p>
+        </w:tc>
+        <w:tc>
+          <w:tcPr>
+            <w:tcW w:w="1301" w:type="dxa"/>
+            <w:tcBorders>
+              <w:top w:val="single" w:sz="4" w:space="0" w:color="8C8C8C"/>
+              <w:left w:val="single" w:sz="4" w:space="0" w:color="8C8C8C"/>
+              <w:bottom w:val="single" w:sz="4" w:space="0" w:color="8C8C8C"/>
+              <w:right w:val="single" w:sz="4" w:space="0" w:color="8C8C8C"/>
+            </w:tcBorders>
+            <w:vAlign w:val="center"/>
+          </w:tcPr>
+          <w:p>
+            <w:pPr>
+              <w:pStyle w:val="Normal"/>
+              <w:keepNext w:val="true"/>
+              <w:keepLines/>
+              <w:spacing w:lineRule="auto" w:line="240" w:before="0" w:after="0"/>
+              <w:jc w:val="left"/>
+              <w:rPr/>
+            </w:pPr>
+            <w:r>
+              <w:rPr>
+                <w:rFonts w:eastAsia="Times New Roman" w:cs="Times New Roman"/>
+                <w:b w:val="false"/>
+                <w:bCs w:val="false"/>
+                <w:sz w:val="20"/>
+                <w:szCs w:val="20"/>
+                <w:highlight w:val="yellow"/>
+              </w:rPr>
+              <w:t xml:space="preserve"> </w:t>
+            </w:r>
+          </w:p>
+        </w:tc>
+        <w:tc>
+          <w:tcPr>
+            <w:tcW w:w="1499" w:type="dxa"/>
+            <w:tcBorders>
+              <w:top w:val="single" w:sz="4" w:space="0" w:color="8C8C8C"/>
+              <w:left w:val="single" w:sz="4" w:space="0" w:color="8C8C8C"/>
+              <w:bottom w:val="single" w:sz="4" w:space="0" w:color="8C8C8C"/>
+              <w:right w:val="single" w:sz="4" w:space="0" w:color="8C8C8C"/>
+            </w:tcBorders>
+            <w:vAlign w:val="center"/>
+          </w:tcPr>
+          <w:p>
+            <w:pPr>
+              <w:pStyle w:val="Normal"/>
+              <w:keepNext w:val="true"/>
+              <w:keepLines/>
+              <w:spacing w:lineRule="auto" w:line="240" w:before="0" w:after="0"/>
+              <w:jc w:val="left"/>
+              <w:rPr/>
+            </w:pPr>
+            <w:r>
+              <w:rPr>
+                <w:rFonts w:eastAsia="Times New Roman" w:cs="Times New Roman"/>
+                <w:b w:val="false"/>
+                <w:bCs w:val="false"/>
+                <w:sz w:val="20"/>
+                <w:szCs w:val="20"/>
+                <w:highlight w:val="yellow"/>
+              </w:rPr>
+              <w:t xml:space="preserve"> </w:t>
+            </w:r>
+          </w:p>
+        </w:tc>
+        <w:tc>
+          <w:tcPr>
+            <w:tcW w:w="1301" w:type="dxa"/>
+            <w:tcBorders>
+              <w:top w:val="single" w:sz="4" w:space="0" w:color="8C8C8C"/>
+              <w:left w:val="single" w:sz="4" w:space="0" w:color="8C8C8C"/>
+              <w:bottom w:val="single" w:sz="4" w:space="0" w:color="8C8C8C"/>
+              <w:right w:val="single" w:sz="4" w:space="0" w:color="8C8C8C"/>
+            </w:tcBorders>
+            <w:vAlign w:val="center"/>
+          </w:tcPr>
+          <w:p>
+            <w:pPr>
+              <w:pStyle w:val="Normal"/>
+              <w:keepNext w:val="true"/>
+              <w:keepLines/>
+              <w:spacing w:lineRule="auto" w:line="240" w:before="0" w:after="0"/>
+              <w:jc w:val="left"/>
+              <w:rPr/>
+            </w:pPr>
+            <w:r>
+              <w:rPr>
+                <w:rFonts w:eastAsia="Times New Roman" w:cs="Times New Roman"/>
+                <w:b w:val="false"/>
+                <w:bCs w:val="false"/>
+                <w:sz w:val="20"/>
+                <w:szCs w:val="20"/>
+                <w:highlight w:val="yellow"/>
+              </w:rPr>
+              <w:t xml:space="preserve"> </w:t>
+            </w:r>
+          </w:p>
+        </w:tc>
+        <w:tc>
+          <w:tcPr>
+            <w:tcW w:w="1299" w:type="dxa"/>
+            <w:tcBorders>
+              <w:top w:val="single" w:sz="4" w:space="0" w:color="8C8C8C"/>
+              <w:left w:val="single" w:sz="4" w:space="0" w:color="8C8C8C"/>
+              <w:bottom w:val="single" w:sz="4" w:space="0" w:color="8C8C8C"/>
+              <w:right w:val="single" w:sz="4" w:space="0" w:color="8C8C8C"/>
+            </w:tcBorders>
+            <w:vAlign w:val="center"/>
+          </w:tcPr>
+          <w:p>
+            <w:pPr>
+              <w:pStyle w:val="Normal"/>
+              <w:keepNext w:val="true"/>
+              <w:keepLines/>
+              <w:spacing w:lineRule="auto" w:line="240" w:before="0" w:after="0"/>
+              <w:jc w:val="left"/>
+              <w:rPr/>
+            </w:pPr>
+            <w:r>
+              <w:rPr>
+                <w:rFonts w:eastAsia="Times New Roman" w:cs="Times New Roman"/>
+                <w:b w:val="false"/>
+                <w:bCs w:val="false"/>
+                <w:sz w:val="20"/>
+                <w:szCs w:val="20"/>
+                <w:highlight w:val="yellow"/>
+              </w:rPr>
+              <w:t xml:space="preserve"> </w:t>
+            </w:r>
+          </w:p>
+        </w:tc>
+      </w:tr>
+      <w:tr>
+        <w:trPr>
+          <w:cantSplit w:val="true"/>
+        </w:trPr>
+        <w:tc>
+          <w:tcPr>
+            <w:tcW w:w="600" w:type="dxa"/>
+            <w:tcBorders>
+              <w:top w:val="single" w:sz="4" w:space="0" w:color="8C8C8C"/>
+              <w:left w:val="single" w:sz="4" w:space="0" w:color="8C8C8C"/>
+              <w:bottom w:val="single" w:sz="4" w:space="0" w:color="8C8C8C"/>
+              <w:right w:val="single" w:sz="4" w:space="0" w:color="8C8C8C"/>
+            </w:tcBorders>
+            <w:vAlign w:val="center"/>
+          </w:tcPr>
+          <w:p>
+            <w:pPr>
+              <w:pStyle w:val="Normal"/>
+              <w:keepNext w:val="true"/>
+              <w:keepLines/>
+              <w:spacing w:lineRule="auto" w:line="240" w:before="0" w:after="0"/>
+              <w:jc w:val="left"/>
+              <w:rPr/>
+            </w:pPr>
+            <w:r>
+              <w:rPr>
+                <w:rFonts w:eastAsia="Times New Roman" w:cs="Times New Roman"/>
+                <w:b w:val="false"/>
+                <w:bCs w:val="false"/>
+                <w:sz w:val="20"/>
+                <w:szCs w:val="20"/>
+              </w:rPr>
+              <w:t>4</w:t>
+            </w:r>
+          </w:p>
+        </w:tc>
+        <w:tc>
+          <w:tcPr>
+            <w:tcW w:w="800" w:type="dxa"/>
+            <w:tcBorders>
+              <w:top w:val="single" w:sz="4" w:space="0" w:color="8C8C8C"/>
+              <w:left w:val="single" w:sz="4" w:space="0" w:color="8C8C8C"/>
+              <w:bottom w:val="single" w:sz="4" w:space="0" w:color="8C8C8C"/>
+              <w:right w:val="single" w:sz="4" w:space="0" w:color="8C8C8C"/>
+            </w:tcBorders>
+            <w:vAlign w:val="center"/>
+          </w:tcPr>
+          <w:p>
+            <w:pPr>
+              <w:pStyle w:val="Normal"/>
+              <w:keepNext w:val="true"/>
+              <w:keepLines/>
+              <w:spacing w:lineRule="auto" w:line="240" w:before="0" w:after="0"/>
+              <w:jc w:val="left"/>
+              <w:rPr/>
+            </w:pPr>
+            <w:r>
+              <w:rPr>
+                <w:rFonts w:eastAsia="Times New Roman" w:cs="Times New Roman"/>
+                <w:b w:val="false"/>
+                <w:bCs w:val="false"/>
+                <w:sz w:val="20"/>
+                <w:szCs w:val="20"/>
+                <w:highlight w:val="yellow"/>
+              </w:rPr>
+              <w:t xml:space="preserve"> </w:t>
+            </w:r>
+          </w:p>
+        </w:tc>
+        <w:tc>
+          <w:tcPr>
+            <w:tcW w:w="2269" w:type="dxa"/>
+            <w:tcBorders>
+              <w:top w:val="single" w:sz="4" w:space="0" w:color="8C8C8C"/>
+              <w:left w:val="single" w:sz="4" w:space="0" w:color="8C8C8C"/>
+              <w:bottom w:val="single" w:sz="4" w:space="0" w:color="8C8C8C"/>
+              <w:right w:val="single" w:sz="4" w:space="0" w:color="8C8C8C"/>
+            </w:tcBorders>
+            <w:vAlign w:val="center"/>
+          </w:tcPr>
+          <w:p>
+            <w:pPr>
+              <w:pStyle w:val="Normal"/>
+              <w:keepNext w:val="true"/>
+              <w:keepLines/>
+              <w:spacing w:lineRule="auto" w:line="240" w:before="0" w:after="0"/>
+              <w:jc w:val="left"/>
+              <w:rPr/>
+            </w:pPr>
+            <w:r>
+              <w:rPr>
+                <w:rFonts w:eastAsia="Times New Roman" w:cs="Times New Roman"/>
+                <w:b w:val="false"/>
+                <w:bCs w:val="false"/>
+                <w:sz w:val="20"/>
+                <w:szCs w:val="20"/>
+                <w:highlight w:val="yellow"/>
+              </w:rPr>
+              <w:t xml:space="preserve"> </w:t>
+            </w:r>
+          </w:p>
+        </w:tc>
+        <w:tc>
+          <w:tcPr>
+            <w:tcW w:w="1301" w:type="dxa"/>
+            <w:tcBorders>
+              <w:top w:val="single" w:sz="4" w:space="0" w:color="8C8C8C"/>
+              <w:left w:val="single" w:sz="4" w:space="0" w:color="8C8C8C"/>
+              <w:bottom w:val="single" w:sz="4" w:space="0" w:color="8C8C8C"/>
+              <w:right w:val="single" w:sz="4" w:space="0" w:color="8C8C8C"/>
+            </w:tcBorders>
+            <w:vAlign w:val="center"/>
+          </w:tcPr>
+          <w:p>
+            <w:pPr>
+              <w:pStyle w:val="Normal"/>
+              <w:keepNext w:val="true"/>
+              <w:keepLines/>
+              <w:spacing w:lineRule="auto" w:line="240" w:before="0" w:after="0"/>
+              <w:jc w:val="left"/>
+              <w:rPr/>
+            </w:pPr>
+            <w:r>
+              <w:rPr>
+                <w:rFonts w:eastAsia="Times New Roman" w:cs="Times New Roman"/>
+                <w:b w:val="false"/>
+                <w:bCs w:val="false"/>
+                <w:sz w:val="20"/>
+                <w:szCs w:val="20"/>
+                <w:highlight w:val="yellow"/>
+              </w:rPr>
+              <w:t xml:space="preserve"> </w:t>
+            </w:r>
+          </w:p>
+        </w:tc>
+        <w:tc>
+          <w:tcPr>
+            <w:tcW w:w="1499" w:type="dxa"/>
+            <w:tcBorders>
+              <w:top w:val="single" w:sz="4" w:space="0" w:color="8C8C8C"/>
+              <w:left w:val="single" w:sz="4" w:space="0" w:color="8C8C8C"/>
+              <w:bottom w:val="single" w:sz="4" w:space="0" w:color="8C8C8C"/>
+              <w:right w:val="single" w:sz="4" w:space="0" w:color="8C8C8C"/>
+            </w:tcBorders>
+            <w:vAlign w:val="center"/>
+          </w:tcPr>
+          <w:p>
+            <w:pPr>
+              <w:pStyle w:val="Normal"/>
+              <w:keepNext w:val="true"/>
+              <w:keepLines/>
+              <w:spacing w:lineRule="auto" w:line="240" w:before="0" w:after="0"/>
+              <w:jc w:val="left"/>
+              <w:rPr/>
+            </w:pPr>
+            <w:r>
+              <w:rPr>
+                <w:rFonts w:eastAsia="Times New Roman" w:cs="Times New Roman"/>
+                <w:b w:val="false"/>
+                <w:bCs w:val="false"/>
+                <w:sz w:val="20"/>
+                <w:szCs w:val="20"/>
+                <w:highlight w:val="yellow"/>
+              </w:rPr>
+              <w:t xml:space="preserve"> </w:t>
+            </w:r>
+          </w:p>
+        </w:tc>
+        <w:tc>
+          <w:tcPr>
+            <w:tcW w:w="1301" w:type="dxa"/>
+            <w:tcBorders>
+              <w:top w:val="single" w:sz="4" w:space="0" w:color="8C8C8C"/>
+              <w:left w:val="single" w:sz="4" w:space="0" w:color="8C8C8C"/>
+              <w:bottom w:val="single" w:sz="4" w:space="0" w:color="8C8C8C"/>
+              <w:right w:val="single" w:sz="4" w:space="0" w:color="8C8C8C"/>
+            </w:tcBorders>
+            <w:vAlign w:val="center"/>
+          </w:tcPr>
+          <w:p>
+            <w:pPr>
+              <w:pStyle w:val="Normal"/>
+              <w:keepNext w:val="true"/>
+              <w:keepLines/>
+              <w:spacing w:lineRule="auto" w:line="240" w:before="0" w:after="0"/>
+              <w:jc w:val="left"/>
+              <w:rPr/>
+            </w:pPr>
+            <w:r>
+              <w:rPr>
+                <w:rFonts w:eastAsia="Times New Roman" w:cs="Times New Roman"/>
+                <w:b w:val="false"/>
+                <w:bCs w:val="false"/>
+                <w:sz w:val="20"/>
+                <w:szCs w:val="20"/>
+                <w:highlight w:val="yellow"/>
+              </w:rPr>
+              <w:t xml:space="preserve"> </w:t>
+            </w:r>
+          </w:p>
+        </w:tc>
+        <w:tc>
+          <w:tcPr>
+            <w:tcW w:w="1299" w:type="dxa"/>
+            <w:tcBorders>
+              <w:top w:val="single" w:sz="4" w:space="0" w:color="8C8C8C"/>
+              <w:left w:val="single" w:sz="4" w:space="0" w:color="8C8C8C"/>
+              <w:bottom w:val="single" w:sz="4" w:space="0" w:color="8C8C8C"/>
+              <w:right w:val="single" w:sz="4" w:space="0" w:color="8C8C8C"/>
+            </w:tcBorders>
+            <w:vAlign w:val="center"/>
+          </w:tcPr>
+          <w:p>
+            <w:pPr>
+              <w:pStyle w:val="Normal"/>
+              <w:keepNext w:val="true"/>
+              <w:keepLines/>
+              <w:spacing w:lineRule="auto" w:line="240" w:before="0" w:after="0"/>
+              <w:jc w:val="left"/>
+              <w:rPr/>
+            </w:pPr>
+            <w:r>
+              <w:rPr>
+                <w:rFonts w:eastAsia="Times New Roman" w:cs="Times New Roman"/>
+                <w:b w:val="false"/>
+                <w:bCs w:val="false"/>
+                <w:sz w:val="20"/>
+                <w:szCs w:val="20"/>
+                <w:highlight w:val="yellow"/>
+              </w:rPr>
+              <w:t xml:space="preserve"> </w:t>
+            </w:r>
+          </w:p>
+        </w:tc>
+      </w:tr>
+      <w:tr>
+        <w:trPr>
+          <w:cantSplit w:val="true"/>
+        </w:trPr>
+        <w:tc>
+          <w:tcPr>
+            <w:tcW w:w="600" w:type="dxa"/>
+            <w:tcBorders>
+              <w:top w:val="single" w:sz="4" w:space="0" w:color="8C8C8C"/>
+              <w:left w:val="single" w:sz="4" w:space="0" w:color="8C8C8C"/>
+              <w:bottom w:val="single" w:sz="4" w:space="0" w:color="8C8C8C"/>
+              <w:right w:val="single" w:sz="4" w:space="0" w:color="8C8C8C"/>
+            </w:tcBorders>
+            <w:vAlign w:val="center"/>
+          </w:tcPr>
+          <w:p>
+            <w:pPr>
+              <w:pStyle w:val="Normal"/>
+              <w:keepNext w:val="true"/>
+              <w:keepLines/>
+              <w:spacing w:lineRule="auto" w:line="240" w:before="0" w:after="0"/>
+              <w:jc w:val="left"/>
+              <w:rPr/>
+            </w:pPr>
+            <w:r>
+              <w:rPr>
+                <w:rFonts w:eastAsia="Times New Roman" w:cs="Times New Roman"/>
+                <w:b w:val="false"/>
+                <w:bCs w:val="false"/>
+                <w:sz w:val="20"/>
+                <w:szCs w:val="20"/>
+              </w:rPr>
+              <w:t>5</w:t>
+            </w:r>
+          </w:p>
+        </w:tc>
+        <w:tc>
+          <w:tcPr>
+            <w:tcW w:w="800" w:type="dxa"/>
+            <w:tcBorders>
+              <w:top w:val="single" w:sz="4" w:space="0" w:color="8C8C8C"/>
+              <w:left w:val="single" w:sz="4" w:space="0" w:color="8C8C8C"/>
+              <w:bottom w:val="single" w:sz="4" w:space="0" w:color="8C8C8C"/>
+              <w:right w:val="single" w:sz="4" w:space="0" w:color="8C8C8C"/>
+            </w:tcBorders>
+            <w:vAlign w:val="center"/>
+          </w:tcPr>
+          <w:p>
+            <w:pPr>
+              <w:pStyle w:val="Normal"/>
+              <w:keepNext w:val="true"/>
+              <w:keepLines/>
+              <w:spacing w:lineRule="auto" w:line="240" w:before="0" w:after="0"/>
+              <w:jc w:val="left"/>
+              <w:rPr/>
+            </w:pPr>
+            <w:r>
+              <w:rPr>
+                <w:rFonts w:eastAsia="Times New Roman" w:cs="Times New Roman"/>
+                <w:b w:val="false"/>
+                <w:bCs w:val="false"/>
+                <w:sz w:val="20"/>
+                <w:szCs w:val="20"/>
+                <w:highlight w:val="yellow"/>
+              </w:rPr>
+              <w:t xml:space="preserve"> </w:t>
+            </w:r>
+          </w:p>
+        </w:tc>
+        <w:tc>
+          <w:tcPr>
+            <w:tcW w:w="2269" w:type="dxa"/>
+            <w:tcBorders>
+              <w:top w:val="single" w:sz="4" w:space="0" w:color="8C8C8C"/>
+              <w:left w:val="single" w:sz="4" w:space="0" w:color="8C8C8C"/>
+              <w:bottom w:val="single" w:sz="4" w:space="0" w:color="8C8C8C"/>
+              <w:right w:val="single" w:sz="4" w:space="0" w:color="8C8C8C"/>
+            </w:tcBorders>
+            <w:vAlign w:val="center"/>
+          </w:tcPr>
+          <w:p>
+            <w:pPr>
+              <w:pStyle w:val="Normal"/>
+              <w:keepNext w:val="true"/>
+              <w:keepLines/>
+              <w:spacing w:lineRule="auto" w:line="240" w:before="0" w:after="0"/>
+              <w:jc w:val="left"/>
+              <w:rPr/>
+            </w:pPr>
+            <w:r>
+              <w:rPr>
+                <w:rFonts w:eastAsia="Times New Roman" w:cs="Times New Roman"/>
+                <w:b w:val="false"/>
+                <w:bCs w:val="false"/>
+                <w:sz w:val="20"/>
+                <w:szCs w:val="20"/>
+                <w:highlight w:val="yellow"/>
+              </w:rPr>
+              <w:t xml:space="preserve"> </w:t>
+            </w:r>
+          </w:p>
+        </w:tc>
+        <w:tc>
+          <w:tcPr>
+            <w:tcW w:w="1301" w:type="dxa"/>
+            <w:tcBorders>
+              <w:top w:val="single" w:sz="4" w:space="0" w:color="8C8C8C"/>
+              <w:left w:val="single" w:sz="4" w:space="0" w:color="8C8C8C"/>
+              <w:bottom w:val="single" w:sz="4" w:space="0" w:color="8C8C8C"/>
+              <w:right w:val="single" w:sz="4" w:space="0" w:color="8C8C8C"/>
+            </w:tcBorders>
+            <w:vAlign w:val="center"/>
+          </w:tcPr>
+          <w:p>
+            <w:pPr>
+              <w:pStyle w:val="Normal"/>
+              <w:keepNext w:val="true"/>
+              <w:keepLines/>
+              <w:spacing w:lineRule="auto" w:line="240" w:before="0" w:after="0"/>
+              <w:jc w:val="left"/>
+              <w:rPr/>
+            </w:pPr>
+            <w:r>
+              <w:rPr>
+                <w:rFonts w:eastAsia="Times New Roman" w:cs="Times New Roman"/>
+                <w:b w:val="false"/>
+                <w:bCs w:val="false"/>
+                <w:sz w:val="20"/>
+                <w:szCs w:val="20"/>
+                <w:highlight w:val="yellow"/>
+              </w:rPr>
+              <w:t xml:space="preserve"> </w:t>
+            </w:r>
+          </w:p>
+        </w:tc>
+        <w:tc>
+          <w:tcPr>
+            <w:tcW w:w="1499" w:type="dxa"/>
+            <w:tcBorders>
+              <w:top w:val="single" w:sz="4" w:space="0" w:color="8C8C8C"/>
+              <w:left w:val="single" w:sz="4" w:space="0" w:color="8C8C8C"/>
+              <w:bottom w:val="single" w:sz="4" w:space="0" w:color="8C8C8C"/>
+              <w:right w:val="single" w:sz="4" w:space="0" w:color="8C8C8C"/>
+            </w:tcBorders>
+            <w:vAlign w:val="center"/>
+          </w:tcPr>
+          <w:p>
+            <w:pPr>
+              <w:pStyle w:val="Normal"/>
+              <w:keepNext w:val="true"/>
+              <w:keepLines/>
+              <w:spacing w:lineRule="auto" w:line="240" w:before="0" w:after="0"/>
+              <w:jc w:val="left"/>
+              <w:rPr/>
+            </w:pPr>
+            <w:r>
+              <w:rPr>
+                <w:rFonts w:eastAsia="Times New Roman" w:cs="Times New Roman"/>
+                <w:b w:val="false"/>
+                <w:bCs w:val="false"/>
+                <w:sz w:val="20"/>
+                <w:szCs w:val="20"/>
+                <w:highlight w:val="yellow"/>
+              </w:rPr>
+              <w:t xml:space="preserve"> </w:t>
+            </w:r>
+          </w:p>
+        </w:tc>
+        <w:tc>
+          <w:tcPr>
+            <w:tcW w:w="1301" w:type="dxa"/>
+            <w:tcBorders>
+              <w:top w:val="single" w:sz="4" w:space="0" w:color="8C8C8C"/>
+              <w:left w:val="single" w:sz="4" w:space="0" w:color="8C8C8C"/>
+              <w:bottom w:val="single" w:sz="4" w:space="0" w:color="8C8C8C"/>
+              <w:right w:val="single" w:sz="4" w:space="0" w:color="8C8C8C"/>
+            </w:tcBorders>
+            <w:vAlign w:val="center"/>
+          </w:tcPr>
+          <w:p>
+            <w:pPr>
+              <w:pStyle w:val="Normal"/>
+              <w:keepNext w:val="true"/>
+              <w:keepLines/>
+              <w:spacing w:lineRule="auto" w:line="240" w:before="0" w:after="0"/>
+              <w:jc w:val="left"/>
+              <w:rPr/>
+            </w:pPr>
+            <w:r>
+              <w:rPr>
+                <w:rFonts w:eastAsia="Times New Roman" w:cs="Times New Roman"/>
+                <w:b w:val="false"/>
+                <w:bCs w:val="false"/>
+                <w:sz w:val="20"/>
+                <w:szCs w:val="20"/>
+                <w:highlight w:val="yellow"/>
+              </w:rPr>
+              <w:t xml:space="preserve"> </w:t>
+            </w:r>
+          </w:p>
+        </w:tc>
+        <w:tc>
+          <w:tcPr>
+            <w:tcW w:w="1299" w:type="dxa"/>
+            <w:tcBorders>
+              <w:top w:val="single" w:sz="4" w:space="0" w:color="8C8C8C"/>
+              <w:left w:val="single" w:sz="4" w:space="0" w:color="8C8C8C"/>
+              <w:bottom w:val="single" w:sz="4" w:space="0" w:color="8C8C8C"/>
+              <w:right w:val="single" w:sz="4" w:space="0" w:color="8C8C8C"/>
+            </w:tcBorders>
+            <w:vAlign w:val="center"/>
+          </w:tcPr>
+          <w:p>
+            <w:pPr>
+              <w:pStyle w:val="Normal"/>
+              <w:keepNext w:val="true"/>
+              <w:keepLines/>
+              <w:spacing w:lineRule="auto" w:line="240" w:before="0" w:after="0"/>
+              <w:jc w:val="left"/>
+              <w:rPr/>
+            </w:pPr>
+            <w:r>
+              <w:rPr>
+                <w:rFonts w:eastAsia="Times New Roman" w:cs="Times New Roman"/>
+                <w:b w:val="false"/>
+                <w:bCs w:val="false"/>
+                <w:sz w:val="20"/>
+                <w:szCs w:val="20"/>
+                <w:highlight w:val="yellow"/>
+              </w:rPr>
+              <w:t xml:space="preserve"> </w:t>
+            </w:r>
+          </w:p>
+        </w:tc>
+      </w:tr>
+      <w:tr>
+        <w:trPr>
+          <w:cantSplit w:val="true"/>
+        </w:trPr>
+        <w:tc>
+          <w:tcPr>
+            <w:tcW w:w="600" w:type="dxa"/>
+            <w:tcBorders>
+              <w:top w:val="single" w:sz="4" w:space="0" w:color="8C8C8C"/>
+              <w:left w:val="single" w:sz="4" w:space="0" w:color="8C8C8C"/>
+              <w:bottom w:val="single" w:sz="4" w:space="0" w:color="8C8C8C"/>
+              <w:right w:val="single" w:sz="4" w:space="0" w:color="8C8C8C"/>
+            </w:tcBorders>
+            <w:vAlign w:val="center"/>
+          </w:tcPr>
+          <w:p>
+            <w:pPr>
+              <w:pStyle w:val="Normal"/>
+              <w:keepNext w:val="true"/>
+              <w:keepLines/>
+              <w:spacing w:lineRule="auto" w:line="240" w:before="0" w:after="0"/>
+              <w:jc w:val="left"/>
+              <w:rPr/>
+            </w:pPr>
+            <w:r>
+              <w:rPr>
+                <w:rFonts w:eastAsia="Times New Roman" w:cs="Times New Roman"/>
+                <w:b w:val="false"/>
+                <w:bCs w:val="false"/>
+                <w:sz w:val="20"/>
+                <w:szCs w:val="20"/>
+              </w:rPr>
+              <w:t>6</w:t>
+            </w:r>
+          </w:p>
+        </w:tc>
+        <w:tc>
+          <w:tcPr>
+            <w:tcW w:w="800" w:type="dxa"/>
+            <w:tcBorders>
+              <w:top w:val="single" w:sz="4" w:space="0" w:color="8C8C8C"/>
+              <w:left w:val="single" w:sz="4" w:space="0" w:color="8C8C8C"/>
+              <w:bottom w:val="single" w:sz="4" w:space="0" w:color="8C8C8C"/>
+              <w:right w:val="single" w:sz="4" w:space="0" w:color="8C8C8C"/>
+            </w:tcBorders>
+            <w:vAlign w:val="center"/>
+          </w:tcPr>
+          <w:p>
+            <w:pPr>
+              <w:pStyle w:val="Normal"/>
+              <w:keepNext w:val="true"/>
+              <w:keepLines/>
+              <w:spacing w:lineRule="auto" w:line="240" w:before="0" w:after="0"/>
+              <w:jc w:val="left"/>
+              <w:rPr/>
+            </w:pPr>
+            <w:r>
+              <w:rPr>
+                <w:rFonts w:eastAsia="Times New Roman" w:cs="Times New Roman"/>
+                <w:b w:val="false"/>
+                <w:bCs w:val="false"/>
+                <w:sz w:val="20"/>
+                <w:szCs w:val="20"/>
+                <w:highlight w:val="yellow"/>
+              </w:rPr>
+              <w:t xml:space="preserve"> </w:t>
+            </w:r>
+          </w:p>
+        </w:tc>
+        <w:tc>
+          <w:tcPr>
+            <w:tcW w:w="2269" w:type="dxa"/>
+            <w:tcBorders>
+              <w:top w:val="single" w:sz="4" w:space="0" w:color="8C8C8C"/>
+              <w:left w:val="single" w:sz="4" w:space="0" w:color="8C8C8C"/>
+              <w:bottom w:val="single" w:sz="4" w:space="0" w:color="8C8C8C"/>
+              <w:right w:val="single" w:sz="4" w:space="0" w:color="8C8C8C"/>
+            </w:tcBorders>
+            <w:vAlign w:val="center"/>
+          </w:tcPr>
+          <w:p>
+            <w:pPr>
+              <w:pStyle w:val="Normal"/>
+              <w:keepNext w:val="true"/>
+              <w:keepLines/>
+              <w:spacing w:lineRule="auto" w:line="240" w:before="0" w:after="0"/>
+              <w:jc w:val="left"/>
+              <w:rPr/>
+            </w:pPr>
+            <w:r>
+              <w:rPr>
+                <w:rFonts w:eastAsia="Times New Roman" w:cs="Times New Roman"/>
+                <w:b w:val="false"/>
+                <w:bCs w:val="false"/>
+                <w:sz w:val="20"/>
+                <w:szCs w:val="20"/>
+                <w:highlight w:val="yellow"/>
+              </w:rPr>
+              <w:t xml:space="preserve"> </w:t>
+            </w:r>
+          </w:p>
+        </w:tc>
+        <w:tc>
+          <w:tcPr>
+            <w:tcW w:w="1301" w:type="dxa"/>
+            <w:tcBorders>
+              <w:top w:val="single" w:sz="4" w:space="0" w:color="8C8C8C"/>
+              <w:left w:val="single" w:sz="4" w:space="0" w:color="8C8C8C"/>
+              <w:bottom w:val="single" w:sz="4" w:space="0" w:color="8C8C8C"/>
+              <w:right w:val="single" w:sz="4" w:space="0" w:color="8C8C8C"/>
+            </w:tcBorders>
+            <w:vAlign w:val="center"/>
+          </w:tcPr>
+          <w:p>
+            <w:pPr>
+              <w:pStyle w:val="Normal"/>
+              <w:keepNext w:val="true"/>
+              <w:keepLines/>
+              <w:spacing w:lineRule="auto" w:line="240" w:before="0" w:after="0"/>
+              <w:jc w:val="left"/>
+              <w:rPr/>
+            </w:pPr>
+            <w:r>
+              <w:rPr>
+                <w:rFonts w:eastAsia="Times New Roman" w:cs="Times New Roman"/>
+                <w:b w:val="false"/>
+                <w:bCs w:val="false"/>
+                <w:sz w:val="20"/>
+                <w:szCs w:val="20"/>
+                <w:highlight w:val="yellow"/>
+              </w:rPr>
+              <w:t xml:space="preserve"> </w:t>
+            </w:r>
+          </w:p>
+        </w:tc>
+        <w:tc>
+          <w:tcPr>
+            <w:tcW w:w="1499" w:type="dxa"/>
+            <w:tcBorders>
+              <w:top w:val="single" w:sz="4" w:space="0" w:color="8C8C8C"/>
+              <w:left w:val="single" w:sz="4" w:space="0" w:color="8C8C8C"/>
+              <w:bottom w:val="single" w:sz="4" w:space="0" w:color="8C8C8C"/>
+              <w:right w:val="single" w:sz="4" w:space="0" w:color="8C8C8C"/>
+            </w:tcBorders>
+            <w:vAlign w:val="center"/>
+          </w:tcPr>
+          <w:p>
+            <w:pPr>
+              <w:pStyle w:val="Normal"/>
+              <w:keepNext w:val="true"/>
+              <w:keepLines/>
+              <w:spacing w:lineRule="auto" w:line="240" w:before="0" w:after="0"/>
+              <w:jc w:val="left"/>
+              <w:rPr/>
+            </w:pPr>
+            <w:r>
+              <w:rPr>
+                <w:rFonts w:eastAsia="Times New Roman" w:cs="Times New Roman"/>
+                <w:b w:val="false"/>
+                <w:bCs w:val="false"/>
+                <w:sz w:val="20"/>
+                <w:szCs w:val="20"/>
+                <w:highlight w:val="yellow"/>
+              </w:rPr>
+              <w:t xml:space="preserve"> </w:t>
+            </w:r>
+          </w:p>
+        </w:tc>
+        <w:tc>
+          <w:tcPr>
+            <w:tcW w:w="1301" w:type="dxa"/>
+            <w:tcBorders>
+              <w:top w:val="single" w:sz="4" w:space="0" w:color="8C8C8C"/>
+              <w:left w:val="single" w:sz="4" w:space="0" w:color="8C8C8C"/>
+              <w:bottom w:val="single" w:sz="4" w:space="0" w:color="8C8C8C"/>
+              <w:right w:val="single" w:sz="4" w:space="0" w:color="8C8C8C"/>
+            </w:tcBorders>
+            <w:vAlign w:val="center"/>
+          </w:tcPr>
+          <w:p>
+            <w:pPr>
+              <w:pStyle w:val="Normal"/>
+              <w:keepNext w:val="true"/>
+              <w:keepLines/>
+              <w:spacing w:lineRule="auto" w:line="240" w:before="0" w:after="0"/>
+              <w:jc w:val="left"/>
+              <w:rPr/>
+            </w:pPr>
+            <w:r>
+              <w:rPr>
+                <w:rFonts w:eastAsia="Times New Roman" w:cs="Times New Roman"/>
+                <w:b w:val="false"/>
+                <w:bCs w:val="false"/>
+                <w:sz w:val="20"/>
+                <w:szCs w:val="20"/>
+                <w:highlight w:val="yellow"/>
+              </w:rPr>
+              <w:t xml:space="preserve"> </w:t>
+            </w:r>
+          </w:p>
+        </w:tc>
+        <w:tc>
+          <w:tcPr>
+            <w:tcW w:w="1299" w:type="dxa"/>
+            <w:tcBorders>
+              <w:top w:val="single" w:sz="4" w:space="0" w:color="8C8C8C"/>
+              <w:left w:val="single" w:sz="4" w:space="0" w:color="8C8C8C"/>
+              <w:bottom w:val="single" w:sz="4" w:space="0" w:color="8C8C8C"/>
+              <w:right w:val="single" w:sz="4" w:space="0" w:color="8C8C8C"/>
+            </w:tcBorders>
+            <w:vAlign w:val="center"/>
+          </w:tcPr>
+          <w:p>
+            <w:pPr>
+              <w:pStyle w:val="Normal"/>
+              <w:keepNext w:val="true"/>
+              <w:keepLines/>
+              <w:spacing w:lineRule="auto" w:line="240" w:before="0" w:after="0"/>
+              <w:jc w:val="left"/>
+              <w:rPr/>
+            </w:pPr>
+            <w:r>
+              <w:rPr>
+                <w:rFonts w:eastAsia="Times New Roman" w:cs="Times New Roman"/>
+                <w:b w:val="false"/>
+                <w:bCs w:val="false"/>
+                <w:sz w:val="20"/>
+                <w:szCs w:val="20"/>
+                <w:highlight w:val="yellow"/>
+              </w:rPr>
+              <w:t xml:space="preserve"> </w:t>
+            </w:r>
+          </w:p>
+        </w:tc>
+      </w:tr>
+      <w:tr>
+        <w:trPr>
+          <w:cantSplit w:val="true"/>
+        </w:trPr>
+        <w:tc>
+          <w:tcPr>
+            <w:tcW w:w="600" w:type="dxa"/>
+            <w:tcBorders>
+              <w:top w:val="single" w:sz="4" w:space="0" w:color="8C8C8C"/>
+              <w:left w:val="single" w:sz="4" w:space="0" w:color="8C8C8C"/>
+              <w:bottom w:val="single" w:sz="4" w:space="0" w:color="8C8C8C"/>
+              <w:right w:val="single" w:sz="4" w:space="0" w:color="8C8C8C"/>
+            </w:tcBorders>
+            <w:vAlign w:val="center"/>
+          </w:tcPr>
+          <w:p>
+            <w:pPr>
+              <w:pStyle w:val="Normal"/>
+              <w:keepNext w:val="true"/>
+              <w:keepLines/>
+              <w:spacing w:lineRule="auto" w:line="240" w:before="0" w:after="0"/>
+              <w:jc w:val="left"/>
+              <w:rPr/>
+            </w:pPr>
+            <w:r>
+              <w:rPr>
+                <w:rFonts w:eastAsia="Times New Roman" w:cs="Times New Roman"/>
+                <w:b w:val="false"/>
+                <w:bCs w:val="false"/>
+                <w:sz w:val="20"/>
+                <w:szCs w:val="20"/>
+              </w:rPr>
+              <w:t>7</w:t>
+            </w:r>
+          </w:p>
+        </w:tc>
+        <w:tc>
+          <w:tcPr>
+            <w:tcW w:w="800" w:type="dxa"/>
+            <w:tcBorders>
+              <w:top w:val="single" w:sz="4" w:space="0" w:color="8C8C8C"/>
+              <w:left w:val="single" w:sz="4" w:space="0" w:color="8C8C8C"/>
+              <w:bottom w:val="single" w:sz="4" w:space="0" w:color="8C8C8C"/>
+              <w:right w:val="single" w:sz="4" w:space="0" w:color="8C8C8C"/>
+            </w:tcBorders>
+            <w:vAlign w:val="center"/>
+          </w:tcPr>
+          <w:p>
+            <w:pPr>
+              <w:pStyle w:val="Normal"/>
+              <w:keepNext w:val="true"/>
+              <w:keepLines/>
+              <w:spacing w:lineRule="auto" w:line="240" w:before="0" w:after="0"/>
+              <w:jc w:val="left"/>
+              <w:rPr/>
+            </w:pPr>
+            <w:r>
+              <w:rPr>
+                <w:rFonts w:eastAsia="Times New Roman" w:cs="Times New Roman"/>
+                <w:b w:val="false"/>
+                <w:bCs w:val="false"/>
+                <w:sz w:val="20"/>
+                <w:szCs w:val="20"/>
+                <w:highlight w:val="yellow"/>
+              </w:rPr>
+              <w:t xml:space="preserve"> </w:t>
+            </w:r>
+          </w:p>
+        </w:tc>
+        <w:tc>
+          <w:tcPr>
+            <w:tcW w:w="2269" w:type="dxa"/>
+            <w:tcBorders>
+              <w:top w:val="single" w:sz="4" w:space="0" w:color="8C8C8C"/>
+              <w:left w:val="single" w:sz="4" w:space="0" w:color="8C8C8C"/>
+              <w:bottom w:val="single" w:sz="4" w:space="0" w:color="8C8C8C"/>
+              <w:right w:val="single" w:sz="4" w:space="0" w:color="8C8C8C"/>
+            </w:tcBorders>
+            <w:vAlign w:val="center"/>
+          </w:tcPr>
+          <w:p>
+            <w:pPr>
+              <w:pStyle w:val="Normal"/>
+              <w:keepNext w:val="true"/>
+              <w:keepLines/>
+              <w:spacing w:lineRule="auto" w:line="240" w:before="0" w:after="0"/>
+              <w:jc w:val="left"/>
+              <w:rPr/>
+            </w:pPr>
+            <w:r>
+              <w:rPr>
+                <w:rFonts w:eastAsia="Times New Roman" w:cs="Times New Roman"/>
+                <w:b w:val="false"/>
+                <w:bCs w:val="false"/>
+                <w:sz w:val="20"/>
+                <w:szCs w:val="20"/>
+                <w:highlight w:val="yellow"/>
+              </w:rPr>
+              <w:t xml:space="preserve"> </w:t>
+            </w:r>
+          </w:p>
+        </w:tc>
+        <w:tc>
+          <w:tcPr>
+            <w:tcW w:w="1301" w:type="dxa"/>
+            <w:tcBorders>
+              <w:top w:val="single" w:sz="4" w:space="0" w:color="8C8C8C"/>
+              <w:left w:val="single" w:sz="4" w:space="0" w:color="8C8C8C"/>
+              <w:bottom w:val="single" w:sz="4" w:space="0" w:color="8C8C8C"/>
+              <w:right w:val="single" w:sz="4" w:space="0" w:color="8C8C8C"/>
+            </w:tcBorders>
+            <w:vAlign w:val="center"/>
+          </w:tcPr>
+          <w:p>
+            <w:pPr>
+              <w:pStyle w:val="Normal"/>
+              <w:keepNext w:val="true"/>
+              <w:keepLines/>
+              <w:spacing w:lineRule="auto" w:line="240" w:before="0" w:after="0"/>
+              <w:jc w:val="left"/>
+              <w:rPr/>
+            </w:pPr>
+            <w:r>
+              <w:rPr>
+                <w:rFonts w:eastAsia="Times New Roman" w:cs="Times New Roman"/>
+                <w:b w:val="false"/>
+                <w:bCs w:val="false"/>
+                <w:sz w:val="20"/>
+                <w:szCs w:val="20"/>
+                <w:highlight w:val="yellow"/>
+              </w:rPr>
+              <w:t xml:space="preserve"> </w:t>
+            </w:r>
+          </w:p>
+        </w:tc>
+        <w:tc>
+          <w:tcPr>
+            <w:tcW w:w="1499" w:type="dxa"/>
+            <w:tcBorders>
+              <w:top w:val="single" w:sz="4" w:space="0" w:color="8C8C8C"/>
+              <w:left w:val="single" w:sz="4" w:space="0" w:color="8C8C8C"/>
+              <w:bottom w:val="single" w:sz="4" w:space="0" w:color="8C8C8C"/>
+              <w:right w:val="single" w:sz="4" w:space="0" w:color="8C8C8C"/>
+            </w:tcBorders>
+            <w:vAlign w:val="center"/>
+          </w:tcPr>
+          <w:p>
+            <w:pPr>
+              <w:pStyle w:val="Normal"/>
+              <w:keepNext w:val="true"/>
+              <w:keepLines/>
+              <w:spacing w:lineRule="auto" w:line="240" w:before="0" w:after="0"/>
+              <w:jc w:val="left"/>
+              <w:rPr/>
+            </w:pPr>
+            <w:r>
+              <w:rPr>
+                <w:rFonts w:eastAsia="Times New Roman" w:cs="Times New Roman"/>
+                <w:b w:val="false"/>
+                <w:bCs w:val="false"/>
+                <w:sz w:val="20"/>
+                <w:szCs w:val="20"/>
+                <w:highlight w:val="yellow"/>
+              </w:rPr>
+              <w:t xml:space="preserve"> </w:t>
+            </w:r>
+          </w:p>
+        </w:tc>
+        <w:tc>
+          <w:tcPr>
+            <w:tcW w:w="1301" w:type="dxa"/>
+            <w:tcBorders>
+              <w:top w:val="single" w:sz="4" w:space="0" w:color="8C8C8C"/>
+              <w:left w:val="single" w:sz="4" w:space="0" w:color="8C8C8C"/>
+              <w:bottom w:val="single" w:sz="4" w:space="0" w:color="8C8C8C"/>
+              <w:right w:val="single" w:sz="4" w:space="0" w:color="8C8C8C"/>
+            </w:tcBorders>
+            <w:vAlign w:val="center"/>
+          </w:tcPr>
+          <w:p>
+            <w:pPr>
+              <w:pStyle w:val="Normal"/>
+              <w:keepNext w:val="true"/>
+              <w:keepLines/>
+              <w:spacing w:lineRule="auto" w:line="240" w:before="0" w:after="0"/>
+              <w:jc w:val="left"/>
+              <w:rPr/>
+            </w:pPr>
+            <w:r>
+              <w:rPr>
+                <w:rFonts w:eastAsia="Times New Roman" w:cs="Times New Roman"/>
+                <w:b w:val="false"/>
+                <w:bCs w:val="false"/>
+                <w:sz w:val="20"/>
+                <w:szCs w:val="20"/>
+                <w:highlight w:val="yellow"/>
+              </w:rPr>
+              <w:t xml:space="preserve"> </w:t>
+            </w:r>
+          </w:p>
+        </w:tc>
+        <w:tc>
+          <w:tcPr>
+            <w:tcW w:w="1299" w:type="dxa"/>
+            <w:tcBorders>
+              <w:top w:val="single" w:sz="4" w:space="0" w:color="8C8C8C"/>
+              <w:left w:val="single" w:sz="4" w:space="0" w:color="8C8C8C"/>
+              <w:bottom w:val="single" w:sz="4" w:space="0" w:color="8C8C8C"/>
+              <w:right w:val="single" w:sz="4" w:space="0" w:color="8C8C8C"/>
+            </w:tcBorders>
+            <w:vAlign w:val="center"/>
+          </w:tcPr>
+          <w:p>
+            <w:pPr>
+              <w:pStyle w:val="Normal"/>
+              <w:keepNext w:val="true"/>
+              <w:keepLines/>
+              <w:spacing w:lineRule="auto" w:line="240" w:before="0" w:after="0"/>
+              <w:jc w:val="left"/>
+              <w:rPr/>
+            </w:pPr>
+            <w:r>
+              <w:rPr>
+                <w:rFonts w:eastAsia="Times New Roman" w:cs="Times New Roman"/>
+                <w:b w:val="false"/>
+                <w:bCs w:val="false"/>
+                <w:sz w:val="20"/>
+                <w:szCs w:val="20"/>
+                <w:highlight w:val="yellow"/>
+              </w:rPr>
+              <w:t xml:space="preserve"> </w:t>
+            </w:r>
+          </w:p>
+        </w:tc>
+      </w:tr>
+      <w:tr>
+        <w:trPr>
+          <w:cantSplit w:val="true"/>
+        </w:trPr>
+        <w:tc>
+          <w:tcPr>
+            <w:tcW w:w="600" w:type="dxa"/>
+            <w:tcBorders>
+              <w:top w:val="single" w:sz="4" w:space="0" w:color="8C8C8C"/>
+              <w:left w:val="single" w:sz="4" w:space="0" w:color="8C8C8C"/>
+              <w:bottom w:val="single" w:sz="4" w:space="0" w:color="8C8C8C"/>
+              <w:right w:val="single" w:sz="4" w:space="0" w:color="8C8C8C"/>
+            </w:tcBorders>
+            <w:vAlign w:val="center"/>
+          </w:tcPr>
+          <w:p>
+            <w:pPr>
+              <w:pStyle w:val="Normal"/>
+              <w:keepNext w:val="true"/>
+              <w:keepLines/>
+              <w:spacing w:lineRule="auto" w:line="240" w:before="0" w:after="0"/>
+              <w:jc w:val="left"/>
+              <w:rPr/>
+            </w:pPr>
+            <w:r>
+              <w:rPr>
+                <w:rFonts w:eastAsia="Times New Roman" w:cs="Times New Roman"/>
+                <w:b w:val="false"/>
+                <w:bCs w:val="false"/>
+                <w:sz w:val="20"/>
+                <w:szCs w:val="20"/>
+              </w:rPr>
+              <w:t>8</w:t>
+            </w:r>
+          </w:p>
+        </w:tc>
+        <w:tc>
+          <w:tcPr>
+            <w:tcW w:w="800" w:type="dxa"/>
+            <w:tcBorders>
+              <w:top w:val="single" w:sz="4" w:space="0" w:color="8C8C8C"/>
+              <w:left w:val="single" w:sz="4" w:space="0" w:color="8C8C8C"/>
+              <w:bottom w:val="single" w:sz="4" w:space="0" w:color="8C8C8C"/>
+              <w:right w:val="single" w:sz="4" w:space="0" w:color="8C8C8C"/>
+            </w:tcBorders>
+            <w:vAlign w:val="center"/>
+          </w:tcPr>
+          <w:p>
+            <w:pPr>
+              <w:pStyle w:val="Normal"/>
+              <w:keepNext w:val="true"/>
+              <w:keepLines/>
+              <w:spacing w:lineRule="auto" w:line="240" w:before="0" w:after="0"/>
+              <w:jc w:val="left"/>
+              <w:rPr/>
+            </w:pPr>
+            <w:r>
+              <w:rPr>
+                <w:rFonts w:eastAsia="Times New Roman" w:cs="Times New Roman"/>
+                <w:b w:val="false"/>
+                <w:bCs w:val="false"/>
+                <w:sz w:val="20"/>
+                <w:szCs w:val="20"/>
+                <w:highlight w:val="yellow"/>
+              </w:rPr>
+              <w:t xml:space="preserve"> </w:t>
+            </w:r>
+          </w:p>
+        </w:tc>
+        <w:tc>
+          <w:tcPr>
+            <w:tcW w:w="2269" w:type="dxa"/>
+            <w:tcBorders>
+              <w:top w:val="single" w:sz="4" w:space="0" w:color="8C8C8C"/>
+              <w:left w:val="single" w:sz="4" w:space="0" w:color="8C8C8C"/>
+              <w:bottom w:val="single" w:sz="4" w:space="0" w:color="8C8C8C"/>
+              <w:right w:val="single" w:sz="4" w:space="0" w:color="8C8C8C"/>
+            </w:tcBorders>
+            <w:vAlign w:val="center"/>
+          </w:tcPr>
+          <w:p>
+            <w:pPr>
+              <w:pStyle w:val="Normal"/>
+              <w:keepNext w:val="true"/>
+              <w:keepLines/>
+              <w:spacing w:lineRule="auto" w:line="240" w:before="0" w:after="0"/>
+              <w:jc w:val="left"/>
+              <w:rPr/>
+            </w:pPr>
+            <w:r>
+              <w:rPr>
+                <w:rFonts w:eastAsia="Times New Roman" w:cs="Times New Roman"/>
+                <w:b w:val="false"/>
+                <w:bCs w:val="false"/>
+                <w:sz w:val="20"/>
+                <w:szCs w:val="20"/>
+                <w:highlight w:val="yellow"/>
+              </w:rPr>
+              <w:t xml:space="preserve"> </w:t>
+            </w:r>
+          </w:p>
+        </w:tc>
+        <w:tc>
+          <w:tcPr>
+            <w:tcW w:w="1301" w:type="dxa"/>
+            <w:tcBorders>
+              <w:top w:val="single" w:sz="4" w:space="0" w:color="8C8C8C"/>
+              <w:left w:val="single" w:sz="4" w:space="0" w:color="8C8C8C"/>
+              <w:bottom w:val="single" w:sz="4" w:space="0" w:color="8C8C8C"/>
+              <w:right w:val="single" w:sz="4" w:space="0" w:color="8C8C8C"/>
+            </w:tcBorders>
+            <w:vAlign w:val="center"/>
+          </w:tcPr>
+          <w:p>
+            <w:pPr>
+              <w:pStyle w:val="Normal"/>
+              <w:keepNext w:val="true"/>
+              <w:keepLines/>
+              <w:spacing w:lineRule="auto" w:line="240" w:before="0" w:after="0"/>
+              <w:jc w:val="left"/>
+              <w:rPr/>
+            </w:pPr>
+            <w:r>
+              <w:rPr>
+                <w:rFonts w:eastAsia="Times New Roman" w:cs="Times New Roman"/>
+                <w:b w:val="false"/>
+                <w:bCs w:val="false"/>
+                <w:sz w:val="20"/>
+                <w:szCs w:val="20"/>
+                <w:highlight w:val="yellow"/>
+              </w:rPr>
+              <w:t xml:space="preserve"> </w:t>
+            </w:r>
+          </w:p>
+        </w:tc>
+        <w:tc>
+          <w:tcPr>
+            <w:tcW w:w="1499" w:type="dxa"/>
+            <w:tcBorders>
+              <w:top w:val="single" w:sz="4" w:space="0" w:color="8C8C8C"/>
+              <w:left w:val="single" w:sz="4" w:space="0" w:color="8C8C8C"/>
+              <w:bottom w:val="single" w:sz="4" w:space="0" w:color="8C8C8C"/>
+              <w:right w:val="single" w:sz="4" w:space="0" w:color="8C8C8C"/>
+            </w:tcBorders>
+            <w:vAlign w:val="center"/>
+          </w:tcPr>
+          <w:p>
+            <w:pPr>
+              <w:pStyle w:val="Normal"/>
+              <w:keepNext w:val="true"/>
+              <w:keepLines/>
+              <w:spacing w:lineRule="auto" w:line="240" w:before="0" w:after="0"/>
+              <w:jc w:val="left"/>
+              <w:rPr/>
+            </w:pPr>
+            <w:r>
+              <w:rPr>
+                <w:rFonts w:eastAsia="Times New Roman" w:cs="Times New Roman"/>
+                <w:b w:val="false"/>
+                <w:bCs w:val="false"/>
+                <w:sz w:val="20"/>
+                <w:szCs w:val="20"/>
+                <w:highlight w:val="yellow"/>
+              </w:rPr>
+              <w:t xml:space="preserve"> </w:t>
+            </w:r>
+          </w:p>
+        </w:tc>
+        <w:tc>
+          <w:tcPr>
+            <w:tcW w:w="1301" w:type="dxa"/>
+            <w:tcBorders>
+              <w:top w:val="single" w:sz="4" w:space="0" w:color="8C8C8C"/>
+              <w:left w:val="single" w:sz="4" w:space="0" w:color="8C8C8C"/>
+              <w:bottom w:val="single" w:sz="4" w:space="0" w:color="8C8C8C"/>
+              <w:right w:val="single" w:sz="4" w:space="0" w:color="8C8C8C"/>
+            </w:tcBorders>
+            <w:vAlign w:val="center"/>
+          </w:tcPr>
+          <w:p>
+            <w:pPr>
+              <w:pStyle w:val="Normal"/>
+              <w:keepNext w:val="true"/>
+              <w:keepLines/>
+              <w:spacing w:lineRule="auto" w:line="240" w:before="0" w:after="0"/>
+              <w:jc w:val="left"/>
+              <w:rPr/>
+            </w:pPr>
+            <w:r>
+              <w:rPr>
+                <w:rFonts w:eastAsia="Times New Roman" w:cs="Times New Roman"/>
+                <w:b w:val="false"/>
+                <w:bCs w:val="false"/>
+                <w:sz w:val="20"/>
+                <w:szCs w:val="20"/>
+                <w:highlight w:val="yellow"/>
+              </w:rPr>
+              <w:t xml:space="preserve"> </w:t>
+            </w:r>
+          </w:p>
+        </w:tc>
+        <w:tc>
+          <w:tcPr>
+            <w:tcW w:w="1299" w:type="dxa"/>
+            <w:tcBorders>
+              <w:top w:val="single" w:sz="4" w:space="0" w:color="8C8C8C"/>
+              <w:left w:val="single" w:sz="4" w:space="0" w:color="8C8C8C"/>
+              <w:bottom w:val="single" w:sz="4" w:space="0" w:color="8C8C8C"/>
+              <w:right w:val="single" w:sz="4" w:space="0" w:color="8C8C8C"/>
+            </w:tcBorders>
+            <w:vAlign w:val="center"/>
+          </w:tcPr>
+          <w:p>
+            <w:pPr>
+              <w:pStyle w:val="Normal"/>
+              <w:keepNext w:val="true"/>
+              <w:keepLines/>
+              <w:spacing w:lineRule="auto" w:line="240" w:before="0" w:after="0"/>
+              <w:jc w:val="left"/>
+              <w:rPr/>
+            </w:pPr>
+            <w:r>
+              <w:rPr>
+                <w:rFonts w:eastAsia="Times New Roman" w:cs="Times New Roman"/>
+                <w:b w:val="false"/>
+                <w:bCs w:val="false"/>
+                <w:sz w:val="20"/>
+                <w:szCs w:val="20"/>
+                <w:highlight w:val="yellow"/>
+              </w:rPr>
+              <w:t xml:space="preserve"> </w:t>
+            </w:r>
+          </w:p>
+        </w:tc>
+      </w:tr>
+      <w:tr>
+        <w:trPr>
+          <w:cantSplit w:val="true"/>
+        </w:trPr>
+        <w:tc>
+          <w:tcPr>
+            <w:tcW w:w="600" w:type="dxa"/>
+            <w:tcBorders>
+              <w:top w:val="single" w:sz="4" w:space="0" w:color="8C8C8C"/>
+              <w:left w:val="single" w:sz="4" w:space="0" w:color="8C8C8C"/>
+              <w:bottom w:val="single" w:sz="4" w:space="0" w:color="8C8C8C"/>
+              <w:right w:val="single" w:sz="4" w:space="0" w:color="8C8C8C"/>
+            </w:tcBorders>
+            <w:vAlign w:val="center"/>
+          </w:tcPr>
+          <w:p>
+            <w:pPr>
+              <w:pStyle w:val="Normal"/>
+              <w:keepNext w:val="true"/>
+              <w:keepLines/>
+              <w:spacing w:lineRule="auto" w:line="240" w:before="0" w:after="0"/>
+              <w:jc w:val="left"/>
+              <w:rPr/>
+            </w:pPr>
+            <w:r>
+              <w:rPr>
+                <w:rFonts w:eastAsia="Times New Roman" w:cs="Times New Roman"/>
+                <w:b w:val="false"/>
+                <w:bCs w:val="false"/>
+                <w:sz w:val="20"/>
+                <w:szCs w:val="20"/>
+              </w:rPr>
+              <w:t>9</w:t>
+            </w:r>
+          </w:p>
+        </w:tc>
+        <w:tc>
+          <w:tcPr>
+            <w:tcW w:w="800" w:type="dxa"/>
+            <w:tcBorders>
+              <w:top w:val="single" w:sz="4" w:space="0" w:color="8C8C8C"/>
+              <w:left w:val="single" w:sz="4" w:space="0" w:color="8C8C8C"/>
+              <w:bottom w:val="single" w:sz="4" w:space="0" w:color="8C8C8C"/>
+              <w:right w:val="single" w:sz="4" w:space="0" w:color="8C8C8C"/>
+            </w:tcBorders>
+            <w:vAlign w:val="center"/>
+          </w:tcPr>
+          <w:p>
+            <w:pPr>
+              <w:pStyle w:val="Normal"/>
+              <w:keepNext w:val="true"/>
+              <w:keepLines/>
+              <w:spacing w:lineRule="auto" w:line="240" w:before="0" w:after="0"/>
+              <w:jc w:val="left"/>
+              <w:rPr/>
+            </w:pPr>
+            <w:r>
+              <w:rPr>
+                <w:rFonts w:eastAsia="Times New Roman" w:cs="Times New Roman"/>
+                <w:b w:val="false"/>
+                <w:bCs w:val="false"/>
+                <w:sz w:val="20"/>
+                <w:szCs w:val="20"/>
+                <w:highlight w:val="yellow"/>
+              </w:rPr>
+              <w:t xml:space="preserve"> </w:t>
+            </w:r>
+          </w:p>
+        </w:tc>
+        <w:tc>
+          <w:tcPr>
+            <w:tcW w:w="2269" w:type="dxa"/>
+            <w:tcBorders>
+              <w:top w:val="single" w:sz="4" w:space="0" w:color="8C8C8C"/>
+              <w:left w:val="single" w:sz="4" w:space="0" w:color="8C8C8C"/>
+              <w:bottom w:val="single" w:sz="4" w:space="0" w:color="8C8C8C"/>
+              <w:right w:val="single" w:sz="4" w:space="0" w:color="8C8C8C"/>
+            </w:tcBorders>
+            <w:vAlign w:val="center"/>
+          </w:tcPr>
+          <w:p>
+            <w:pPr>
+              <w:pStyle w:val="Normal"/>
+              <w:keepNext w:val="true"/>
+              <w:keepLines/>
+              <w:spacing w:lineRule="auto" w:line="240" w:before="0" w:after="0"/>
+              <w:jc w:val="left"/>
+              <w:rPr/>
+            </w:pPr>
+            <w:r>
+              <w:rPr>
+                <w:rFonts w:eastAsia="Times New Roman" w:cs="Times New Roman"/>
+                <w:b w:val="false"/>
+                <w:bCs w:val="false"/>
+                <w:sz w:val="20"/>
+                <w:szCs w:val="20"/>
+                <w:highlight w:val="yellow"/>
+              </w:rPr>
+              <w:t xml:space="preserve"> </w:t>
+            </w:r>
+          </w:p>
+        </w:tc>
+        <w:tc>
+          <w:tcPr>
+            <w:tcW w:w="1301" w:type="dxa"/>
+            <w:tcBorders>
+              <w:top w:val="single" w:sz="4" w:space="0" w:color="8C8C8C"/>
+              <w:left w:val="single" w:sz="4" w:space="0" w:color="8C8C8C"/>
+              <w:bottom w:val="single" w:sz="4" w:space="0" w:color="8C8C8C"/>
+              <w:right w:val="single" w:sz="4" w:space="0" w:color="8C8C8C"/>
+            </w:tcBorders>
+            <w:vAlign w:val="center"/>
+          </w:tcPr>
+          <w:p>
+            <w:pPr>
+              <w:pStyle w:val="Normal"/>
+              <w:keepNext w:val="true"/>
+              <w:keepLines/>
+              <w:spacing w:lineRule="auto" w:line="240" w:before="0" w:after="0"/>
+              <w:jc w:val="left"/>
+              <w:rPr/>
+            </w:pPr>
+            <w:r>
+              <w:rPr>
+                <w:rFonts w:eastAsia="Times New Roman" w:cs="Times New Roman"/>
+                <w:b w:val="false"/>
+                <w:bCs w:val="false"/>
+                <w:sz w:val="20"/>
+                <w:szCs w:val="20"/>
+                <w:highlight w:val="yellow"/>
+              </w:rPr>
+              <w:t xml:space="preserve"> </w:t>
+            </w:r>
+          </w:p>
+        </w:tc>
+        <w:tc>
+          <w:tcPr>
+            <w:tcW w:w="1499" w:type="dxa"/>
+            <w:tcBorders>
+              <w:top w:val="single" w:sz="4" w:space="0" w:color="8C8C8C"/>
+              <w:left w:val="single" w:sz="4" w:space="0" w:color="8C8C8C"/>
+              <w:bottom w:val="single" w:sz="4" w:space="0" w:color="8C8C8C"/>
+              <w:right w:val="single" w:sz="4" w:space="0" w:color="8C8C8C"/>
+            </w:tcBorders>
+            <w:vAlign w:val="center"/>
+          </w:tcPr>
+          <w:p>
+            <w:pPr>
+              <w:pStyle w:val="Normal"/>
+              <w:keepNext w:val="true"/>
+              <w:keepLines/>
+              <w:spacing w:lineRule="auto" w:line="240" w:before="0" w:after="0"/>
+              <w:jc w:val="left"/>
+              <w:rPr/>
+            </w:pPr>
+            <w:r>
+              <w:rPr>
+                <w:rFonts w:eastAsia="Times New Roman" w:cs="Times New Roman"/>
+                <w:b w:val="false"/>
+                <w:bCs w:val="false"/>
+                <w:sz w:val="20"/>
+                <w:szCs w:val="20"/>
+                <w:highlight w:val="yellow"/>
+              </w:rPr>
+              <w:t xml:space="preserve"> </w:t>
+            </w:r>
+          </w:p>
+        </w:tc>
+        <w:tc>
+          <w:tcPr>
+            <w:tcW w:w="1301" w:type="dxa"/>
+            <w:tcBorders>
+              <w:top w:val="single" w:sz="4" w:space="0" w:color="8C8C8C"/>
+              <w:left w:val="single" w:sz="4" w:space="0" w:color="8C8C8C"/>
+              <w:bottom w:val="single" w:sz="4" w:space="0" w:color="8C8C8C"/>
+              <w:right w:val="single" w:sz="4" w:space="0" w:color="8C8C8C"/>
+            </w:tcBorders>
+            <w:vAlign w:val="center"/>
+          </w:tcPr>
+          <w:p>
+            <w:pPr>
+              <w:pStyle w:val="Normal"/>
+              <w:keepNext w:val="true"/>
+              <w:keepLines/>
+              <w:spacing w:lineRule="auto" w:line="240" w:before="0" w:after="0"/>
+              <w:jc w:val="left"/>
+              <w:rPr/>
+            </w:pPr>
+            <w:r>
+              <w:rPr>
+                <w:rFonts w:eastAsia="Times New Roman" w:cs="Times New Roman"/>
+                <w:b w:val="false"/>
+                <w:bCs w:val="false"/>
+                <w:sz w:val="20"/>
+                <w:szCs w:val="20"/>
+                <w:highlight w:val="yellow"/>
+              </w:rPr>
+              <w:t xml:space="preserve"> </w:t>
+            </w:r>
+          </w:p>
+        </w:tc>
+        <w:tc>
+          <w:tcPr>
+            <w:tcW w:w="1299" w:type="dxa"/>
+            <w:tcBorders>
+              <w:top w:val="single" w:sz="4" w:space="0" w:color="8C8C8C"/>
+              <w:left w:val="single" w:sz="4" w:space="0" w:color="8C8C8C"/>
+              <w:bottom w:val="single" w:sz="4" w:space="0" w:color="8C8C8C"/>
+              <w:right w:val="single" w:sz="4" w:space="0" w:color="8C8C8C"/>
+            </w:tcBorders>
+            <w:vAlign w:val="center"/>
+          </w:tcPr>
+          <w:p>
+            <w:pPr>
+              <w:pStyle w:val="Normal"/>
+              <w:keepNext w:val="true"/>
+              <w:keepLines/>
+              <w:spacing w:lineRule="auto" w:line="240" w:before="0" w:after="0"/>
+              <w:jc w:val="left"/>
+              <w:rPr/>
+            </w:pPr>
+            <w:r>
+              <w:rPr>
+                <w:rFonts w:eastAsia="Times New Roman" w:cs="Times New Roman"/>
+                <w:b w:val="false"/>
+                <w:bCs w:val="false"/>
+                <w:sz w:val="20"/>
+                <w:szCs w:val="20"/>
+                <w:highlight w:val="yellow"/>
+              </w:rPr>
+              <w:t xml:space="preserve"> </w:t>
+            </w:r>
+          </w:p>
+        </w:tc>
+      </w:tr>
+      <w:tr>
+        <w:trPr>
+          <w:cantSplit w:val="true"/>
+        </w:trPr>
+        <w:tc>
+          <w:tcPr>
+            <w:tcW w:w="600" w:type="dxa"/>
+            <w:tcBorders>
+              <w:top w:val="single" w:sz="4" w:space="0" w:color="8C8C8C"/>
+              <w:left w:val="single" w:sz="4" w:space="0" w:color="8C8C8C"/>
+              <w:bottom w:val="single" w:sz="4" w:space="0" w:color="8C8C8C"/>
+              <w:right w:val="single" w:sz="4" w:space="0" w:color="8C8C8C"/>
+            </w:tcBorders>
+            <w:vAlign w:val="center"/>
+          </w:tcPr>
+          <w:p>
+            <w:pPr>
+              <w:pStyle w:val="Normal"/>
+              <w:keepNext w:val="true"/>
+              <w:keepLines/>
+              <w:spacing w:lineRule="auto" w:line="240" w:before="0" w:after="0"/>
+              <w:jc w:val="left"/>
+              <w:rPr/>
+            </w:pPr>
+            <w:r>
+              <w:rPr>
+                <w:rFonts w:eastAsia="Times New Roman" w:cs="Times New Roman"/>
+                <w:b w:val="false"/>
+                <w:bCs w:val="false"/>
+                <w:sz w:val="20"/>
+                <w:szCs w:val="20"/>
+              </w:rPr>
+              <w:t>10</w:t>
+            </w:r>
+          </w:p>
+        </w:tc>
+        <w:tc>
+          <w:tcPr>
+            <w:tcW w:w="800" w:type="dxa"/>
+            <w:tcBorders>
+              <w:top w:val="single" w:sz="4" w:space="0" w:color="8C8C8C"/>
+              <w:left w:val="single" w:sz="4" w:space="0" w:color="8C8C8C"/>
+              <w:bottom w:val="single" w:sz="4" w:space="0" w:color="8C8C8C"/>
+              <w:right w:val="single" w:sz="4" w:space="0" w:color="8C8C8C"/>
+            </w:tcBorders>
+            <w:vAlign w:val="center"/>
+          </w:tcPr>
+          <w:p>
+            <w:pPr>
+              <w:pStyle w:val="Normal"/>
+              <w:keepNext w:val="true"/>
+              <w:keepLines/>
+              <w:spacing w:lineRule="auto" w:line="240" w:before="0" w:after="0"/>
+              <w:jc w:val="left"/>
+              <w:rPr/>
+            </w:pPr>
+            <w:r>
+              <w:rPr>
+                <w:rFonts w:eastAsia="Times New Roman" w:cs="Times New Roman"/>
+                <w:b w:val="false"/>
+                <w:bCs w:val="false"/>
+                <w:sz w:val="20"/>
+                <w:szCs w:val="20"/>
+                <w:highlight w:val="yellow"/>
+              </w:rPr>
+              <w:t xml:space="preserve"> </w:t>
+            </w:r>
+          </w:p>
+        </w:tc>
+        <w:tc>
+          <w:tcPr>
+            <w:tcW w:w="2269" w:type="dxa"/>
+            <w:tcBorders>
+              <w:top w:val="single" w:sz="4" w:space="0" w:color="8C8C8C"/>
+              <w:left w:val="single" w:sz="4" w:space="0" w:color="8C8C8C"/>
+              <w:bottom w:val="single" w:sz="4" w:space="0" w:color="8C8C8C"/>
+              <w:right w:val="single" w:sz="4" w:space="0" w:color="8C8C8C"/>
+            </w:tcBorders>
+            <w:vAlign w:val="center"/>
+          </w:tcPr>
+          <w:p>
+            <w:pPr>
+              <w:pStyle w:val="Normal"/>
+              <w:keepNext w:val="true"/>
+              <w:keepLines/>
+              <w:spacing w:lineRule="auto" w:line="240" w:before="0" w:after="0"/>
+              <w:jc w:val="left"/>
+              <w:rPr/>
+            </w:pPr>
+            <w:r>
+              <w:rPr>
+                <w:rFonts w:eastAsia="Times New Roman" w:cs="Times New Roman"/>
+                <w:b w:val="false"/>
+                <w:bCs w:val="false"/>
+                <w:sz w:val="20"/>
+                <w:szCs w:val="20"/>
+                <w:highlight w:val="yellow"/>
+              </w:rPr>
+              <w:t xml:space="preserve"> </w:t>
+            </w:r>
+          </w:p>
+        </w:tc>
+        <w:tc>
+          <w:tcPr>
+            <w:tcW w:w="1301" w:type="dxa"/>
+            <w:tcBorders>
+              <w:top w:val="single" w:sz="4" w:space="0" w:color="8C8C8C"/>
+              <w:left w:val="single" w:sz="4" w:space="0" w:color="8C8C8C"/>
+              <w:bottom w:val="single" w:sz="4" w:space="0" w:color="8C8C8C"/>
+              <w:right w:val="single" w:sz="4" w:space="0" w:color="8C8C8C"/>
+            </w:tcBorders>
+            <w:vAlign w:val="center"/>
+          </w:tcPr>
+          <w:p>
+            <w:pPr>
+              <w:pStyle w:val="Normal"/>
+              <w:keepNext w:val="true"/>
+              <w:keepLines/>
+              <w:spacing w:lineRule="auto" w:line="240" w:before="0" w:after="0"/>
+              <w:jc w:val="left"/>
+              <w:rPr/>
+            </w:pPr>
+            <w:r>
+              <w:rPr>
+                <w:rFonts w:eastAsia="Times New Roman" w:cs="Times New Roman"/>
+                <w:b w:val="false"/>
+                <w:bCs w:val="false"/>
+                <w:sz w:val="20"/>
+                <w:szCs w:val="20"/>
+                <w:highlight w:val="yellow"/>
+              </w:rPr>
+              <w:t xml:space="preserve"> </w:t>
+            </w:r>
+          </w:p>
+        </w:tc>
+        <w:tc>
+          <w:tcPr>
+            <w:tcW w:w="1499" w:type="dxa"/>
+            <w:tcBorders>
+              <w:top w:val="single" w:sz="4" w:space="0" w:color="8C8C8C"/>
+              <w:left w:val="single" w:sz="4" w:space="0" w:color="8C8C8C"/>
+              <w:bottom w:val="single" w:sz="4" w:space="0" w:color="8C8C8C"/>
+              <w:right w:val="single" w:sz="4" w:space="0" w:color="8C8C8C"/>
+            </w:tcBorders>
+            <w:vAlign w:val="center"/>
+          </w:tcPr>
+          <w:p>
+            <w:pPr>
+              <w:pStyle w:val="Normal"/>
+              <w:keepNext w:val="true"/>
+              <w:keepLines/>
+              <w:spacing w:lineRule="auto" w:line="240" w:before="0" w:after="0"/>
+              <w:jc w:val="left"/>
+              <w:rPr/>
+            </w:pPr>
+            <w:r>
+              <w:rPr>
+                <w:rFonts w:eastAsia="Times New Roman" w:cs="Times New Roman"/>
+                <w:b w:val="false"/>
+                <w:bCs w:val="false"/>
+                <w:sz w:val="20"/>
+                <w:szCs w:val="20"/>
+                <w:highlight w:val="yellow"/>
+              </w:rPr>
+              <w:t xml:space="preserve"> </w:t>
+            </w:r>
+          </w:p>
+        </w:tc>
+        <w:tc>
+          <w:tcPr>
+            <w:tcW w:w="1301" w:type="dxa"/>
+            <w:tcBorders>
+              <w:top w:val="single" w:sz="4" w:space="0" w:color="8C8C8C"/>
+              <w:left w:val="single" w:sz="4" w:space="0" w:color="8C8C8C"/>
+              <w:bottom w:val="single" w:sz="4" w:space="0" w:color="8C8C8C"/>
+              <w:right w:val="single" w:sz="4" w:space="0" w:color="8C8C8C"/>
+            </w:tcBorders>
+            <w:vAlign w:val="center"/>
+          </w:tcPr>
+          <w:p>
+            <w:pPr>
+              <w:pStyle w:val="Normal"/>
+              <w:keepNext w:val="true"/>
+              <w:keepLines/>
+              <w:spacing w:lineRule="auto" w:line="240" w:before="0" w:after="0"/>
+              <w:jc w:val="left"/>
+              <w:rPr/>
+            </w:pPr>
+            <w:r>
+              <w:rPr>
+                <w:rFonts w:eastAsia="Times New Roman" w:cs="Times New Roman"/>
+                <w:b w:val="false"/>
+                <w:bCs w:val="false"/>
+                <w:sz w:val="20"/>
+                <w:szCs w:val="20"/>
+                <w:highlight w:val="yellow"/>
+              </w:rPr>
+              <w:t xml:space="preserve"> </w:t>
+            </w:r>
+          </w:p>
+        </w:tc>
+        <w:tc>
+          <w:tcPr>
+            <w:tcW w:w="1299" w:type="dxa"/>
+            <w:tcBorders>
+              <w:top w:val="single" w:sz="4" w:space="0" w:color="8C8C8C"/>
+              <w:left w:val="single" w:sz="4" w:space="0" w:color="8C8C8C"/>
+              <w:bottom w:val="single" w:sz="4" w:space="0" w:color="8C8C8C"/>
+              <w:right w:val="single" w:sz="4" w:space="0" w:color="8C8C8C"/>
+            </w:tcBorders>
+            <w:vAlign w:val="center"/>
+          </w:tcPr>
+          <w:p>
+            <w:pPr>
+              <w:pStyle w:val="Normal"/>
+              <w:keepNext w:val="true"/>
+              <w:keepLines/>
+              <w:spacing w:lineRule="auto" w:line="240" w:before="0" w:after="0"/>
+              <w:jc w:val="left"/>
+              <w:rPr/>
+            </w:pPr>
+            <w:r>
+              <w:rPr>
+                <w:rFonts w:eastAsia="Times New Roman" w:cs="Times New Roman"/>
+                <w:b w:val="false"/>
+                <w:bCs w:val="false"/>
+                <w:sz w:val="20"/>
+                <w:szCs w:val="20"/>
+                <w:highlight w:val="yellow"/>
+              </w:rPr>
+              <w:t xml:space="preserve"> </w:t>
+            </w:r>
+          </w:p>
+        </w:tc>
+      </w:tr>
+      <w:tr>
+        <w:trPr>
+          <w:cantSplit w:val="true"/>
+        </w:trPr>
+        <w:tc>
+          <w:tcPr>
+            <w:tcW w:w="600" w:type="dxa"/>
+            <w:tcBorders>
+              <w:top w:val="single" w:sz="4" w:space="0" w:color="8C8C8C"/>
+              <w:left w:val="single" w:sz="4" w:space="0" w:color="8C8C8C"/>
+              <w:bottom w:val="single" w:sz="4" w:space="0" w:color="8C8C8C"/>
+              <w:right w:val="single" w:sz="4" w:space="0" w:color="8C8C8C"/>
+            </w:tcBorders>
+            <w:vAlign w:val="center"/>
+          </w:tcPr>
+          <w:p>
+            <w:pPr>
+              <w:pStyle w:val="Normal"/>
+              <w:keepNext w:val="true"/>
+              <w:keepLines/>
+              <w:spacing w:lineRule="auto" w:line="240" w:before="0" w:after="0"/>
+              <w:jc w:val="left"/>
+              <w:rPr/>
+            </w:pPr>
+            <w:r>
+              <w:rPr>
+                <w:rFonts w:eastAsia="Times New Roman" w:cs="Times New Roman"/>
+                <w:b w:val="false"/>
+                <w:bCs w:val="false"/>
+                <w:sz w:val="20"/>
+                <w:szCs w:val="20"/>
+              </w:rPr>
+              <w:t>11</w:t>
+            </w:r>
+          </w:p>
+        </w:tc>
+        <w:tc>
+          <w:tcPr>
+            <w:tcW w:w="800" w:type="dxa"/>
+            <w:tcBorders>
+              <w:top w:val="single" w:sz="4" w:space="0" w:color="8C8C8C"/>
+              <w:left w:val="single" w:sz="4" w:space="0" w:color="8C8C8C"/>
+              <w:bottom w:val="single" w:sz="4" w:space="0" w:color="8C8C8C"/>
+              <w:right w:val="single" w:sz="4" w:space="0" w:color="8C8C8C"/>
+            </w:tcBorders>
+            <w:vAlign w:val="center"/>
+          </w:tcPr>
+          <w:p>
+            <w:pPr>
+              <w:pStyle w:val="Normal"/>
+              <w:keepNext w:val="true"/>
+              <w:keepLines/>
+              <w:spacing w:lineRule="auto" w:line="240" w:before="0" w:after="0"/>
+              <w:jc w:val="left"/>
+              <w:rPr/>
+            </w:pPr>
+            <w:r>
+              <w:rPr>
+                <w:rFonts w:eastAsia="Times New Roman" w:cs="Times New Roman"/>
+                <w:b w:val="false"/>
+                <w:bCs w:val="false"/>
+                <w:sz w:val="20"/>
+                <w:szCs w:val="20"/>
+                <w:highlight w:val="yellow"/>
+              </w:rPr>
+              <w:t xml:space="preserve"> </w:t>
+            </w:r>
+          </w:p>
+        </w:tc>
+        <w:tc>
+          <w:tcPr>
+            <w:tcW w:w="2269" w:type="dxa"/>
+            <w:tcBorders>
+              <w:top w:val="single" w:sz="4" w:space="0" w:color="8C8C8C"/>
+              <w:left w:val="single" w:sz="4" w:space="0" w:color="8C8C8C"/>
+              <w:bottom w:val="single" w:sz="4" w:space="0" w:color="8C8C8C"/>
+              <w:right w:val="single" w:sz="4" w:space="0" w:color="8C8C8C"/>
+            </w:tcBorders>
+            <w:vAlign w:val="center"/>
+          </w:tcPr>
+          <w:p>
+            <w:pPr>
+              <w:pStyle w:val="Normal"/>
+              <w:keepNext w:val="true"/>
+              <w:keepLines/>
+              <w:spacing w:lineRule="auto" w:line="240" w:before="0" w:after="0"/>
+              <w:jc w:val="left"/>
+              <w:rPr/>
+            </w:pPr>
+            <w:r>
+              <w:rPr>
+                <w:rFonts w:eastAsia="Times New Roman" w:cs="Times New Roman"/>
+                <w:b w:val="false"/>
+                <w:bCs w:val="false"/>
+                <w:sz w:val="20"/>
+                <w:szCs w:val="20"/>
+                <w:highlight w:val="yellow"/>
+              </w:rPr>
+              <w:t xml:space="preserve"> </w:t>
+            </w:r>
+          </w:p>
+        </w:tc>
+        <w:tc>
+          <w:tcPr>
+            <w:tcW w:w="1301" w:type="dxa"/>
+            <w:tcBorders>
+              <w:top w:val="single" w:sz="4" w:space="0" w:color="8C8C8C"/>
+              <w:left w:val="single" w:sz="4" w:space="0" w:color="8C8C8C"/>
+              <w:bottom w:val="single" w:sz="4" w:space="0" w:color="8C8C8C"/>
+              <w:right w:val="single" w:sz="4" w:space="0" w:color="8C8C8C"/>
+            </w:tcBorders>
+            <w:vAlign w:val="center"/>
+          </w:tcPr>
+          <w:p>
+            <w:pPr>
+              <w:pStyle w:val="Normal"/>
+              <w:keepNext w:val="true"/>
+              <w:keepLines/>
+              <w:spacing w:lineRule="auto" w:line="240" w:before="0" w:after="0"/>
+              <w:jc w:val="left"/>
+              <w:rPr/>
+            </w:pPr>
+            <w:r>
+              <w:rPr>
+                <w:rFonts w:eastAsia="Times New Roman" w:cs="Times New Roman"/>
+                <w:b w:val="false"/>
+                <w:bCs w:val="false"/>
+                <w:sz w:val="20"/>
+                <w:szCs w:val="20"/>
+                <w:highlight w:val="yellow"/>
+              </w:rPr>
+              <w:t xml:space="preserve"> </w:t>
+            </w:r>
+          </w:p>
+        </w:tc>
+        <w:tc>
+          <w:tcPr>
+            <w:tcW w:w="1499" w:type="dxa"/>
+            <w:tcBorders>
+              <w:top w:val="single" w:sz="4" w:space="0" w:color="8C8C8C"/>
+              <w:left w:val="single" w:sz="4" w:space="0" w:color="8C8C8C"/>
+              <w:bottom w:val="single" w:sz="4" w:space="0" w:color="8C8C8C"/>
+              <w:right w:val="single" w:sz="4" w:space="0" w:color="8C8C8C"/>
+            </w:tcBorders>
+            <w:vAlign w:val="center"/>
+          </w:tcPr>
+          <w:p>
+            <w:pPr>
+              <w:pStyle w:val="Normal"/>
+              <w:keepNext w:val="true"/>
+              <w:keepLines/>
+              <w:spacing w:lineRule="auto" w:line="240" w:before="0" w:after="0"/>
+              <w:jc w:val="left"/>
+              <w:rPr/>
+            </w:pPr>
+            <w:r>
+              <w:rPr>
+                <w:rFonts w:eastAsia="Times New Roman" w:cs="Times New Roman"/>
+                <w:b w:val="false"/>
+                <w:bCs w:val="false"/>
+                <w:sz w:val="20"/>
+                <w:szCs w:val="20"/>
+                <w:highlight w:val="yellow"/>
+              </w:rPr>
+              <w:t xml:space="preserve"> </w:t>
+            </w:r>
+          </w:p>
+        </w:tc>
+        <w:tc>
+          <w:tcPr>
+            <w:tcW w:w="1301" w:type="dxa"/>
+            <w:tcBorders>
+              <w:top w:val="single" w:sz="4" w:space="0" w:color="8C8C8C"/>
+              <w:left w:val="single" w:sz="4" w:space="0" w:color="8C8C8C"/>
+              <w:bottom w:val="single" w:sz="4" w:space="0" w:color="8C8C8C"/>
+              <w:right w:val="single" w:sz="4" w:space="0" w:color="8C8C8C"/>
+            </w:tcBorders>
+            <w:vAlign w:val="center"/>
+          </w:tcPr>
+          <w:p>
+            <w:pPr>
+              <w:pStyle w:val="Normal"/>
+              <w:keepNext w:val="true"/>
+              <w:keepLines/>
+              <w:spacing w:lineRule="auto" w:line="240" w:before="0" w:after="0"/>
+              <w:jc w:val="left"/>
+              <w:rPr/>
+            </w:pPr>
+            <w:r>
+              <w:rPr>
+                <w:rFonts w:eastAsia="Times New Roman" w:cs="Times New Roman"/>
+                <w:b w:val="false"/>
+                <w:bCs w:val="false"/>
+                <w:sz w:val="20"/>
+                <w:szCs w:val="20"/>
+                <w:highlight w:val="yellow"/>
+              </w:rPr>
+              <w:t xml:space="preserve"> </w:t>
+            </w:r>
+          </w:p>
+        </w:tc>
+        <w:tc>
+          <w:tcPr>
+            <w:tcW w:w="1299" w:type="dxa"/>
+            <w:tcBorders>
+              <w:top w:val="single" w:sz="4" w:space="0" w:color="8C8C8C"/>
+              <w:left w:val="single" w:sz="4" w:space="0" w:color="8C8C8C"/>
+              <w:bottom w:val="single" w:sz="4" w:space="0" w:color="8C8C8C"/>
+              <w:right w:val="single" w:sz="4" w:space="0" w:color="8C8C8C"/>
+            </w:tcBorders>
+            <w:vAlign w:val="center"/>
+          </w:tcPr>
+          <w:p>
+            <w:pPr>
+              <w:pStyle w:val="Normal"/>
+              <w:keepNext w:val="true"/>
+              <w:keepLines/>
+              <w:spacing w:lineRule="auto" w:line="240" w:before="0" w:after="0"/>
+              <w:jc w:val="left"/>
+              <w:rPr/>
+            </w:pPr>
+            <w:r>
+              <w:rPr>
+                <w:rFonts w:eastAsia="Times New Roman" w:cs="Times New Roman"/>
+                <w:b w:val="false"/>
+                <w:bCs w:val="false"/>
+                <w:sz w:val="20"/>
+                <w:szCs w:val="20"/>
+                <w:highlight w:val="yellow"/>
+              </w:rPr>
+              <w:t xml:space="preserve"> </w:t>
+            </w:r>
+          </w:p>
+        </w:tc>
+      </w:tr>
+      <w:tr>
+        <w:trPr>
+          <w:cantSplit w:val="true"/>
+        </w:trPr>
+        <w:tc>
+          <w:tcPr>
+            <w:tcW w:w="600" w:type="dxa"/>
+            <w:tcBorders>
+              <w:top w:val="single" w:sz="4" w:space="0" w:color="8C8C8C"/>
+              <w:left w:val="single" w:sz="4" w:space="0" w:color="8C8C8C"/>
+              <w:bottom w:val="single" w:sz="4" w:space="0" w:color="8C8C8C"/>
+              <w:right w:val="single" w:sz="4" w:space="0" w:color="8C8C8C"/>
+            </w:tcBorders>
+            <w:vAlign w:val="center"/>
+          </w:tcPr>
+          <w:p>
+            <w:pPr>
+              <w:pStyle w:val="Normal"/>
+              <w:keepNext w:val="true"/>
+              <w:keepLines/>
+              <w:spacing w:lineRule="auto" w:line="240" w:before="0" w:after="0"/>
+              <w:jc w:val="left"/>
+              <w:rPr/>
+            </w:pPr>
+            <w:r>
+              <w:rPr>
+                <w:rFonts w:eastAsia="Times New Roman" w:cs="Times New Roman"/>
+                <w:b w:val="false"/>
+                <w:bCs w:val="false"/>
+                <w:sz w:val="20"/>
+                <w:szCs w:val="20"/>
+              </w:rPr>
+              <w:t>12</w:t>
+            </w:r>
+          </w:p>
+        </w:tc>
+        <w:tc>
+          <w:tcPr>
+            <w:tcW w:w="800" w:type="dxa"/>
+            <w:tcBorders>
+              <w:top w:val="single" w:sz="4" w:space="0" w:color="8C8C8C"/>
+              <w:left w:val="single" w:sz="4" w:space="0" w:color="8C8C8C"/>
+              <w:bottom w:val="single" w:sz="4" w:space="0" w:color="8C8C8C"/>
+              <w:right w:val="single" w:sz="4" w:space="0" w:color="8C8C8C"/>
+            </w:tcBorders>
+            <w:vAlign w:val="center"/>
+          </w:tcPr>
+          <w:p>
+            <w:pPr>
+              <w:pStyle w:val="Normal"/>
+              <w:keepNext w:val="true"/>
+              <w:keepLines/>
+              <w:spacing w:lineRule="auto" w:line="240" w:before="0" w:after="0"/>
+              <w:jc w:val="left"/>
+              <w:rPr/>
+            </w:pPr>
+            <w:r>
+              <w:rPr>
+                <w:rFonts w:eastAsia="Times New Roman" w:cs="Times New Roman"/>
+                <w:b w:val="false"/>
+                <w:bCs w:val="false"/>
+                <w:sz w:val="20"/>
+                <w:szCs w:val="20"/>
+                <w:highlight w:val="yellow"/>
+              </w:rPr>
+              <w:t xml:space="preserve"> </w:t>
+            </w:r>
+          </w:p>
+        </w:tc>
+        <w:tc>
+          <w:tcPr>
+            <w:tcW w:w="2269" w:type="dxa"/>
+            <w:tcBorders>
+              <w:top w:val="single" w:sz="4" w:space="0" w:color="8C8C8C"/>
+              <w:left w:val="single" w:sz="4" w:space="0" w:color="8C8C8C"/>
+              <w:bottom w:val="single" w:sz="4" w:space="0" w:color="8C8C8C"/>
+              <w:right w:val="single" w:sz="4" w:space="0" w:color="8C8C8C"/>
+            </w:tcBorders>
+            <w:vAlign w:val="center"/>
+          </w:tcPr>
+          <w:p>
+            <w:pPr>
+              <w:pStyle w:val="Normal"/>
+              <w:keepNext w:val="true"/>
+              <w:keepLines/>
+              <w:spacing w:lineRule="auto" w:line="240" w:before="0" w:after="0"/>
+              <w:jc w:val="left"/>
+              <w:rPr/>
+            </w:pPr>
+            <w:r>
+              <w:rPr>
+                <w:rFonts w:eastAsia="Times New Roman" w:cs="Times New Roman"/>
+                <w:b w:val="false"/>
+                <w:bCs w:val="false"/>
+                <w:sz w:val="20"/>
+                <w:szCs w:val="20"/>
+                <w:highlight w:val="yellow"/>
+              </w:rPr>
+              <w:t xml:space="preserve"> </w:t>
+            </w:r>
+          </w:p>
+        </w:tc>
+        <w:tc>
+          <w:tcPr>
+            <w:tcW w:w="1301" w:type="dxa"/>
+            <w:tcBorders>
+              <w:top w:val="single" w:sz="4" w:space="0" w:color="8C8C8C"/>
+              <w:left w:val="single" w:sz="4" w:space="0" w:color="8C8C8C"/>
+              <w:bottom w:val="single" w:sz="4" w:space="0" w:color="8C8C8C"/>
+              <w:right w:val="single" w:sz="4" w:space="0" w:color="8C8C8C"/>
+            </w:tcBorders>
+            <w:vAlign w:val="center"/>
+          </w:tcPr>
+          <w:p>
+            <w:pPr>
+              <w:pStyle w:val="Normal"/>
+              <w:keepNext w:val="true"/>
+              <w:keepLines/>
+              <w:spacing w:lineRule="auto" w:line="240" w:before="0" w:after="0"/>
+              <w:jc w:val="left"/>
+              <w:rPr/>
+            </w:pPr>
+            <w:r>
+              <w:rPr>
+                <w:rFonts w:eastAsia="Times New Roman" w:cs="Times New Roman"/>
+                <w:b w:val="false"/>
+                <w:bCs w:val="false"/>
+                <w:sz w:val="20"/>
+                <w:szCs w:val="20"/>
+                <w:highlight w:val="yellow"/>
+              </w:rPr>
+              <w:t xml:space="preserve"> </w:t>
+            </w:r>
+          </w:p>
+        </w:tc>
+        <w:tc>
+          <w:tcPr>
+            <w:tcW w:w="1499" w:type="dxa"/>
+            <w:tcBorders>
+              <w:top w:val="single" w:sz="4" w:space="0" w:color="8C8C8C"/>
+              <w:left w:val="single" w:sz="4" w:space="0" w:color="8C8C8C"/>
+              <w:bottom w:val="single" w:sz="4" w:space="0" w:color="8C8C8C"/>
+              <w:right w:val="single" w:sz="4" w:space="0" w:color="8C8C8C"/>
+            </w:tcBorders>
+            <w:vAlign w:val="center"/>
+          </w:tcPr>
+          <w:p>
+            <w:pPr>
+              <w:pStyle w:val="Normal"/>
+              <w:keepNext w:val="true"/>
+              <w:keepLines/>
+              <w:spacing w:lineRule="auto" w:line="240" w:before="0" w:after="0"/>
+              <w:jc w:val="left"/>
+              <w:rPr/>
+            </w:pPr>
+            <w:r>
+              <w:rPr>
+                <w:rFonts w:eastAsia="Times New Roman" w:cs="Times New Roman"/>
+                <w:b w:val="false"/>
+                <w:bCs w:val="false"/>
+                <w:sz w:val="20"/>
+                <w:szCs w:val="20"/>
+                <w:highlight w:val="yellow"/>
+              </w:rPr>
+              <w:t xml:space="preserve"> </w:t>
+            </w:r>
+          </w:p>
+        </w:tc>
+        <w:tc>
+          <w:tcPr>
+            <w:tcW w:w="1301" w:type="dxa"/>
+            <w:tcBorders>
+              <w:top w:val="single" w:sz="4" w:space="0" w:color="8C8C8C"/>
+              <w:left w:val="single" w:sz="4" w:space="0" w:color="8C8C8C"/>
+              <w:bottom w:val="single" w:sz="4" w:space="0" w:color="8C8C8C"/>
+              <w:right w:val="single" w:sz="4" w:space="0" w:color="8C8C8C"/>
+            </w:tcBorders>
+            <w:vAlign w:val="center"/>
+          </w:tcPr>
+          <w:p>
+            <w:pPr>
+              <w:pStyle w:val="Normal"/>
+              <w:keepNext w:val="true"/>
+              <w:keepLines/>
+              <w:spacing w:lineRule="auto" w:line="240" w:before="0" w:after="0"/>
+              <w:jc w:val="left"/>
+              <w:rPr/>
+            </w:pPr>
+            <w:r>
+              <w:rPr>
+                <w:rFonts w:eastAsia="Times New Roman" w:cs="Times New Roman"/>
+                <w:b w:val="false"/>
+                <w:bCs w:val="false"/>
+                <w:sz w:val="20"/>
+                <w:szCs w:val="20"/>
+                <w:highlight w:val="yellow"/>
+              </w:rPr>
+              <w:t xml:space="preserve"> </w:t>
+            </w:r>
+          </w:p>
+        </w:tc>
+        <w:tc>
+          <w:tcPr>
+            <w:tcW w:w="1299" w:type="dxa"/>
+            <w:tcBorders>
+              <w:top w:val="single" w:sz="4" w:space="0" w:color="8C8C8C"/>
+              <w:left w:val="single" w:sz="4" w:space="0" w:color="8C8C8C"/>
+              <w:bottom w:val="single" w:sz="4" w:space="0" w:color="8C8C8C"/>
+              <w:right w:val="single" w:sz="4" w:space="0" w:color="8C8C8C"/>
+            </w:tcBorders>
+            <w:vAlign w:val="center"/>
+          </w:tcPr>
+          <w:p>
+            <w:pPr>
+              <w:pStyle w:val="Normal"/>
+              <w:keepNext w:val="true"/>
+              <w:keepLines/>
+              <w:spacing w:lineRule="auto" w:line="240" w:before="0" w:after="0"/>
+              <w:jc w:val="left"/>
+              <w:rPr/>
+            </w:pPr>
+            <w:r>
+              <w:rPr>
+                <w:rFonts w:eastAsia="Times New Roman" w:cs="Times New Roman"/>
+                <w:b w:val="false"/>
+                <w:bCs w:val="false"/>
+                <w:sz w:val="20"/>
+                <w:szCs w:val="20"/>
+                <w:highlight w:val="yellow"/>
+              </w:rPr>
+              <w:t xml:space="preserve"> </w:t>
+            </w:r>
+          </w:p>
+        </w:tc>
+      </w:tr>
+      <w:tr>
+        <w:trPr>
+          <w:cantSplit w:val="true"/>
+        </w:trPr>
+        <w:tc>
+          <w:tcPr>
+            <w:tcW w:w="600" w:type="dxa"/>
+            <w:tcBorders>
+              <w:top w:val="single" w:sz="4" w:space="0" w:color="8C8C8C"/>
+              <w:left w:val="single" w:sz="4" w:space="0" w:color="8C8C8C"/>
+              <w:bottom w:val="single" w:sz="4" w:space="0" w:color="8C8C8C"/>
+              <w:right w:val="single" w:sz="4" w:space="0" w:color="8C8C8C"/>
+            </w:tcBorders>
+            <w:vAlign w:val="center"/>
+          </w:tcPr>
+          <w:p>
+            <w:pPr>
+              <w:pStyle w:val="Normal"/>
+              <w:keepNext w:val="true"/>
+              <w:keepLines/>
+              <w:spacing w:lineRule="auto" w:line="240" w:before="0" w:after="0"/>
+              <w:jc w:val="left"/>
+              <w:rPr/>
+            </w:pPr>
+            <w:r>
+              <w:rPr>
+                <w:rFonts w:eastAsia="Times New Roman" w:cs="Times New Roman"/>
+                <w:b w:val="false"/>
+                <w:bCs w:val="false"/>
+                <w:sz w:val="20"/>
+                <w:szCs w:val="20"/>
+              </w:rPr>
+              <w:t>13</w:t>
+            </w:r>
+          </w:p>
+        </w:tc>
+        <w:tc>
+          <w:tcPr>
+            <w:tcW w:w="800" w:type="dxa"/>
+            <w:tcBorders>
+              <w:top w:val="single" w:sz="4" w:space="0" w:color="8C8C8C"/>
+              <w:left w:val="single" w:sz="4" w:space="0" w:color="8C8C8C"/>
+              <w:bottom w:val="single" w:sz="4" w:space="0" w:color="8C8C8C"/>
+              <w:right w:val="single" w:sz="4" w:space="0" w:color="8C8C8C"/>
+            </w:tcBorders>
+            <w:vAlign w:val="center"/>
+          </w:tcPr>
+          <w:p>
+            <w:pPr>
+              <w:pStyle w:val="Normal"/>
+              <w:keepNext w:val="true"/>
+              <w:keepLines/>
+              <w:spacing w:lineRule="auto" w:line="240" w:before="0" w:after="0"/>
+              <w:jc w:val="left"/>
+              <w:rPr/>
+            </w:pPr>
+            <w:r>
+              <w:rPr>
+                <w:rFonts w:eastAsia="Times New Roman" w:cs="Times New Roman"/>
+                <w:b w:val="false"/>
+                <w:bCs w:val="false"/>
+                <w:sz w:val="20"/>
+                <w:szCs w:val="20"/>
+                <w:highlight w:val="yellow"/>
+              </w:rPr>
+              <w:t xml:space="preserve"> </w:t>
+            </w:r>
+          </w:p>
+        </w:tc>
+        <w:tc>
+          <w:tcPr>
+            <w:tcW w:w="2269" w:type="dxa"/>
+            <w:tcBorders>
+              <w:top w:val="single" w:sz="4" w:space="0" w:color="8C8C8C"/>
+              <w:left w:val="single" w:sz="4" w:space="0" w:color="8C8C8C"/>
+              <w:bottom w:val="single" w:sz="4" w:space="0" w:color="8C8C8C"/>
+              <w:right w:val="single" w:sz="4" w:space="0" w:color="8C8C8C"/>
+            </w:tcBorders>
+            <w:vAlign w:val="center"/>
+          </w:tcPr>
+          <w:p>
+            <w:pPr>
+              <w:pStyle w:val="Normal"/>
+              <w:keepNext w:val="true"/>
+              <w:keepLines/>
+              <w:spacing w:lineRule="auto" w:line="240" w:before="0" w:after="0"/>
+              <w:jc w:val="left"/>
+              <w:rPr/>
+            </w:pPr>
+            <w:r>
+              <w:rPr>
+                <w:rFonts w:eastAsia="Times New Roman" w:cs="Times New Roman"/>
+                <w:b w:val="false"/>
+                <w:bCs w:val="false"/>
+                <w:sz w:val="20"/>
+                <w:szCs w:val="20"/>
+                <w:highlight w:val="yellow"/>
+              </w:rPr>
+              <w:t xml:space="preserve"> </w:t>
+            </w:r>
+          </w:p>
+        </w:tc>
+        <w:tc>
+          <w:tcPr>
+            <w:tcW w:w="1301" w:type="dxa"/>
+            <w:tcBorders>
+              <w:top w:val="single" w:sz="4" w:space="0" w:color="8C8C8C"/>
+              <w:left w:val="single" w:sz="4" w:space="0" w:color="8C8C8C"/>
+              <w:bottom w:val="single" w:sz="4" w:space="0" w:color="8C8C8C"/>
+              <w:right w:val="single" w:sz="4" w:space="0" w:color="8C8C8C"/>
+            </w:tcBorders>
+            <w:vAlign w:val="center"/>
+          </w:tcPr>
+          <w:p>
+            <w:pPr>
+              <w:pStyle w:val="Normal"/>
+              <w:keepNext w:val="true"/>
+              <w:keepLines/>
+              <w:spacing w:lineRule="auto" w:line="240" w:before="0" w:after="0"/>
+              <w:jc w:val="left"/>
+              <w:rPr/>
+            </w:pPr>
+            <w:r>
+              <w:rPr>
+                <w:rFonts w:eastAsia="Times New Roman" w:cs="Times New Roman"/>
+                <w:b w:val="false"/>
+                <w:bCs w:val="false"/>
+                <w:sz w:val="20"/>
+                <w:szCs w:val="20"/>
+                <w:highlight w:val="yellow"/>
+              </w:rPr>
+              <w:t xml:space="preserve"> </w:t>
+            </w:r>
+          </w:p>
+        </w:tc>
+        <w:tc>
+          <w:tcPr>
+            <w:tcW w:w="1499" w:type="dxa"/>
+            <w:tcBorders>
+              <w:top w:val="single" w:sz="4" w:space="0" w:color="8C8C8C"/>
+              <w:left w:val="single" w:sz="4" w:space="0" w:color="8C8C8C"/>
+              <w:bottom w:val="single" w:sz="4" w:space="0" w:color="8C8C8C"/>
+              <w:right w:val="single" w:sz="4" w:space="0" w:color="8C8C8C"/>
+            </w:tcBorders>
+            <w:vAlign w:val="center"/>
+          </w:tcPr>
+          <w:p>
+            <w:pPr>
+              <w:pStyle w:val="Normal"/>
+              <w:keepNext w:val="true"/>
+              <w:keepLines/>
+              <w:spacing w:lineRule="auto" w:line="240" w:before="0" w:after="0"/>
+              <w:jc w:val="left"/>
+              <w:rPr/>
+            </w:pPr>
+            <w:r>
+              <w:rPr>
+                <w:rFonts w:eastAsia="Times New Roman" w:cs="Times New Roman"/>
+                <w:b w:val="false"/>
+                <w:bCs w:val="false"/>
+                <w:sz w:val="20"/>
+                <w:szCs w:val="20"/>
+                <w:highlight w:val="yellow"/>
+              </w:rPr>
+              <w:t xml:space="preserve"> </w:t>
+            </w:r>
+          </w:p>
+        </w:tc>
+        <w:tc>
+          <w:tcPr>
+            <w:tcW w:w="1301" w:type="dxa"/>
+            <w:tcBorders>
+              <w:top w:val="single" w:sz="4" w:space="0" w:color="8C8C8C"/>
+              <w:left w:val="single" w:sz="4" w:space="0" w:color="8C8C8C"/>
+              <w:bottom w:val="single" w:sz="4" w:space="0" w:color="8C8C8C"/>
+              <w:right w:val="single" w:sz="4" w:space="0" w:color="8C8C8C"/>
+            </w:tcBorders>
+            <w:vAlign w:val="center"/>
+          </w:tcPr>
+          <w:p>
+            <w:pPr>
+              <w:pStyle w:val="Normal"/>
+              <w:keepNext w:val="true"/>
+              <w:keepLines/>
+              <w:spacing w:lineRule="auto" w:line="240" w:before="0" w:after="0"/>
+              <w:jc w:val="left"/>
+              <w:rPr/>
+            </w:pPr>
+            <w:r>
+              <w:rPr>
+                <w:rFonts w:eastAsia="Times New Roman" w:cs="Times New Roman"/>
+                <w:b w:val="false"/>
+                <w:bCs w:val="false"/>
+                <w:sz w:val="20"/>
+                <w:szCs w:val="20"/>
+                <w:highlight w:val="yellow"/>
+              </w:rPr>
+              <w:t xml:space="preserve"> </w:t>
+            </w:r>
+          </w:p>
+        </w:tc>
+        <w:tc>
+          <w:tcPr>
+            <w:tcW w:w="1299" w:type="dxa"/>
+            <w:tcBorders>
+              <w:top w:val="single" w:sz="4" w:space="0" w:color="8C8C8C"/>
+              <w:left w:val="single" w:sz="4" w:space="0" w:color="8C8C8C"/>
+              <w:bottom w:val="single" w:sz="4" w:space="0" w:color="8C8C8C"/>
+              <w:right w:val="single" w:sz="4" w:space="0" w:color="8C8C8C"/>
+            </w:tcBorders>
+            <w:vAlign w:val="center"/>
+          </w:tcPr>
+          <w:p>
+            <w:pPr>
+              <w:pStyle w:val="Normal"/>
+              <w:keepNext w:val="true"/>
+              <w:keepLines/>
+              <w:spacing w:lineRule="auto" w:line="240" w:before="0" w:after="0"/>
+              <w:jc w:val="left"/>
+              <w:rPr/>
+            </w:pPr>
+            <w:r>
+              <w:rPr>
+                <w:rFonts w:eastAsia="Times New Roman" w:cs="Times New Roman"/>
+                <w:b w:val="false"/>
+                <w:bCs w:val="false"/>
+                <w:sz w:val="20"/>
+                <w:szCs w:val="20"/>
+                <w:highlight w:val="yellow"/>
+              </w:rPr>
+              <w:t xml:space="preserve"> </w:t>
+            </w:r>
+          </w:p>
+        </w:tc>
+      </w:tr>
+      <w:tr>
+        <w:trPr>
+          <w:cantSplit w:val="true"/>
+        </w:trPr>
+        <w:tc>
+          <w:tcPr>
+            <w:tcW w:w="600" w:type="dxa"/>
+            <w:tcBorders>
+              <w:top w:val="single" w:sz="4" w:space="0" w:color="8C8C8C"/>
+              <w:left w:val="single" w:sz="4" w:space="0" w:color="8C8C8C"/>
+              <w:bottom w:val="single" w:sz="4" w:space="0" w:color="8C8C8C"/>
+              <w:right w:val="single" w:sz="4" w:space="0" w:color="8C8C8C"/>
+            </w:tcBorders>
+            <w:vAlign w:val="center"/>
+          </w:tcPr>
+          <w:p>
+            <w:pPr>
+              <w:pStyle w:val="Normal"/>
+              <w:keepNext w:val="true"/>
+              <w:keepLines/>
+              <w:spacing w:lineRule="auto" w:line="240" w:before="0" w:after="0"/>
+              <w:jc w:val="left"/>
+              <w:rPr/>
+            </w:pPr>
+            <w:r>
+              <w:rPr>
+                <w:rFonts w:eastAsia="Times New Roman" w:cs="Times New Roman"/>
+                <w:b w:val="false"/>
+                <w:bCs w:val="false"/>
+                <w:sz w:val="20"/>
+                <w:szCs w:val="20"/>
+              </w:rPr>
+              <w:t>14</w:t>
+            </w:r>
+          </w:p>
+        </w:tc>
+        <w:tc>
+          <w:tcPr>
+            <w:tcW w:w="800" w:type="dxa"/>
+            <w:tcBorders>
+              <w:top w:val="single" w:sz="4" w:space="0" w:color="8C8C8C"/>
+              <w:left w:val="single" w:sz="4" w:space="0" w:color="8C8C8C"/>
+              <w:bottom w:val="single" w:sz="4" w:space="0" w:color="8C8C8C"/>
+              <w:right w:val="single" w:sz="4" w:space="0" w:color="8C8C8C"/>
+            </w:tcBorders>
+            <w:vAlign w:val="center"/>
+          </w:tcPr>
+          <w:p>
+            <w:pPr>
+              <w:pStyle w:val="Normal"/>
+              <w:keepNext w:val="true"/>
+              <w:keepLines/>
+              <w:spacing w:lineRule="auto" w:line="240" w:before="0" w:after="0"/>
+              <w:jc w:val="left"/>
+              <w:rPr/>
+            </w:pPr>
+            <w:r>
+              <w:rPr>
+                <w:rFonts w:eastAsia="Times New Roman" w:cs="Times New Roman"/>
+                <w:b w:val="false"/>
+                <w:bCs w:val="false"/>
+                <w:sz w:val="20"/>
+                <w:szCs w:val="20"/>
+                <w:highlight w:val="yellow"/>
+              </w:rPr>
+              <w:t xml:space="preserve"> </w:t>
+            </w:r>
+          </w:p>
+        </w:tc>
+        <w:tc>
+          <w:tcPr>
+            <w:tcW w:w="2269" w:type="dxa"/>
+            <w:tcBorders>
+              <w:top w:val="single" w:sz="4" w:space="0" w:color="8C8C8C"/>
+              <w:left w:val="single" w:sz="4" w:space="0" w:color="8C8C8C"/>
+              <w:bottom w:val="single" w:sz="4" w:space="0" w:color="8C8C8C"/>
+              <w:right w:val="single" w:sz="4" w:space="0" w:color="8C8C8C"/>
+            </w:tcBorders>
+            <w:vAlign w:val="center"/>
+          </w:tcPr>
+          <w:p>
+            <w:pPr>
+              <w:pStyle w:val="Normal"/>
+              <w:keepNext w:val="true"/>
+              <w:keepLines/>
+              <w:spacing w:lineRule="auto" w:line="240" w:before="0" w:after="0"/>
+              <w:jc w:val="left"/>
+              <w:rPr/>
+            </w:pPr>
+            <w:r>
+              <w:rPr>
+                <w:rFonts w:eastAsia="Times New Roman" w:cs="Times New Roman"/>
+                <w:b w:val="false"/>
+                <w:bCs w:val="false"/>
+                <w:sz w:val="20"/>
+                <w:szCs w:val="20"/>
+                <w:highlight w:val="yellow"/>
+              </w:rPr>
+              <w:t xml:space="preserve"> </w:t>
+            </w:r>
+          </w:p>
+        </w:tc>
+        <w:tc>
+          <w:tcPr>
+            <w:tcW w:w="1301" w:type="dxa"/>
+            <w:tcBorders>
+              <w:top w:val="single" w:sz="4" w:space="0" w:color="8C8C8C"/>
+              <w:left w:val="single" w:sz="4" w:space="0" w:color="8C8C8C"/>
+              <w:bottom w:val="single" w:sz="4" w:space="0" w:color="8C8C8C"/>
+              <w:right w:val="single" w:sz="4" w:space="0" w:color="8C8C8C"/>
+            </w:tcBorders>
+            <w:vAlign w:val="center"/>
+          </w:tcPr>
+          <w:p>
+            <w:pPr>
+              <w:pStyle w:val="Normal"/>
+              <w:keepNext w:val="true"/>
+              <w:keepLines/>
+              <w:spacing w:lineRule="auto" w:line="240" w:before="0" w:after="0"/>
+              <w:jc w:val="left"/>
+              <w:rPr/>
+            </w:pPr>
+            <w:r>
+              <w:rPr>
+                <w:rFonts w:eastAsia="Times New Roman" w:cs="Times New Roman"/>
+                <w:b w:val="false"/>
+                <w:bCs w:val="false"/>
+                <w:sz w:val="20"/>
+                <w:szCs w:val="20"/>
+                <w:highlight w:val="yellow"/>
+              </w:rPr>
+              <w:t xml:space="preserve"> </w:t>
+            </w:r>
+          </w:p>
+        </w:tc>
+        <w:tc>
+          <w:tcPr>
+            <w:tcW w:w="1499" w:type="dxa"/>
+            <w:tcBorders>
+              <w:top w:val="single" w:sz="4" w:space="0" w:color="8C8C8C"/>
+              <w:left w:val="single" w:sz="4" w:space="0" w:color="8C8C8C"/>
+              <w:bottom w:val="single" w:sz="4" w:space="0" w:color="8C8C8C"/>
+              <w:right w:val="single" w:sz="4" w:space="0" w:color="8C8C8C"/>
+            </w:tcBorders>
+            <w:vAlign w:val="center"/>
+          </w:tcPr>
+          <w:p>
+            <w:pPr>
+              <w:pStyle w:val="Normal"/>
+              <w:keepNext w:val="true"/>
+              <w:keepLines/>
+              <w:spacing w:lineRule="auto" w:line="240" w:before="0" w:after="0"/>
+              <w:jc w:val="left"/>
+              <w:rPr/>
+            </w:pPr>
+            <w:r>
+              <w:rPr>
+                <w:rFonts w:eastAsia="Times New Roman" w:cs="Times New Roman"/>
+                <w:b w:val="false"/>
+                <w:bCs w:val="false"/>
+                <w:sz w:val="20"/>
+                <w:szCs w:val="20"/>
+                <w:highlight w:val="yellow"/>
+              </w:rPr>
+              <w:t xml:space="preserve"> </w:t>
+            </w:r>
+          </w:p>
+        </w:tc>
+        <w:tc>
+          <w:tcPr>
+            <w:tcW w:w="1301" w:type="dxa"/>
+            <w:tcBorders>
+              <w:top w:val="single" w:sz="4" w:space="0" w:color="8C8C8C"/>
+              <w:left w:val="single" w:sz="4" w:space="0" w:color="8C8C8C"/>
+              <w:bottom w:val="single" w:sz="4" w:space="0" w:color="8C8C8C"/>
+              <w:right w:val="single" w:sz="4" w:space="0" w:color="8C8C8C"/>
+            </w:tcBorders>
+            <w:vAlign w:val="center"/>
+          </w:tcPr>
+          <w:p>
+            <w:pPr>
+              <w:pStyle w:val="Normal"/>
+              <w:keepNext w:val="true"/>
+              <w:keepLines/>
+              <w:spacing w:lineRule="auto" w:line="240" w:before="0" w:after="0"/>
+              <w:jc w:val="left"/>
+              <w:rPr/>
+            </w:pPr>
+            <w:r>
+              <w:rPr>
+                <w:rFonts w:eastAsia="Times New Roman" w:cs="Times New Roman"/>
+                <w:b w:val="false"/>
+                <w:bCs w:val="false"/>
+                <w:sz w:val="20"/>
+                <w:szCs w:val="20"/>
+                <w:highlight w:val="yellow"/>
+              </w:rPr>
+              <w:t xml:space="preserve"> </w:t>
+            </w:r>
+          </w:p>
+        </w:tc>
+        <w:tc>
+          <w:tcPr>
+            <w:tcW w:w="1299" w:type="dxa"/>
+            <w:tcBorders>
+              <w:top w:val="single" w:sz="4" w:space="0" w:color="8C8C8C"/>
+              <w:left w:val="single" w:sz="4" w:space="0" w:color="8C8C8C"/>
+              <w:bottom w:val="single" w:sz="4" w:space="0" w:color="8C8C8C"/>
+              <w:right w:val="single" w:sz="4" w:space="0" w:color="8C8C8C"/>
+            </w:tcBorders>
+            <w:vAlign w:val="center"/>
+          </w:tcPr>
+          <w:p>
+            <w:pPr>
+              <w:pStyle w:val="Normal"/>
+              <w:keepNext w:val="true"/>
+              <w:keepLines/>
+              <w:spacing w:lineRule="auto" w:line="240" w:before="0" w:after="0"/>
+              <w:jc w:val="left"/>
+              <w:rPr/>
+            </w:pPr>
+            <w:r>
+              <w:rPr>
+                <w:rFonts w:eastAsia="Times New Roman" w:cs="Times New Roman"/>
+                <w:b w:val="false"/>
+                <w:bCs w:val="false"/>
+                <w:sz w:val="20"/>
+                <w:szCs w:val="20"/>
+                <w:highlight w:val="yellow"/>
+              </w:rPr>
+              <w:t xml:space="preserve"> </w:t>
+            </w:r>
+          </w:p>
+        </w:tc>
+      </w:tr>
+      <w:tr>
+        <w:trPr>
+          <w:cantSplit w:val="true"/>
+        </w:trPr>
+        <w:tc>
+          <w:tcPr>
+            <w:tcW w:w="600" w:type="dxa"/>
+            <w:tcBorders>
+              <w:top w:val="single" w:sz="4" w:space="0" w:color="8C8C8C"/>
+              <w:left w:val="single" w:sz="4" w:space="0" w:color="8C8C8C"/>
+              <w:bottom w:val="single" w:sz="4" w:space="0" w:color="8C8C8C"/>
+              <w:right w:val="single" w:sz="4" w:space="0" w:color="8C8C8C"/>
+            </w:tcBorders>
+            <w:vAlign w:val="center"/>
+          </w:tcPr>
+          <w:p>
+            <w:pPr>
+              <w:pStyle w:val="Normal"/>
+              <w:keepNext w:val="false"/>
+              <w:keepLines/>
+              <w:spacing w:lineRule="auto" w:line="240" w:before="0" w:after="0"/>
+              <w:jc w:val="left"/>
+              <w:rPr/>
+            </w:pPr>
+            <w:r>
+              <w:rPr>
+                <w:rFonts w:eastAsia="Times New Roman" w:cs="Times New Roman"/>
+                <w:b w:val="false"/>
+                <w:bCs w:val="false"/>
+                <w:sz w:val="20"/>
+                <w:szCs w:val="20"/>
+              </w:rPr>
+              <w:t>15</w:t>
+            </w:r>
+          </w:p>
+        </w:tc>
+        <w:tc>
+          <w:tcPr>
+            <w:tcW w:w="800" w:type="dxa"/>
+            <w:tcBorders>
+              <w:top w:val="single" w:sz="4" w:space="0" w:color="8C8C8C"/>
+              <w:left w:val="single" w:sz="4" w:space="0" w:color="8C8C8C"/>
+              <w:bottom w:val="single" w:sz="4" w:space="0" w:color="8C8C8C"/>
+              <w:right w:val="single" w:sz="4" w:space="0" w:color="8C8C8C"/>
+            </w:tcBorders>
+            <w:vAlign w:val="center"/>
+          </w:tcPr>
+          <w:p>
+            <w:pPr>
+              <w:pStyle w:val="Normal"/>
+              <w:keepNext w:val="false"/>
+              <w:keepLines/>
+              <w:spacing w:lineRule="auto" w:line="240" w:before="0" w:after="0"/>
+              <w:jc w:val="left"/>
+              <w:rPr/>
+            </w:pPr>
+            <w:r>
+              <w:rPr>
+                <w:rFonts w:eastAsia="Times New Roman" w:cs="Times New Roman"/>
+                <w:b w:val="false"/>
+                <w:bCs w:val="false"/>
+                <w:sz w:val="20"/>
+                <w:szCs w:val="20"/>
+                <w:highlight w:val="yellow"/>
+              </w:rPr>
+              <w:t xml:space="preserve"> </w:t>
+            </w:r>
+          </w:p>
+        </w:tc>
+        <w:tc>
+          <w:tcPr>
+            <w:tcW w:w="2269" w:type="dxa"/>
+            <w:tcBorders>
+              <w:top w:val="single" w:sz="4" w:space="0" w:color="8C8C8C"/>
+              <w:left w:val="single" w:sz="4" w:space="0" w:color="8C8C8C"/>
+              <w:bottom w:val="single" w:sz="4" w:space="0" w:color="8C8C8C"/>
+              <w:right w:val="single" w:sz="4" w:space="0" w:color="8C8C8C"/>
+            </w:tcBorders>
+            <w:vAlign w:val="center"/>
+          </w:tcPr>
+          <w:p>
+            <w:pPr>
+              <w:pStyle w:val="Normal"/>
+              <w:keepNext w:val="false"/>
+              <w:keepLines/>
+              <w:spacing w:lineRule="auto" w:line="240" w:before="0" w:after="0"/>
+              <w:jc w:val="left"/>
+              <w:rPr/>
+            </w:pPr>
+            <w:r>
+              <w:rPr>
+                <w:rFonts w:eastAsia="Times New Roman" w:cs="Times New Roman"/>
+                <w:b w:val="false"/>
+                <w:bCs w:val="false"/>
+                <w:sz w:val="20"/>
+                <w:szCs w:val="20"/>
+                <w:highlight w:val="yellow"/>
+              </w:rPr>
+              <w:t xml:space="preserve"> </w:t>
+            </w:r>
+          </w:p>
+        </w:tc>
+        <w:tc>
+          <w:tcPr>
+            <w:tcW w:w="1301" w:type="dxa"/>
+            <w:tcBorders>
+              <w:top w:val="single" w:sz="4" w:space="0" w:color="8C8C8C"/>
+              <w:left w:val="single" w:sz="4" w:space="0" w:color="8C8C8C"/>
+              <w:bottom w:val="single" w:sz="4" w:space="0" w:color="8C8C8C"/>
+              <w:right w:val="single" w:sz="4" w:space="0" w:color="8C8C8C"/>
+            </w:tcBorders>
+            <w:vAlign w:val="center"/>
+          </w:tcPr>
+          <w:p>
+            <w:pPr>
+              <w:pStyle w:val="Normal"/>
+              <w:keepNext w:val="false"/>
+              <w:keepLines/>
+              <w:spacing w:lineRule="auto" w:line="240" w:before="0" w:after="0"/>
+              <w:jc w:val="left"/>
+              <w:rPr/>
+            </w:pPr>
+            <w:r>
+              <w:rPr>
+                <w:rFonts w:eastAsia="Times New Roman" w:cs="Times New Roman"/>
+                <w:b w:val="false"/>
+                <w:bCs w:val="false"/>
+                <w:sz w:val="20"/>
+                <w:szCs w:val="20"/>
+                <w:highlight w:val="yellow"/>
+              </w:rPr>
+              <w:t xml:space="preserve"> </w:t>
+            </w:r>
+          </w:p>
+        </w:tc>
+        <w:tc>
+          <w:tcPr>
+            <w:tcW w:w="1499" w:type="dxa"/>
+            <w:tcBorders>
+              <w:top w:val="single" w:sz="4" w:space="0" w:color="8C8C8C"/>
+              <w:left w:val="single" w:sz="4" w:space="0" w:color="8C8C8C"/>
+              <w:bottom w:val="single" w:sz="4" w:space="0" w:color="8C8C8C"/>
+              <w:right w:val="single" w:sz="4" w:space="0" w:color="8C8C8C"/>
+            </w:tcBorders>
+            <w:vAlign w:val="center"/>
+          </w:tcPr>
+          <w:p>
+            <w:pPr>
+              <w:pStyle w:val="Normal"/>
+              <w:keepNext w:val="false"/>
+              <w:keepLines/>
+              <w:spacing w:lineRule="auto" w:line="240" w:before="0" w:after="0"/>
+              <w:jc w:val="left"/>
+              <w:rPr/>
+            </w:pPr>
+            <w:r>
+              <w:rPr>
+                <w:rFonts w:eastAsia="Times New Roman" w:cs="Times New Roman"/>
+                <w:b w:val="false"/>
+                <w:bCs w:val="false"/>
+                <w:sz w:val="20"/>
+                <w:szCs w:val="20"/>
+                <w:highlight w:val="yellow"/>
+              </w:rPr>
+              <w:t xml:space="preserve"> </w:t>
+            </w:r>
+          </w:p>
+        </w:tc>
+        <w:tc>
+          <w:tcPr>
+            <w:tcW w:w="1301" w:type="dxa"/>
+            <w:tcBorders>
+              <w:top w:val="single" w:sz="4" w:space="0" w:color="8C8C8C"/>
+              <w:left w:val="single" w:sz="4" w:space="0" w:color="8C8C8C"/>
+              <w:bottom w:val="single" w:sz="4" w:space="0" w:color="8C8C8C"/>
+              <w:right w:val="single" w:sz="4" w:space="0" w:color="8C8C8C"/>
+            </w:tcBorders>
+            <w:vAlign w:val="center"/>
+          </w:tcPr>
+          <w:p>
+            <w:pPr>
+              <w:pStyle w:val="Normal"/>
+              <w:keepNext w:val="false"/>
+              <w:keepLines/>
+              <w:spacing w:lineRule="auto" w:line="240" w:before="0" w:after="0"/>
+              <w:jc w:val="left"/>
+              <w:rPr/>
+            </w:pPr>
+            <w:r>
+              <w:rPr>
+                <w:rFonts w:eastAsia="Times New Roman" w:cs="Times New Roman"/>
+                <w:b w:val="false"/>
+                <w:bCs w:val="false"/>
+                <w:sz w:val="20"/>
+                <w:szCs w:val="20"/>
+                <w:highlight w:val="yellow"/>
+              </w:rPr>
+              <w:t xml:space="preserve"> </w:t>
+            </w:r>
+          </w:p>
+        </w:tc>
+        <w:tc>
+          <w:tcPr>
+            <w:tcW w:w="1299" w:type="dxa"/>
+            <w:tcBorders>
+              <w:top w:val="single" w:sz="4" w:space="0" w:color="8C8C8C"/>
+              <w:left w:val="single" w:sz="4" w:space="0" w:color="8C8C8C"/>
+              <w:bottom w:val="single" w:sz="4" w:space="0" w:color="8C8C8C"/>
+              <w:right w:val="single" w:sz="4" w:space="0" w:color="8C8C8C"/>
+            </w:tcBorders>
+            <w:vAlign w:val="center"/>
+          </w:tcPr>
+          <w:p>
+            <w:pPr>
+              <w:pStyle w:val="Normal"/>
+              <w:keepNext w:val="false"/>
+              <w:keepLines/>
+              <w:spacing w:lineRule="auto" w:line="240" w:before="0" w:after="0"/>
+              <w:jc w:val="left"/>
+              <w:rPr/>
+            </w:pPr>
+            <w:r>
+              <w:rPr>
+                <w:rFonts w:eastAsia="Times New Roman" w:cs="Times New Roman"/>
+                <w:b w:val="false"/>
+                <w:bCs w:val="false"/>
+                <w:sz w:val="20"/>
+                <w:szCs w:val="20"/>
+                <w:highlight w:val="yellow"/>
+              </w:rPr>
+              <w:t xml:space="preserve"> </w:t>
+            </w:r>
+          </w:p>
+        </w:tc>
+      </w:tr>
+    </w:tbl>
+    <w:p>
+      <w:pPr>
+        <w:pStyle w:val="Normal"/>
+        <w:spacing w:lineRule="auto" w:line="240" w:before="40" w:after="200"/>
+        <w:jc w:val="left"/>
+        <w:rPr/>
+      </w:pPr>
+      <w:r>
+        <w:rPr>
+          <w:i/>
+          <w:iCs/>
+          <w:sz w:val="20"/>
+          <w:szCs w:val="20"/>
+        </w:rPr>
+        <w:t>Fuente: elaboración propia a partir de las entrevistas realizadas.</w:t>
+      </w:r>
+    </w:p>
+    <w:p>
+      <w:pPr>
+        <w:pStyle w:val="Normal"/>
         <w:spacing w:before="0" w:after="120"/>
         <w:jc w:val="both"/>
         <w:rPr/>
       </w:pPr>
       <w:r>
-        <w:rPr/>
-        <w:t>¿Pagarías por un servicio que te ayudara a entender y organizar tu dinero? ¿Cuánto te parecería razonable?</w:t>
+        <w:rPr>
+          <w:b/>
+          <w:bCs/>
+        </w:rPr>
+        <w:t>Resumen de resultados.</w:t>
+      </w:r>
+      <w:r>
+        <w:rPr/>
+        <w:t xml:space="preserve"> De los quince entrevistados, </w:t>
+      </w:r>
+      <w:r>
+        <w:rPr>
+          <w:highlight w:val="yellow"/>
+        </w:rPr>
+        <w:t>X</w:t>
+      </w:r>
+      <w:r>
+        <w:rPr/>
+        <w:t xml:space="preserve"> no sabían calcular cuánto ganaban una vez descontados impuestos y gastos, </w:t>
+      </w:r>
+      <w:r>
+        <w:rPr>
+          <w:highlight w:val="yellow"/>
+        </w:rPr>
+        <w:t>X</w:t>
+      </w:r>
+      <w:r>
+        <w:rPr/>
+        <w:t xml:space="preserve"> mezclaban la cuenta personal y la de la actividad y </w:t>
+      </w:r>
+      <w:r>
+        <w:rPr>
+          <w:highlight w:val="yellow"/>
+        </w:rPr>
+        <w:t>X</w:t>
+      </w:r>
+      <w:r>
+        <w:rPr/>
+        <w:t xml:space="preserve"> trabajaban con una gestoría. </w:t>
+      </w:r>
+      <w:r>
+        <w:rPr>
+          <w:highlight w:val="yellow"/>
+        </w:rPr>
+        <w:t>X</w:t>
+      </w:r>
+      <w:r>
+        <w:rPr/>
+        <w:t xml:space="preserve"> afirmaron que pagarían por un servicio como el descrito, con un precio razonable de entre </w:t>
+      </w:r>
+      <w:r>
+        <w:rPr>
+          <w:highlight w:val="yellow"/>
+        </w:rPr>
+        <w:t>X</w:t>
+      </w:r>
+      <w:r>
+        <w:rPr/>
+        <w:t xml:space="preserve"> y </w:t>
+      </w:r>
+      <w:r>
+        <w:rPr>
+          <w:highlight w:val="yellow"/>
+        </w:rPr>
+        <w:t>X</w:t>
+      </w:r>
+      <w:r>
+        <w:rPr/>
+        <w:t xml:space="preserve"> € al mes. Entre las respuestas más repetidas destacan: </w:t>
+      </w:r>
+      <w:r>
+        <w:rPr>
+          <w:highlight w:val="yellow"/>
+        </w:rPr>
+        <w:t>dos o tres frases textuales y anónimas de los entrevistados</w:t>
+      </w:r>
+      <w:r>
+        <w:rPr/>
+        <w:t>.</w:t>
       </w:r>
     </w:p>
     <w:sectPr>
@@ -26027,7 +30015,7 @@
     </w:r>
     <w:r>
       <w:rPr/>
-      <w:t>38</w:t>
+      <w:t>39</w:t>
     </w:r>
     <w:r>
       <w:rPr/>

</xml_diff>